<commit_message>
docs: aggiornamento relazione tecnica e aggiunta versione PDF
</commit_message>
<xml_diff>
--- a/Relazione_Tecnica_Yelp_AI_Suite_Fiorentini_Valerio_641622.docx
+++ b/Relazione_Tecnica_Yelp_AI_Suite_Fiorentini_Valerio_641622.docx
@@ -12,6 +12,7 @@
           <w:szCs w:val="48"/>
         </w:rPr>
       </w:pPr>
+      <w:proofErr w:type="spellStart"/>
       <w:r>
         <w:rPr>
           <w:rFonts w:ascii="Times New Roman" w:eastAsia="Cambria" w:hAnsi="Times New Roman" w:cs="Times New Roman"/>
@@ -21,7 +22,19 @@
           <w:sz w:val="48"/>
           <w:szCs w:val="48"/>
         </w:rPr>
-        <w:t>Yelp AI Suite</w:t>
+        <w:t>Yelp</w:t>
+      </w:r>
+      <w:proofErr w:type="spellEnd"/>
+      <w:r>
+        <w:rPr>
+          <w:rFonts w:ascii="Times New Roman" w:eastAsia="Cambria" w:hAnsi="Times New Roman" w:cs="Times New Roman"/>
+          <w:b/>
+          <w:bCs/>
+          <w:color w:val="auto"/>
+          <w:sz w:val="48"/>
+          <w:szCs w:val="48"/>
+        </w:rPr>
+        <w:t xml:space="preserve"> AI Suite</w:t>
       </w:r>
     </w:p>
     <w:p>
@@ -133,6 +146,70 @@
         </w:rPr>
         <w:t xml:space="preserve"> </w:t>
       </w:r>
+      <w:r>
+        <w:rPr>
+          <w:rFonts w:ascii="Times New Roman" w:hAnsi="Times New Roman" w:cs="Times New Roman"/>
+          <w:color w:val="auto"/>
+        </w:rPr>
+        <w:t xml:space="preserve">                             </w:t>
+      </w:r>
+      <w:proofErr w:type="spellStart"/>
+      <w:r>
+        <w:rPr>
+          <w:rFonts w:ascii="Times New Roman" w:hAnsi="Times New Roman" w:cs="Times New Roman"/>
+          <w:color w:val="auto"/>
+        </w:rPr>
+        <w:t>Yelp</w:t>
+      </w:r>
+      <w:proofErr w:type="spellEnd"/>
+      <w:r>
+        <w:rPr>
+          <w:rFonts w:ascii="Times New Roman" w:hAnsi="Times New Roman" w:cs="Times New Roman"/>
+          <w:color w:val="auto"/>
+        </w:rPr>
+        <w:t xml:space="preserve"> Open </w:t>
+      </w:r>
+      <w:proofErr w:type="gramStart"/>
+      <w:r>
+        <w:rPr>
+          <w:rFonts w:ascii="Times New Roman" w:hAnsi="Times New Roman" w:cs="Times New Roman"/>
+          <w:i/>
+          <w:color w:val="auto"/>
+        </w:rPr>
+        <w:t>Dataset(</w:t>
+      </w:r>
+      <w:proofErr w:type="gramEnd"/>
+      <w:r>
+        <w:rPr>
+          <w:rFonts w:ascii="Times New Roman" w:hAnsi="Times New Roman" w:cs="Times New Roman"/>
+          <w:i/>
+          <w:color w:val="auto"/>
+        </w:rPr>
+        <w:t>JSON)</w:t>
+      </w:r>
+      <w:r>
+        <w:rPr>
+          <w:rFonts w:ascii="Times New Roman" w:hAnsi="Times New Roman" w:cs="Times New Roman"/>
+          <w:color w:val="auto"/>
+        </w:rPr>
+        <w:t xml:space="preserve">:  </w:t>
+      </w:r>
+      <w:hyperlink r:id="rId8" w:history="1">
+        <w:r>
+          <w:rPr>
+            <w:rStyle w:val="Collegamentoipertestuale"/>
+            <w:rFonts w:ascii="Times New Roman" w:hAnsi="Times New Roman" w:cs="Times New Roman"/>
+          </w:rPr>
+          <w:t>https://business.yelp.com/data/resources/open-dataset/</w:t>
+        </w:r>
+      </w:hyperlink>
+      <w:r>
+        <w:rPr>
+          <w:rFonts w:ascii="Times New Roman" w:hAnsi="Times New Roman" w:cs="Times New Roman"/>
+          <w:color w:val="auto"/>
+        </w:rPr>
+        <w:t xml:space="preserve"> </w:t>
+      </w:r>
     </w:p>
     <w:p>
       <w:pPr>
@@ -165,7 +242,23 @@
           <w:rFonts w:ascii="Times New Roman" w:hAnsi="Times New Roman" w:cs="Times New Roman"/>
           <w:color w:val="auto"/>
         </w:rPr>
-        <w:t xml:space="preserve">Questa relazione descrive lo sviluppo di Yelp AI Suite, una </w:t>
+        <w:t xml:space="preserve">Questa relazione descrive lo sviluppo di </w:t>
+      </w:r>
+      <w:proofErr w:type="spellStart"/>
+      <w:r>
+        <w:rPr>
+          <w:rFonts w:ascii="Times New Roman" w:hAnsi="Times New Roman" w:cs="Times New Roman"/>
+          <w:color w:val="auto"/>
+        </w:rPr>
+        <w:t>Yelp</w:t>
+      </w:r>
+      <w:proofErr w:type="spellEnd"/>
+      <w:r>
+        <w:rPr>
+          <w:rFonts w:ascii="Times New Roman" w:hAnsi="Times New Roman" w:cs="Times New Roman"/>
+          <w:color w:val="auto"/>
+        </w:rPr>
+        <w:t xml:space="preserve"> AI Suite, una </w:t>
       </w:r>
       <w:r>
         <w:rPr>
@@ -180,7 +273,39 @@
           <w:rFonts w:ascii="Times New Roman" w:hAnsi="Times New Roman" w:cs="Times New Roman"/>
           <w:color w:val="auto"/>
         </w:rPr>
-        <w:t xml:space="preserve"> analitica integrata su larga scala costruita sullo Yelp Academic </w:t>
+        <w:t xml:space="preserve"> analitica integrata su larga scala costruita sullo </w:t>
+      </w:r>
+      <w:proofErr w:type="spellStart"/>
+      <w:r>
+        <w:rPr>
+          <w:rFonts w:ascii="Times New Roman" w:hAnsi="Times New Roman" w:cs="Times New Roman"/>
+          <w:color w:val="auto"/>
+        </w:rPr>
+        <w:t>Yelp</w:t>
+      </w:r>
+      <w:proofErr w:type="spellEnd"/>
+      <w:r>
+        <w:rPr>
+          <w:rFonts w:ascii="Times New Roman" w:hAnsi="Times New Roman" w:cs="Times New Roman"/>
+          <w:color w:val="auto"/>
+        </w:rPr>
+        <w:t xml:space="preserve"> </w:t>
+      </w:r>
+      <w:proofErr w:type="spellStart"/>
+      <w:r>
+        <w:rPr>
+          <w:rFonts w:ascii="Times New Roman" w:hAnsi="Times New Roman" w:cs="Times New Roman"/>
+          <w:color w:val="auto"/>
+        </w:rPr>
+        <w:t>Academic</w:t>
+      </w:r>
+      <w:proofErr w:type="spellEnd"/>
+      <w:r>
+        <w:rPr>
+          <w:rFonts w:ascii="Times New Roman" w:hAnsi="Times New Roman" w:cs="Times New Roman"/>
+          <w:color w:val="auto"/>
+        </w:rPr>
+        <w:t xml:space="preserve"> </w:t>
       </w:r>
       <w:r>
         <w:rPr>
@@ -197,20 +322,46 @@
         </w:rPr>
         <w:t xml:space="preserve"> (oltre 150.000 attività commerciali e milioni di recensioni). Il sistema copre l'intero ciclo di lavoro: </w:t>
       </w:r>
-      <w:r>
-        <w:rPr>
-          <w:rFonts w:ascii="Times New Roman" w:hAnsi="Times New Roman" w:cs="Times New Roman"/>
-          <w:i/>
-          <w:color w:val="auto"/>
-        </w:rPr>
-        <w:t>ingestion</w:t>
-      </w:r>
-      <w:r>
-        <w:rPr>
-          <w:rFonts w:ascii="Times New Roman" w:hAnsi="Times New Roman" w:cs="Times New Roman"/>
-          <w:color w:val="auto"/>
-        </w:rPr>
-        <w:t xml:space="preserve"> ottimizzata, analisi esplorativa e geospaziale, Social Network Analysis, text mining con classificazione del sentiment, e un motore di raccomandazione multi-paradigma, il tutto esposto in una </w:t>
+      <w:proofErr w:type="spellStart"/>
+      <w:r>
+        <w:rPr>
+          <w:rFonts w:ascii="Times New Roman" w:hAnsi="Times New Roman" w:cs="Times New Roman"/>
+          <w:i/>
+          <w:color w:val="auto"/>
+        </w:rPr>
+        <w:t>ingestio</w:t>
+      </w:r>
+      <w:r>
+        <w:rPr>
+          <w:rFonts w:ascii="Times New Roman" w:hAnsi="Times New Roman" w:cs="Times New Roman"/>
+          <w:i/>
+          <w:color w:val="auto"/>
+        </w:rPr>
+        <w:t>n</w:t>
+      </w:r>
+      <w:proofErr w:type="spellEnd"/>
+      <w:r>
+        <w:rPr>
+          <w:rFonts w:ascii="Times New Roman" w:hAnsi="Times New Roman" w:cs="Times New Roman"/>
+          <w:color w:val="auto"/>
+        </w:rPr>
+        <w:t xml:space="preserve">, analisi esplorativa e geospaziale, </w:t>
+      </w:r>
+      <w:r>
+        <w:rPr>
+          <w:rFonts w:ascii="Times New Roman" w:hAnsi="Times New Roman" w:cs="Times New Roman"/>
+          <w:i/>
+          <w:iCs/>
+          <w:color w:val="auto"/>
+        </w:rPr>
+        <w:t>Social Network Analysis, text mining</w:t>
+      </w:r>
+      <w:r>
+        <w:rPr>
+          <w:rFonts w:ascii="Times New Roman" w:hAnsi="Times New Roman" w:cs="Times New Roman"/>
+          <w:color w:val="auto"/>
+        </w:rPr>
+        <w:t xml:space="preserve"> con classificazione del sentiment, e un motore di raccomandazione multi-paradigma, il tutto esposto in una </w:t>
       </w:r>
       <w:r>
         <w:rPr>
@@ -257,7 +408,23 @@
           <w:rFonts w:ascii="Times New Roman" w:hAnsi="Times New Roman" w:cs="Times New Roman"/>
           <w:color w:val="auto"/>
         </w:rPr>
-        <w:t xml:space="preserve"> di 0,97 sulla classificazione del sentiment (</w:t>
+        <w:t xml:space="preserve"> di 0,97 sulla classificazione del </w:t>
+      </w:r>
+      <w:r>
+        <w:rPr>
+          <w:rFonts w:ascii="Times New Roman" w:hAnsi="Times New Roman" w:cs="Times New Roman"/>
+          <w:i/>
+          <w:iCs/>
+          <w:color w:val="auto"/>
+        </w:rPr>
+        <w:t>sentiment</w:t>
+      </w:r>
+      <w:r>
+        <w:rPr>
+          <w:rFonts w:ascii="Times New Roman" w:hAnsi="Times New Roman" w:cs="Times New Roman"/>
+          <w:color w:val="auto"/>
+        </w:rPr>
+        <w:t xml:space="preserve"> (</w:t>
       </w:r>
       <w:r>
         <w:rPr>
@@ -287,22 +454,39 @@
           <w:rFonts w:ascii="Times New Roman" w:hAnsi="Times New Roman" w:cs="Times New Roman"/>
           <w:color w:val="auto"/>
         </w:rPr>
-        <w:t>) per il recommender neurale, con un compromesso misura</w:t>
-      </w:r>
-      <w:r>
-        <w:rPr>
-          <w:rFonts w:ascii="Times New Roman" w:hAnsi="Times New Roman" w:cs="Times New Roman"/>
-          <w:i/>
-          <w:color w:val="auto"/>
-        </w:rPr>
-        <w:t>bi</w:t>
-      </w:r>
-      <w:r>
-        <w:rPr>
-          <w:rFonts w:ascii="Times New Roman" w:hAnsi="Times New Roman" w:cs="Times New Roman"/>
-          <w:color w:val="auto"/>
-        </w:rPr>
-        <w:t>le tra latenza (</w:t>
+        <w:t xml:space="preserve">) per il </w:t>
+      </w:r>
+      <w:proofErr w:type="spellStart"/>
+      <w:r>
+        <w:rPr>
+          <w:rFonts w:ascii="Times New Roman" w:hAnsi="Times New Roman" w:cs="Times New Roman"/>
+          <w:i/>
+          <w:iCs/>
+          <w:color w:val="auto"/>
+        </w:rPr>
+        <w:t>recommender</w:t>
+      </w:r>
+      <w:proofErr w:type="spellEnd"/>
+      <w:r>
+        <w:rPr>
+          <w:rFonts w:ascii="Times New Roman" w:hAnsi="Times New Roman" w:cs="Times New Roman"/>
+          <w:color w:val="auto"/>
+        </w:rPr>
+        <w:t xml:space="preserve"> neurale, con un compromesso </w:t>
+      </w:r>
+      <w:r>
+        <w:rPr>
+          <w:rFonts w:ascii="Times New Roman" w:hAnsi="Times New Roman" w:cs="Times New Roman"/>
+          <w:color w:val="auto"/>
+        </w:rPr>
+        <w:t>misurabile</w:t>
+      </w:r>
+      <w:r>
+        <w:rPr>
+          <w:rFonts w:ascii="Times New Roman" w:hAnsi="Times New Roman" w:cs="Times New Roman"/>
+          <w:color w:val="auto"/>
+        </w:rPr>
+        <w:t xml:space="preserve"> tra latenza (</w:t>
       </w:r>
       <w:r>
         <w:rPr>
@@ -317,7 +501,23 @@
           <w:rFonts w:ascii="Times New Roman" w:hAnsi="Times New Roman" w:cs="Times New Roman"/>
           <w:color w:val="auto"/>
         </w:rPr>
-        <w:t xml:space="preserve"> ~55 ms) e accuratezza (</w:t>
+        <w:t xml:space="preserve"> ~55 </w:t>
+      </w:r>
+      <w:proofErr w:type="spellStart"/>
+      <w:r>
+        <w:rPr>
+          <w:rFonts w:ascii="Times New Roman" w:hAnsi="Times New Roman" w:cs="Times New Roman"/>
+          <w:color w:val="auto"/>
+        </w:rPr>
+        <w:t>ms</w:t>
+      </w:r>
+      <w:proofErr w:type="spellEnd"/>
+      <w:r>
+        <w:rPr>
+          <w:rFonts w:ascii="Times New Roman" w:hAnsi="Times New Roman" w:cs="Times New Roman"/>
+          <w:color w:val="auto"/>
+        </w:rPr>
+        <w:t>) e accuratezza (</w:t>
       </w:r>
       <w:r>
         <w:rPr>
@@ -332,7 +532,23 @@
           <w:rFonts w:ascii="Times New Roman" w:hAnsi="Times New Roman" w:cs="Times New Roman"/>
           <w:color w:val="auto"/>
         </w:rPr>
-        <w:t xml:space="preserve"> ~436 ms).</w:t>
+        <w:t xml:space="preserve"> ~436 </w:t>
+      </w:r>
+      <w:proofErr w:type="spellStart"/>
+      <w:r>
+        <w:rPr>
+          <w:rFonts w:ascii="Times New Roman" w:hAnsi="Times New Roman" w:cs="Times New Roman"/>
+          <w:color w:val="auto"/>
+        </w:rPr>
+        <w:t>ms</w:t>
+      </w:r>
+      <w:proofErr w:type="spellEnd"/>
+      <w:r>
+        <w:rPr>
+          <w:rFonts w:ascii="Times New Roman" w:hAnsi="Times New Roman" w:cs="Times New Roman"/>
+          <w:color w:val="auto"/>
+        </w:rPr>
+        <w:t>).</w:t>
       </w:r>
     </w:p>
     <w:p>
@@ -374,8 +590,18 @@
           <w:i/>
           <w:color w:val="auto"/>
         </w:rPr>
-        <w:t>Information Retrieval</w:t>
-      </w:r>
+        <w:t xml:space="preserve">Information </w:t>
+      </w:r>
+      <w:proofErr w:type="spellStart"/>
+      <w:r>
+        <w:rPr>
+          <w:rFonts w:ascii="Times New Roman" w:hAnsi="Times New Roman" w:cs="Times New Roman"/>
+          <w:i/>
+          <w:color w:val="auto"/>
+        </w:rPr>
+        <w:t>Retrieval</w:t>
+      </w:r>
+      <w:proofErr w:type="spellEnd"/>
       <w:r>
         <w:rPr>
           <w:rFonts w:ascii="Times New Roman" w:hAnsi="Times New Roman" w:cs="Times New Roman"/>
@@ -426,7 +652,39 @@
           <w:rFonts w:ascii="Times New Roman" w:hAnsi="Times New Roman" w:cs="Times New Roman"/>
           <w:color w:val="auto"/>
         </w:rPr>
-        <w:t xml:space="preserve">licata allo Yelp Academic </w:t>
+        <w:t xml:space="preserve">licata allo </w:t>
+      </w:r>
+      <w:proofErr w:type="spellStart"/>
+      <w:r>
+        <w:rPr>
+          <w:rFonts w:ascii="Times New Roman" w:hAnsi="Times New Roman" w:cs="Times New Roman"/>
+          <w:color w:val="auto"/>
+        </w:rPr>
+        <w:t>Yelp</w:t>
+      </w:r>
+      <w:proofErr w:type="spellEnd"/>
+      <w:r>
+        <w:rPr>
+          <w:rFonts w:ascii="Times New Roman" w:hAnsi="Times New Roman" w:cs="Times New Roman"/>
+          <w:color w:val="auto"/>
+        </w:rPr>
+        <w:t xml:space="preserve"> </w:t>
+      </w:r>
+      <w:proofErr w:type="spellStart"/>
+      <w:r>
+        <w:rPr>
+          <w:rFonts w:ascii="Times New Roman" w:hAnsi="Times New Roman" w:cs="Times New Roman"/>
+          <w:color w:val="auto"/>
+        </w:rPr>
+        <w:t>Academic</w:t>
+      </w:r>
+      <w:proofErr w:type="spellEnd"/>
+      <w:r>
+        <w:rPr>
+          <w:rFonts w:ascii="Times New Roman" w:hAnsi="Times New Roman" w:cs="Times New Roman"/>
+          <w:color w:val="auto"/>
+        </w:rPr>
+        <w:t xml:space="preserve"> </w:t>
       </w:r>
       <w:r>
         <w:rPr>
@@ -441,15 +699,41 @@
           <w:rFonts w:ascii="Times New Roman" w:hAnsi="Times New Roman" w:cs="Times New Roman"/>
           <w:color w:val="auto"/>
         </w:rPr>
-        <w:t xml:space="preserve">. Il progetto si concentra sull'estrazione di conoscenza, l'analisi dei topic e la creazione di un </w:t>
-      </w:r>
-      <w:r>
-        <w:rPr>
-          <w:rFonts w:ascii="Times New Roman" w:hAnsi="Times New Roman" w:cs="Times New Roman"/>
-          <w:i/>
-          <w:color w:val="auto"/>
-        </w:rPr>
-        <w:t>Recommender System</w:t>
+        <w:t xml:space="preserve">. Il progetto si concentra sull'estrazione di conoscenza, l'analisi dei </w:t>
+      </w:r>
+      <w:proofErr w:type="spellStart"/>
+      <w:r>
+        <w:rPr>
+          <w:rFonts w:ascii="Times New Roman" w:hAnsi="Times New Roman" w:cs="Times New Roman"/>
+          <w:color w:val="auto"/>
+        </w:rPr>
+        <w:t>topic</w:t>
+      </w:r>
+      <w:proofErr w:type="spellEnd"/>
+      <w:r>
+        <w:rPr>
+          <w:rFonts w:ascii="Times New Roman" w:hAnsi="Times New Roman" w:cs="Times New Roman"/>
+          <w:color w:val="auto"/>
+        </w:rPr>
+        <w:t xml:space="preserve"> e la creazione di un </w:t>
+      </w:r>
+      <w:proofErr w:type="spellStart"/>
+      <w:r>
+        <w:rPr>
+          <w:rFonts w:ascii="Times New Roman" w:hAnsi="Times New Roman" w:cs="Times New Roman"/>
+          <w:i/>
+          <w:color w:val="auto"/>
+        </w:rPr>
+        <w:t>Recommender</w:t>
+      </w:r>
+      <w:proofErr w:type="spellEnd"/>
+      <w:r>
+        <w:rPr>
+          <w:rFonts w:ascii="Times New Roman" w:hAnsi="Times New Roman" w:cs="Times New Roman"/>
+          <w:i/>
+          <w:color w:val="auto"/>
+        </w:rPr>
+        <w:t xml:space="preserve"> System</w:t>
       </w:r>
       <w:r>
         <w:rPr>
@@ -635,7 +919,23 @@
           <w:rFonts w:ascii="Times New Roman" w:hAnsi="Times New Roman" w:cs="Times New Roman"/>
           <w:color w:val="auto"/>
         </w:rPr>
-        <w:t xml:space="preserve"> web interattiva e reattiva.</w:t>
+        <w:t xml:space="preserve"> </w:t>
+      </w:r>
+      <w:r>
+        <w:rPr>
+          <w:rFonts w:ascii="Times New Roman" w:hAnsi="Times New Roman" w:cs="Times New Roman"/>
+          <w:i/>
+          <w:iCs/>
+          <w:color w:val="auto"/>
+        </w:rPr>
+        <w:t>web</w:t>
+      </w:r>
+      <w:r>
+        <w:rPr>
+          <w:rFonts w:ascii="Times New Roman" w:hAnsi="Times New Roman" w:cs="Times New Roman"/>
+          <w:color w:val="auto"/>
+        </w:rPr>
+        <w:t xml:space="preserve"> interattiva e reattiva.</w:t>
       </w:r>
     </w:p>
     <w:p>
@@ -686,6 +986,7 @@
         </w:rPr>
         <w:t xml:space="preserve"> è modulare e si articola in cinque fasi: (1) </w:t>
       </w:r>
+      <w:proofErr w:type="spellStart"/>
       <w:r>
         <w:rPr>
           <w:rFonts w:ascii="Times New Roman" w:hAnsi="Times New Roman" w:cs="Times New Roman"/>
@@ -694,6 +995,7 @@
         </w:rPr>
         <w:t>Ingestion</w:t>
       </w:r>
+      <w:proofErr w:type="spellEnd"/>
       <w:r>
         <w:rPr>
           <w:rFonts w:ascii="Times New Roman" w:hAnsi="Times New Roman" w:cs="Times New Roman"/>
@@ -744,7 +1046,23 @@
           <w:rFonts w:ascii="Times New Roman" w:hAnsi="Times New Roman" w:cs="Times New Roman"/>
           <w:color w:val="auto"/>
         </w:rPr>
-        <w:t xml:space="preserve">, (4) Recommender, (5) </w:t>
+        <w:t xml:space="preserve">, (4) </w:t>
+      </w:r>
+      <w:proofErr w:type="spellStart"/>
+      <w:r>
+        <w:rPr>
+          <w:rFonts w:ascii="Times New Roman" w:hAnsi="Times New Roman" w:cs="Times New Roman"/>
+          <w:color w:val="auto"/>
+        </w:rPr>
+        <w:t>Recommender</w:t>
+      </w:r>
+      <w:proofErr w:type="spellEnd"/>
+      <w:r>
+        <w:rPr>
+          <w:rFonts w:ascii="Times New Roman" w:hAnsi="Times New Roman" w:cs="Times New Roman"/>
+          <w:color w:val="auto"/>
+        </w:rPr>
+        <w:t xml:space="preserve">, (5) </w:t>
       </w:r>
       <w:r>
         <w:rPr>
@@ -776,20 +1094,56 @@
         </w:rPr>
         <w:t xml:space="preserve">, modelli serializzati) sono salvati in un </w:t>
       </w:r>
-      <w:r>
-        <w:rPr>
-          <w:rFonts w:ascii="Times New Roman" w:hAnsi="Times New Roman" w:cs="Times New Roman"/>
-          <w:i/>
-          <w:color w:val="auto"/>
-        </w:rPr>
-        <w:t>artifact layer</w:t>
-      </w:r>
-      <w:r>
-        <w:rPr>
-          <w:rFonts w:ascii="Times New Roman" w:hAnsi="Times New Roman" w:cs="Times New Roman"/>
-          <w:color w:val="auto"/>
-        </w:rPr>
-        <w:t xml:space="preserve"> condiviso su Google Drive, che permette di eseguire ogni fase in modo indipendente.</w:t>
+      <w:proofErr w:type="spellStart"/>
+      <w:r>
+        <w:rPr>
+          <w:rFonts w:ascii="Times New Roman" w:hAnsi="Times New Roman" w:cs="Times New Roman"/>
+          <w:i/>
+          <w:color w:val="auto"/>
+        </w:rPr>
+        <w:t>artifact</w:t>
+      </w:r>
+      <w:proofErr w:type="spellEnd"/>
+      <w:r>
+        <w:rPr>
+          <w:rFonts w:ascii="Times New Roman" w:hAnsi="Times New Roman" w:cs="Times New Roman"/>
+          <w:i/>
+          <w:color w:val="auto"/>
+        </w:rPr>
+        <w:t xml:space="preserve"> </w:t>
+      </w:r>
+      <w:proofErr w:type="spellStart"/>
+      <w:r>
+        <w:rPr>
+          <w:rFonts w:ascii="Times New Roman" w:hAnsi="Times New Roman" w:cs="Times New Roman"/>
+          <w:i/>
+          <w:color w:val="auto"/>
+        </w:rPr>
+        <w:t>layer</w:t>
+      </w:r>
+      <w:proofErr w:type="spellEnd"/>
+      <w:r>
+        <w:rPr>
+          <w:rFonts w:ascii="Times New Roman" w:hAnsi="Times New Roman" w:cs="Times New Roman"/>
+          <w:color w:val="auto"/>
+        </w:rPr>
+        <w:t xml:space="preserve"> condiviso su </w:t>
+      </w:r>
+      <w:r>
+        <w:rPr>
+          <w:rFonts w:ascii="Times New Roman" w:hAnsi="Times New Roman" w:cs="Times New Roman"/>
+          <w:i/>
+          <w:iCs/>
+          <w:color w:val="auto"/>
+        </w:rPr>
+        <w:t>Google Drive</w:t>
+      </w:r>
+      <w:r>
+        <w:rPr>
+          <w:rFonts w:ascii="Times New Roman" w:hAnsi="Times New Roman" w:cs="Times New Roman"/>
+          <w:color w:val="auto"/>
+        </w:rPr>
+        <w:t>, che permette di eseguire ogni fase in modo indipendente.</w:t>
       </w:r>
     </w:p>
     <w:p>
@@ -827,7 +1181,7 @@
                     </pic:cNvPicPr>
                   </pic:nvPicPr>
                   <pic:blipFill>
-                    <a:blip r:embed="rId8"/>
+                    <a:blip r:embed="rId9"/>
                     <a:srcRect/>
                     <a:stretch>
                       <a:fillRect/>
@@ -1086,6 +1440,7 @@
                 <w:color w:val="auto"/>
               </w:rPr>
             </w:pPr>
+            <w:proofErr w:type="spellStart"/>
             <w:r>
               <w:rPr>
                 <w:rFonts w:ascii="Times New Roman" w:hAnsi="Times New Roman" w:cs="Times New Roman"/>
@@ -1095,6 +1450,7 @@
               </w:rPr>
               <w:t>Polars</w:t>
             </w:r>
+            <w:proofErr w:type="spellEnd"/>
           </w:p>
         </w:tc>
         <w:tc>
@@ -1122,14 +1478,25 @@
                 <w:color w:val="auto"/>
               </w:rPr>
             </w:pPr>
-            <w:r>
-              <w:rPr>
-                <w:rFonts w:ascii="Times New Roman" w:hAnsi="Times New Roman" w:cs="Times New Roman"/>
-                <w:color w:val="auto"/>
-                <w:sz w:val="20"/>
-                <w:szCs w:val="20"/>
-              </w:rPr>
-              <w:t>Ingestion e manipolazione dati</w:t>
+            <w:proofErr w:type="spellStart"/>
+            <w:r>
+              <w:rPr>
+                <w:rFonts w:ascii="Times New Roman" w:hAnsi="Times New Roman" w:cs="Times New Roman"/>
+                <w:color w:val="auto"/>
+                <w:sz w:val="20"/>
+                <w:szCs w:val="20"/>
+              </w:rPr>
+              <w:t>Ingestion</w:t>
+            </w:r>
+            <w:proofErr w:type="spellEnd"/>
+            <w:r>
+              <w:rPr>
+                <w:rFonts w:ascii="Times New Roman" w:hAnsi="Times New Roman" w:cs="Times New Roman"/>
+                <w:color w:val="auto"/>
+                <w:sz w:val="20"/>
+                <w:szCs w:val="20"/>
+              </w:rPr>
+              <w:t xml:space="preserve"> e manipolazione dati</w:t>
             </w:r>
           </w:p>
         </w:tc>
@@ -1183,7 +1550,27 @@
                 <w:sz w:val="20"/>
                 <w:szCs w:val="20"/>
               </w:rPr>
-              <w:t>L'architettura colonnare e la Lazy API riducono i tempi da minuti a frazioni di secondo.</w:t>
+              <w:t xml:space="preserve">L'architettura colonnare e la </w:t>
+            </w:r>
+            <w:proofErr w:type="spellStart"/>
+            <w:r>
+              <w:rPr>
+                <w:rFonts w:ascii="Times New Roman" w:hAnsi="Times New Roman" w:cs="Times New Roman"/>
+                <w:color w:val="auto"/>
+                <w:sz w:val="20"/>
+                <w:szCs w:val="20"/>
+              </w:rPr>
+              <w:t>Lazy</w:t>
+            </w:r>
+            <w:proofErr w:type="spellEnd"/>
+            <w:r>
+              <w:rPr>
+                <w:rFonts w:ascii="Times New Roman" w:hAnsi="Times New Roman" w:cs="Times New Roman"/>
+                <w:color w:val="auto"/>
+                <w:sz w:val="20"/>
+                <w:szCs w:val="20"/>
+              </w:rPr>
+              <w:t xml:space="preserve"> API riducono i tempi da minuti a frazioni di secondo.</w:t>
             </w:r>
           </w:p>
         </w:tc>
@@ -1289,14 +1676,105 @@
                 <w:color w:val="auto"/>
               </w:rPr>
             </w:pPr>
-            <w:r>
-              <w:rPr>
-                <w:rFonts w:ascii="Times New Roman" w:hAnsi="Times New Roman" w:cs="Times New Roman"/>
-                <w:color w:val="auto"/>
-                <w:sz w:val="20"/>
-                <w:szCs w:val="20"/>
-              </w:rPr>
-              <w:t>Logistic Regression (sentiment), Cosine Similarity (content-based), Truncated SVD (collaborative filtering).</w:t>
+            <w:proofErr w:type="spellStart"/>
+            <w:r>
+              <w:rPr>
+                <w:rFonts w:ascii="Times New Roman" w:hAnsi="Times New Roman" w:cs="Times New Roman"/>
+                <w:color w:val="auto"/>
+                <w:sz w:val="20"/>
+                <w:szCs w:val="20"/>
+              </w:rPr>
+              <w:t>Logistic</w:t>
+            </w:r>
+            <w:proofErr w:type="spellEnd"/>
+            <w:r>
+              <w:rPr>
+                <w:rFonts w:ascii="Times New Roman" w:hAnsi="Times New Roman" w:cs="Times New Roman"/>
+                <w:color w:val="auto"/>
+                <w:sz w:val="20"/>
+                <w:szCs w:val="20"/>
+              </w:rPr>
+              <w:t xml:space="preserve"> </w:t>
+            </w:r>
+            <w:proofErr w:type="spellStart"/>
+            <w:r>
+              <w:rPr>
+                <w:rFonts w:ascii="Times New Roman" w:hAnsi="Times New Roman" w:cs="Times New Roman"/>
+                <w:color w:val="auto"/>
+                <w:sz w:val="20"/>
+                <w:szCs w:val="20"/>
+              </w:rPr>
+              <w:t>Regression</w:t>
+            </w:r>
+            <w:proofErr w:type="spellEnd"/>
+            <w:r>
+              <w:rPr>
+                <w:rFonts w:ascii="Times New Roman" w:hAnsi="Times New Roman" w:cs="Times New Roman"/>
+                <w:color w:val="auto"/>
+                <w:sz w:val="20"/>
+                <w:szCs w:val="20"/>
+              </w:rPr>
+              <w:t xml:space="preserve"> (sentiment), Cosine </w:t>
+            </w:r>
+            <w:proofErr w:type="spellStart"/>
+            <w:r>
+              <w:rPr>
+                <w:rFonts w:ascii="Times New Roman" w:hAnsi="Times New Roman" w:cs="Times New Roman"/>
+                <w:color w:val="auto"/>
+                <w:sz w:val="20"/>
+                <w:szCs w:val="20"/>
+              </w:rPr>
+              <w:t>Similarity</w:t>
+            </w:r>
+            <w:proofErr w:type="spellEnd"/>
+            <w:r>
+              <w:rPr>
+                <w:rFonts w:ascii="Times New Roman" w:hAnsi="Times New Roman" w:cs="Times New Roman"/>
+                <w:color w:val="auto"/>
+                <w:sz w:val="20"/>
+                <w:szCs w:val="20"/>
+              </w:rPr>
+              <w:t xml:space="preserve"> (</w:t>
+            </w:r>
+            <w:proofErr w:type="spellStart"/>
+            <w:r>
+              <w:rPr>
+                <w:rFonts w:ascii="Times New Roman" w:hAnsi="Times New Roman" w:cs="Times New Roman"/>
+                <w:color w:val="auto"/>
+                <w:sz w:val="20"/>
+                <w:szCs w:val="20"/>
+              </w:rPr>
+              <w:t>content-based</w:t>
+            </w:r>
+            <w:proofErr w:type="spellEnd"/>
+            <w:r>
+              <w:rPr>
+                <w:rFonts w:ascii="Times New Roman" w:hAnsi="Times New Roman" w:cs="Times New Roman"/>
+                <w:color w:val="auto"/>
+                <w:sz w:val="20"/>
+                <w:szCs w:val="20"/>
+              </w:rPr>
+              <w:t xml:space="preserve">), </w:t>
+            </w:r>
+            <w:proofErr w:type="spellStart"/>
+            <w:r>
+              <w:rPr>
+                <w:rFonts w:ascii="Times New Roman" w:hAnsi="Times New Roman" w:cs="Times New Roman"/>
+                <w:color w:val="auto"/>
+                <w:sz w:val="20"/>
+                <w:szCs w:val="20"/>
+              </w:rPr>
+              <w:t>Truncated</w:t>
+            </w:r>
+            <w:proofErr w:type="spellEnd"/>
+            <w:r>
+              <w:rPr>
+                <w:rFonts w:ascii="Times New Roman" w:hAnsi="Times New Roman" w:cs="Times New Roman"/>
+                <w:color w:val="auto"/>
+                <w:sz w:val="20"/>
+                <w:szCs w:val="20"/>
+              </w:rPr>
+              <w:t xml:space="preserve"> SVD (collaborative filtering).</w:t>
             </w:r>
           </w:p>
         </w:tc>
@@ -1330,6 +1808,7 @@
                 <w:color w:val="auto"/>
               </w:rPr>
             </w:pPr>
+            <w:proofErr w:type="spellStart"/>
             <w:r>
               <w:rPr>
                 <w:rFonts w:ascii="Times New Roman" w:hAnsi="Times New Roman" w:cs="Times New Roman"/>
@@ -1339,6 +1818,7 @@
               </w:rPr>
               <w:t>NetworkX</w:t>
             </w:r>
+            <w:proofErr w:type="spellEnd"/>
           </w:p>
         </w:tc>
         <w:tc>
@@ -1409,7 +1889,47 @@
                 <w:sz w:val="20"/>
                 <w:szCs w:val="20"/>
               </w:rPr>
-              <w:t>Modellazione a grafo, Degree Centrality e rilevamento di community (algoritmo di Louvain).</w:t>
+              <w:t xml:space="preserve">Modellazione a grafo, Degree </w:t>
+            </w:r>
+            <w:proofErr w:type="spellStart"/>
+            <w:r>
+              <w:rPr>
+                <w:rFonts w:ascii="Times New Roman" w:hAnsi="Times New Roman" w:cs="Times New Roman"/>
+                <w:color w:val="auto"/>
+                <w:sz w:val="20"/>
+                <w:szCs w:val="20"/>
+              </w:rPr>
+              <w:t>Centrality</w:t>
+            </w:r>
+            <w:proofErr w:type="spellEnd"/>
+            <w:r>
+              <w:rPr>
+                <w:rFonts w:ascii="Times New Roman" w:hAnsi="Times New Roman" w:cs="Times New Roman"/>
+                <w:color w:val="auto"/>
+                <w:sz w:val="20"/>
+                <w:szCs w:val="20"/>
+              </w:rPr>
+              <w:t xml:space="preserve"> e rilevamento di community (algoritmo di </w:t>
+            </w:r>
+            <w:proofErr w:type="spellStart"/>
+            <w:r>
+              <w:rPr>
+                <w:rFonts w:ascii="Times New Roman" w:hAnsi="Times New Roman" w:cs="Times New Roman"/>
+                <w:color w:val="auto"/>
+                <w:sz w:val="20"/>
+                <w:szCs w:val="20"/>
+              </w:rPr>
+              <w:t>Louvain</w:t>
+            </w:r>
+            <w:proofErr w:type="spellEnd"/>
+            <w:r>
+              <w:rPr>
+                <w:rFonts w:ascii="Times New Roman" w:hAnsi="Times New Roman" w:cs="Times New Roman"/>
+                <w:color w:val="auto"/>
+                <w:sz w:val="20"/>
+                <w:szCs w:val="20"/>
+              </w:rPr>
+              <w:t>).</w:t>
             </w:r>
           </w:p>
         </w:tc>
@@ -1443,15 +1963,37 @@
                 <w:color w:val="auto"/>
               </w:rPr>
             </w:pPr>
-            <w:r>
-              <w:rPr>
-                <w:rFonts w:ascii="Times New Roman" w:hAnsi="Times New Roman" w:cs="Times New Roman"/>
-                <w:color w:val="auto"/>
-                <w:sz w:val="20"/>
-                <w:szCs w:val="20"/>
-              </w:rPr>
-              <w:t>TensorFlow / Keras</w:t>
-            </w:r>
+            <w:proofErr w:type="spellStart"/>
+            <w:r>
+              <w:rPr>
+                <w:rFonts w:ascii="Times New Roman" w:hAnsi="Times New Roman" w:cs="Times New Roman"/>
+                <w:color w:val="auto"/>
+                <w:sz w:val="20"/>
+                <w:szCs w:val="20"/>
+              </w:rPr>
+              <w:t>TensorFlow</w:t>
+            </w:r>
+            <w:proofErr w:type="spellEnd"/>
+            <w:r>
+              <w:rPr>
+                <w:rFonts w:ascii="Times New Roman" w:hAnsi="Times New Roman" w:cs="Times New Roman"/>
+                <w:color w:val="auto"/>
+                <w:sz w:val="20"/>
+                <w:szCs w:val="20"/>
+              </w:rPr>
+              <w:t xml:space="preserve"> / </w:t>
+            </w:r>
+            <w:proofErr w:type="spellStart"/>
+            <w:r>
+              <w:rPr>
+                <w:rFonts w:ascii="Times New Roman" w:hAnsi="Times New Roman" w:cs="Times New Roman"/>
+                <w:color w:val="auto"/>
+                <w:sz w:val="20"/>
+                <w:szCs w:val="20"/>
+              </w:rPr>
+              <w:t>Keras</w:t>
+            </w:r>
+            <w:proofErr w:type="spellEnd"/>
           </w:p>
         </w:tc>
         <w:tc>
@@ -1515,14 +2057,45 @@
                 <w:color w:val="auto"/>
               </w:rPr>
             </w:pPr>
-            <w:r>
-              <w:rPr>
-                <w:rFonts w:ascii="Times New Roman" w:hAnsi="Times New Roman" w:cs="Times New Roman"/>
-                <w:color w:val="auto"/>
-                <w:sz w:val="20"/>
-                <w:szCs w:val="20"/>
-              </w:rPr>
-              <w:t>Neural Collaborative Filtering con strati di Embedding densi.</w:t>
+            <w:proofErr w:type="spellStart"/>
+            <w:r>
+              <w:rPr>
+                <w:rFonts w:ascii="Times New Roman" w:hAnsi="Times New Roman" w:cs="Times New Roman"/>
+                <w:color w:val="auto"/>
+                <w:sz w:val="20"/>
+                <w:szCs w:val="20"/>
+              </w:rPr>
+              <w:t>Neural</w:t>
+            </w:r>
+            <w:proofErr w:type="spellEnd"/>
+            <w:r>
+              <w:rPr>
+                <w:rFonts w:ascii="Times New Roman" w:hAnsi="Times New Roman" w:cs="Times New Roman"/>
+                <w:color w:val="auto"/>
+                <w:sz w:val="20"/>
+                <w:szCs w:val="20"/>
+              </w:rPr>
+              <w:t xml:space="preserve"> Collaborative Filtering con strati di </w:t>
+            </w:r>
+            <w:proofErr w:type="spellStart"/>
+            <w:r>
+              <w:rPr>
+                <w:rFonts w:ascii="Times New Roman" w:hAnsi="Times New Roman" w:cs="Times New Roman"/>
+                <w:color w:val="auto"/>
+                <w:sz w:val="20"/>
+                <w:szCs w:val="20"/>
+              </w:rPr>
+              <w:t>Embedding</w:t>
+            </w:r>
+            <w:proofErr w:type="spellEnd"/>
+            <w:r>
+              <w:rPr>
+                <w:rFonts w:ascii="Times New Roman" w:hAnsi="Times New Roman" w:cs="Times New Roman"/>
+                <w:color w:val="auto"/>
+                <w:sz w:val="20"/>
+                <w:szCs w:val="20"/>
+              </w:rPr>
+              <w:t xml:space="preserve"> densi.</w:t>
             </w:r>
           </w:p>
         </w:tc>
@@ -1628,14 +2201,25 @@
                 <w:color w:val="auto"/>
               </w:rPr>
             </w:pPr>
-            <w:r>
-              <w:rPr>
-                <w:rFonts w:ascii="Times New Roman" w:hAnsi="Times New Roman" w:cs="Times New Roman"/>
-                <w:color w:val="auto"/>
-                <w:sz w:val="20"/>
-                <w:szCs w:val="20"/>
-              </w:rPr>
-              <w:t>Heatmap e cluster geolocalizzati (es. area di Philadelphia).</w:t>
+            <w:proofErr w:type="spellStart"/>
+            <w:r>
+              <w:rPr>
+                <w:rFonts w:ascii="Times New Roman" w:hAnsi="Times New Roman" w:cs="Times New Roman"/>
+                <w:color w:val="auto"/>
+                <w:sz w:val="20"/>
+                <w:szCs w:val="20"/>
+              </w:rPr>
+              <w:t>Heatmap</w:t>
+            </w:r>
+            <w:proofErr w:type="spellEnd"/>
+            <w:r>
+              <w:rPr>
+                <w:rFonts w:ascii="Times New Roman" w:hAnsi="Times New Roman" w:cs="Times New Roman"/>
+                <w:color w:val="auto"/>
+                <w:sz w:val="20"/>
+                <w:szCs w:val="20"/>
+              </w:rPr>
+              <w:t xml:space="preserve"> e cluster geolocalizzati (es. area di Philadelphia).</w:t>
             </w:r>
           </w:p>
         </w:tc>
@@ -1668,6 +2252,7 @@
                 <w:color w:val="auto"/>
               </w:rPr>
             </w:pPr>
+            <w:proofErr w:type="spellStart"/>
             <w:r>
               <w:rPr>
                 <w:rFonts w:ascii="Times New Roman" w:hAnsi="Times New Roman" w:cs="Times New Roman"/>
@@ -1677,6 +2262,7 @@
               </w:rPr>
               <w:t>Streamlit</w:t>
             </w:r>
+            <w:proofErr w:type="spellEnd"/>
           </w:p>
         </w:tc>
         <w:tc>
@@ -1769,7 +2355,31 @@
           <w:sz w:val="18"/>
           <w:szCs w:val="18"/>
         </w:rPr>
-        <w:t>Tabella 1 - Componenti dello stack tecnologico</w:t>
+        <w:t xml:space="preserve">Tabella 1 - Componenti dello </w:t>
+      </w:r>
+      <w:proofErr w:type="spellStart"/>
+      <w:r>
+        <w:rPr>
+          <w:rFonts w:ascii="Times New Roman" w:hAnsi="Times New Roman" w:cs="Times New Roman"/>
+          <w:i/>
+          <w:iCs/>
+          <w:color w:val="auto"/>
+          <w:sz w:val="18"/>
+          <w:szCs w:val="18"/>
+        </w:rPr>
+        <w:t>stack</w:t>
+      </w:r>
+      <w:proofErr w:type="spellEnd"/>
+      <w:r>
+        <w:rPr>
+          <w:rFonts w:ascii="Times New Roman" w:hAnsi="Times New Roman" w:cs="Times New Roman"/>
+          <w:i/>
+          <w:iCs/>
+          <w:color w:val="auto"/>
+          <w:sz w:val="18"/>
+          <w:szCs w:val="18"/>
+        </w:rPr>
+        <w:t xml:space="preserve"> tecnologico</w:t>
       </w:r>
     </w:p>
     <w:p>
@@ -1836,8 +2446,18 @@
           <w:i/>
           <w:color w:val="auto"/>
         </w:rPr>
-        <w:t>Text Acquisition</w:t>
-      </w:r>
+        <w:t xml:space="preserve">Text </w:t>
+      </w:r>
+      <w:proofErr w:type="spellStart"/>
+      <w:r>
+        <w:rPr>
+          <w:rFonts w:ascii="Times New Roman" w:hAnsi="Times New Roman" w:cs="Times New Roman"/>
+          <w:i/>
+          <w:color w:val="auto"/>
+        </w:rPr>
+        <w:t>Acquisition</w:t>
+      </w:r>
+      <w:proofErr w:type="spellEnd"/>
       <w:r>
         <w:rPr>
           <w:rFonts w:ascii="Times New Roman" w:hAnsi="Times New Roman" w:cs="Times New Roman"/>
@@ -1866,8 +2486,18 @@
           <w:i/>
           <w:color w:val="auto"/>
         </w:rPr>
-        <w:t>Food/Restaurants</w:t>
-      </w:r>
+        <w:t>Food/</w:t>
+      </w:r>
+      <w:proofErr w:type="spellStart"/>
+      <w:r>
+        <w:rPr>
+          <w:rFonts w:ascii="Times New Roman" w:hAnsi="Times New Roman" w:cs="Times New Roman"/>
+          <w:i/>
+          <w:color w:val="auto"/>
+        </w:rPr>
+        <w:t>Restaurants</w:t>
+      </w:r>
+      <w:proofErr w:type="spellEnd"/>
       <w:r>
         <w:rPr>
           <w:rFonts w:ascii="Times New Roman" w:hAnsi="Times New Roman" w:cs="Times New Roman"/>
@@ -1896,8 +2526,18 @@
           <w:i/>
           <w:color w:val="auto"/>
         </w:rPr>
-        <w:t>Information Retrieval</w:t>
-      </w:r>
+        <w:t xml:space="preserve">Information </w:t>
+      </w:r>
+      <w:proofErr w:type="spellStart"/>
+      <w:r>
+        <w:rPr>
+          <w:rFonts w:ascii="Times New Roman" w:hAnsi="Times New Roman" w:cs="Times New Roman"/>
+          <w:i/>
+          <w:color w:val="auto"/>
+        </w:rPr>
+        <w:t>Retrieval</w:t>
+      </w:r>
+      <w:proofErr w:type="spellEnd"/>
       <w:r>
         <w:rPr>
           <w:rFonts w:ascii="Times New Roman" w:hAnsi="Times New Roman" w:cs="Times New Roman"/>
@@ -1937,6 +2577,7 @@
         </w:rPr>
         <w:t xml:space="preserve">3.2 Pulizia e </w:t>
       </w:r>
+      <w:proofErr w:type="spellStart"/>
       <w:r>
         <w:rPr>
           <w:rFonts w:ascii="Times New Roman" w:hAnsi="Times New Roman" w:cs="Times New Roman"/>
@@ -1945,6 +2586,7 @@
         </w:rPr>
         <w:t>preprocessing</w:t>
       </w:r>
+      <w:proofErr w:type="spellEnd"/>
     </w:p>
     <w:p>
       <w:pPr>
@@ -2154,267 +2796,6 @@
             <wp:extent cx="4953000" cy="2609850"/>
             <wp:effectExtent l="0" t="0" r="3175" b="0"/>
             <wp:docPr id="1210812291" name="Dashboard geospaziale Philadelphia" descr="Dashboard geospaziale Philadelphia" title="Dashboard geospaziale Philadelphia"/>
-            <wp:cNvGraphicFramePr>
-              <a:graphicFrameLocks xmlns:a="http://schemas.openxmlformats.org/drawingml/2006/main" noChangeAspect="1"/>
-            </wp:cNvGraphicFramePr>
-            <a:graphic xmlns:a="http://schemas.openxmlformats.org/drawingml/2006/main">
-              <a:graphicData uri="http://schemas.openxmlformats.org/drawingml/2006/picture">
-                <pic:pic xmlns:pic="http://schemas.openxmlformats.org/drawingml/2006/picture">
-                  <pic:nvPicPr>
-                    <pic:cNvPr id="0" name=""/>
-                    <pic:cNvPicPr>
-                      <a:picLocks noChangeAspect="1" noChangeArrowheads="1"/>
-                    </pic:cNvPicPr>
-                  </pic:nvPicPr>
-                  <pic:blipFill>
-                    <a:blip r:embed="rId9"/>
-                    <a:srcRect/>
-                    <a:stretch>
-                      <a:fillRect/>
-                    </a:stretch>
-                  </pic:blipFill>
-                  <pic:spPr bwMode="auto">
-                    <a:xfrm>
-                      <a:off x="0" y="0"/>
-                      <a:ext cx="4953000" cy="2609850"/>
-                    </a:xfrm>
-                    <a:prstGeom prst="rect">
-                      <a:avLst/>
-                    </a:prstGeom>
-                  </pic:spPr>
-                </pic:pic>
-              </a:graphicData>
-            </a:graphic>
-          </wp:inline>
-        </w:drawing>
-      </w:r>
-    </w:p>
-    <w:p>
-      <w:pPr>
-        <w:spacing w:before="60" w:after="240"/>
-        <w:jc w:val="center"/>
-        <w:rPr>
-          <w:rFonts w:ascii="Times New Roman" w:hAnsi="Times New Roman" w:cs="Times New Roman"/>
-          <w:color w:val="auto"/>
-        </w:rPr>
-      </w:pPr>
-      <w:r>
-        <w:rPr>
-          <w:rFonts w:ascii="Times New Roman" w:hAnsi="Times New Roman" w:cs="Times New Roman"/>
-          <w:color w:val="auto"/>
-        </w:rPr>
-        <w:t xml:space="preserve">Figura 2 - </w:t>
-      </w:r>
-      <w:r>
-        <w:rPr>
-          <w:rFonts w:ascii="Times New Roman" w:hAnsi="Times New Roman" w:cs="Times New Roman"/>
-          <w:i/>
-          <w:color w:val="auto"/>
-        </w:rPr>
-        <w:t>Dashboard</w:t>
-      </w:r>
-      <w:r>
-        <w:rPr>
-          <w:rFonts w:ascii="Times New Roman" w:hAnsi="Times New Roman" w:cs="Times New Roman"/>
-          <w:color w:val="auto"/>
-        </w:rPr>
-        <w:t xml:space="preserve"> </w:t>
-      </w:r>
-      <w:r>
-        <w:rPr>
-          <w:rFonts w:ascii="Times New Roman" w:hAnsi="Times New Roman" w:cs="Times New Roman"/>
-          <w:i/>
-          <w:color w:val="auto"/>
-        </w:rPr>
-        <w:t>Streamlit</w:t>
-      </w:r>
-      <w:r>
-        <w:rPr>
-          <w:rFonts w:ascii="Times New Roman" w:hAnsi="Times New Roman" w:cs="Times New Roman"/>
-          <w:color w:val="auto"/>
-        </w:rPr>
-        <w:t>: esplorazione geospaziale (Philadelphia)</w:t>
-      </w:r>
-    </w:p>
-    <w:p>
-      <w:pPr>
-        <w:pStyle w:val="Titolo1"/>
-        <w:keepNext/>
-        <w:rPr>
-          <w:rFonts w:ascii="Times New Roman" w:hAnsi="Times New Roman" w:cs="Times New Roman"/>
-          <w:color w:val="auto"/>
-        </w:rPr>
-      </w:pPr>
-      <w:r>
-        <w:rPr>
-          <w:rFonts w:ascii="Times New Roman" w:hAnsi="Times New Roman" w:cs="Times New Roman"/>
-          <w:color w:val="auto"/>
-        </w:rPr>
-        <w:t>4. Social Network Analysis</w:t>
-      </w:r>
-    </w:p>
-    <w:p>
-      <w:pPr>
-        <w:spacing w:after="120" w:line="300" w:lineRule="auto"/>
-        <w:jc w:val="both"/>
-        <w:rPr>
-          <w:rFonts w:ascii="Times New Roman" w:hAnsi="Times New Roman" w:cs="Times New Roman"/>
-          <w:color w:val="auto"/>
-        </w:rPr>
-      </w:pPr>
-      <w:r>
-        <w:rPr>
-          <w:rFonts w:ascii="Times New Roman" w:hAnsi="Times New Roman" w:cs="Times New Roman"/>
-          <w:color w:val="auto"/>
-        </w:rPr>
-        <w:t xml:space="preserve">Le interazioni tra utenti sono state modellate come grafo con </w:t>
-      </w:r>
-      <w:r>
-        <w:rPr>
-          <w:rFonts w:ascii="Times New Roman" w:hAnsi="Times New Roman" w:cs="Times New Roman"/>
-          <w:i/>
-          <w:color w:val="auto"/>
-        </w:rPr>
-        <w:t>NetworkX</w:t>
-      </w:r>
-      <w:r>
-        <w:rPr>
-          <w:rFonts w:ascii="Times New Roman" w:hAnsi="Times New Roman" w:cs="Times New Roman"/>
-          <w:color w:val="auto"/>
-        </w:rPr>
-        <w:t>. Tre sono le analisi principali:</w:t>
-      </w:r>
-    </w:p>
-    <w:p>
-      <w:pPr>
-        <w:pStyle w:val="Paragrafoelenco"/>
-        <w:numPr>
-          <w:ilvl w:val="0"/>
-          <w:numId w:val="2"/>
-        </w:numPr>
-        <w:spacing w:after="80" w:line="290" w:lineRule="auto"/>
-        <w:rPr>
-          <w:rFonts w:ascii="Times New Roman" w:hAnsi="Times New Roman" w:cs="Times New Roman"/>
-          <w:color w:val="auto"/>
-        </w:rPr>
-      </w:pPr>
-      <w:r>
-        <w:rPr>
-          <w:rFonts w:ascii="Times New Roman" w:hAnsi="Times New Roman" w:cs="Times New Roman"/>
-          <w:i/>
-          <w:color w:val="auto"/>
-        </w:rPr>
-        <w:t>Opinion leader</w:t>
-      </w:r>
-      <w:r>
-        <w:rPr>
-          <w:rFonts w:ascii="Times New Roman" w:hAnsi="Times New Roman" w:cs="Times New Roman"/>
-          <w:color w:val="auto"/>
-        </w:rPr>
-        <w:t xml:space="preserve">: gli utenti più influenti sono estratti tramite </w:t>
-      </w:r>
-      <w:r>
-        <w:rPr>
-          <w:rFonts w:ascii="Times New Roman" w:hAnsi="Times New Roman" w:cs="Times New Roman"/>
-          <w:i/>
-          <w:color w:val="auto"/>
-        </w:rPr>
-        <w:t>Degree Centrality</w:t>
-      </w:r>
-      <w:r>
-        <w:rPr>
-          <w:rFonts w:ascii="Times New Roman" w:hAnsi="Times New Roman" w:cs="Times New Roman"/>
-          <w:color w:val="auto"/>
-        </w:rPr>
-        <w:t>.</w:t>
-      </w:r>
-    </w:p>
-    <w:p>
-      <w:pPr>
-        <w:pStyle w:val="Paragrafoelenco"/>
-        <w:numPr>
-          <w:ilvl w:val="0"/>
-          <w:numId w:val="2"/>
-        </w:numPr>
-        <w:spacing w:after="80" w:line="290" w:lineRule="auto"/>
-        <w:rPr>
-          <w:rFonts w:ascii="Times New Roman" w:hAnsi="Times New Roman" w:cs="Times New Roman"/>
-          <w:color w:val="auto"/>
-        </w:rPr>
-      </w:pPr>
-      <w:r>
-        <w:rPr>
-          <w:rFonts w:ascii="Times New Roman" w:hAnsi="Times New Roman" w:cs="Times New Roman"/>
-          <w:color w:val="auto"/>
-        </w:rPr>
-        <w:t xml:space="preserve">Distribuzione </w:t>
-      </w:r>
-      <w:r>
-        <w:rPr>
-          <w:rFonts w:ascii="Times New Roman" w:hAnsi="Times New Roman" w:cs="Times New Roman"/>
-          <w:i/>
-          <w:color w:val="auto"/>
-        </w:rPr>
-        <w:t>Power-Law</w:t>
-      </w:r>
-      <w:r>
-        <w:rPr>
-          <w:rFonts w:ascii="Times New Roman" w:hAnsi="Times New Roman" w:cs="Times New Roman"/>
-          <w:color w:val="auto"/>
-        </w:rPr>
-        <w:t>: l'80% degli utenti scrive al massimo 5 recensioni, mentre pochi utenti molto attivi concentrano gran parte dell'attività.</w:t>
-      </w:r>
-    </w:p>
-    <w:p>
-      <w:pPr>
-        <w:pStyle w:val="Paragrafoelenco"/>
-        <w:numPr>
-          <w:ilvl w:val="0"/>
-          <w:numId w:val="2"/>
-        </w:numPr>
-        <w:spacing w:after="80" w:line="290" w:lineRule="auto"/>
-        <w:rPr>
-          <w:rFonts w:ascii="Times New Roman" w:hAnsi="Times New Roman" w:cs="Times New Roman"/>
-          <w:color w:val="auto"/>
-        </w:rPr>
-      </w:pPr>
-      <w:r>
-        <w:rPr>
-          <w:rFonts w:ascii="Times New Roman" w:hAnsi="Times New Roman" w:cs="Times New Roman"/>
-          <w:i/>
-          <w:color w:val="auto"/>
-        </w:rPr>
-        <w:t>Community Detection</w:t>
-      </w:r>
-      <w:r>
-        <w:rPr>
-          <w:rFonts w:ascii="Times New Roman" w:hAnsi="Times New Roman" w:cs="Times New Roman"/>
-          <w:color w:val="auto"/>
-        </w:rPr>
-        <w:t>: il partizionamento con l'algoritmo di Louvain individua gruppi di utenti coesi.</w:t>
-      </w:r>
-    </w:p>
-    <w:p>
-      <w:pPr>
-        <w:keepNext/>
-        <w:spacing w:before="120"/>
-        <w:jc w:val="center"/>
-        <w:rPr>
-          <w:rFonts w:ascii="Times New Roman" w:hAnsi="Times New Roman" w:cs="Times New Roman"/>
-          <w:color w:val="auto"/>
-        </w:rPr>
-      </w:pPr>
-      <w:r>
-        <w:rPr>
-          <w:rFonts w:ascii="Times New Roman" w:hAnsi="Times New Roman" w:cs="Times New Roman"/>
-          <w:noProof/>
-          <w:color w:val="auto"/>
-        </w:rPr>
-        <w:drawing>
-          <wp:inline distT="0" distB="0" distL="0" distR="0" wp14:anchorId="5599B90B" wp14:editId="055CCBD8">
-            <wp:extent cx="2571750" cy="2571750"/>
-            <wp:effectExtent l="0" t="0" r="0" b="0"/>
-            <wp:docPr id="812397696" name="Grafo con community detection" descr="Grafo con community detection" title="Grafo con community detection"/>
             <wp:cNvGraphicFramePr>
               <a:graphicFrameLocks xmlns:a="http://schemas.openxmlformats.org/drawingml/2006/main" noChangeAspect="1"/>
             </wp:cNvGraphicFramePr>
@@ -2437,7 +2818,7 @@
                   <pic:spPr bwMode="auto">
                     <a:xfrm>
                       <a:off x="0" y="0"/>
-                      <a:ext cx="2571750" cy="2571750"/>
+                      <a:ext cx="4953000" cy="2609850"/>
                     </a:xfrm>
                     <a:prstGeom prst="rect">
                       <a:avLst/>
@@ -2457,33 +2838,46 @@
         <w:rPr>
           <w:rFonts w:ascii="Times New Roman" w:hAnsi="Times New Roman" w:cs="Times New Roman"/>
           <w:color w:val="auto"/>
-          <w:lang w:val="en-US"/>
-        </w:rPr>
-      </w:pPr>
-      <w:r>
-        <w:rPr>
-          <w:rFonts w:ascii="Times New Roman" w:hAnsi="Times New Roman" w:cs="Times New Roman"/>
-          <w:color w:val="auto"/>
-          <w:lang w:val="en-US"/>
-        </w:rPr>
-        <w:t>Figura 3 - Grafo della rete con layout spring (</w:t>
-      </w:r>
-      <w:r>
-        <w:rPr>
-          <w:rFonts w:ascii="Times New Roman" w:hAnsi="Times New Roman" w:cs="Times New Roman"/>
-          <w:i/>
-          <w:color w:val="auto"/>
-          <w:lang w:val="en-US"/>
-        </w:rPr>
-        <w:t>community detection</w:t>
-      </w:r>
-      <w:r>
-        <w:rPr>
-          <w:rFonts w:ascii="Times New Roman" w:hAnsi="Times New Roman" w:cs="Times New Roman"/>
-          <w:color w:val="auto"/>
-          <w:lang w:val="en-US"/>
-        </w:rPr>
-        <w:t>)</w:t>
+        </w:rPr>
+      </w:pPr>
+      <w:r>
+        <w:rPr>
+          <w:rFonts w:ascii="Times New Roman" w:hAnsi="Times New Roman" w:cs="Times New Roman"/>
+          <w:color w:val="auto"/>
+        </w:rPr>
+        <w:t xml:space="preserve">Figura 2 - </w:t>
+      </w:r>
+      <w:r>
+        <w:rPr>
+          <w:rFonts w:ascii="Times New Roman" w:hAnsi="Times New Roman" w:cs="Times New Roman"/>
+          <w:i/>
+          <w:color w:val="auto"/>
+        </w:rPr>
+        <w:t>Dashboard</w:t>
+      </w:r>
+      <w:r>
+        <w:rPr>
+          <w:rFonts w:ascii="Times New Roman" w:hAnsi="Times New Roman" w:cs="Times New Roman"/>
+          <w:color w:val="auto"/>
+        </w:rPr>
+        <w:t xml:space="preserve"> </w:t>
+      </w:r>
+      <w:proofErr w:type="spellStart"/>
+      <w:r>
+        <w:rPr>
+          <w:rFonts w:ascii="Times New Roman" w:hAnsi="Times New Roman" w:cs="Times New Roman"/>
+          <w:i/>
+          <w:color w:val="auto"/>
+        </w:rPr>
+        <w:t>Streamlit</w:t>
+      </w:r>
+      <w:proofErr w:type="spellEnd"/>
+      <w:r>
+        <w:rPr>
+          <w:rFonts w:ascii="Times New Roman" w:hAnsi="Times New Roman" w:cs="Times New Roman"/>
+          <w:color w:val="auto"/>
+        </w:rPr>
+        <w:t>: esplorazione geospaziale (Philadelphia)</w:t>
       </w:r>
     </w:p>
     <w:p>
@@ -2493,26 +2887,14 @@
         <w:rPr>
           <w:rFonts w:ascii="Times New Roman" w:hAnsi="Times New Roman" w:cs="Times New Roman"/>
           <w:color w:val="auto"/>
-          <w:lang w:val="en-US"/>
-        </w:rPr>
-      </w:pPr>
-      <w:r>
-        <w:rPr>
-          <w:rFonts w:ascii="Times New Roman" w:hAnsi="Times New Roman" w:cs="Times New Roman"/>
-          <w:color w:val="auto"/>
-          <w:lang w:val="en-US"/>
-        </w:rPr>
-        <w:lastRenderedPageBreak/>
-        <w:t xml:space="preserve">5. Text mining e </w:t>
-      </w:r>
-      <w:r>
-        <w:rPr>
-          <w:rFonts w:ascii="Times New Roman" w:hAnsi="Times New Roman" w:cs="Times New Roman"/>
-          <w:i/>
-          <w:color w:val="auto"/>
-          <w:lang w:val="en-US"/>
-        </w:rPr>
-        <w:t>topic modeling</w:t>
+        </w:rPr>
+      </w:pPr>
+      <w:r>
+        <w:rPr>
+          <w:rFonts w:ascii="Times New Roman" w:hAnsi="Times New Roman" w:cs="Times New Roman"/>
+          <w:color w:val="auto"/>
+        </w:rPr>
+        <w:t>4. Social Network Analysis</w:t>
       </w:r>
     </w:p>
     <w:p>
@@ -2529,469 +2911,169 @@
           <w:rFonts w:ascii="Times New Roman" w:hAnsi="Times New Roman" w:cs="Times New Roman"/>
           <w:color w:val="auto"/>
         </w:rPr>
-        <w:t xml:space="preserve">Attraverso il </w:t>
-      </w:r>
-      <w:r>
-        <w:rPr>
-          <w:rFonts w:ascii="Times New Roman" w:hAnsi="Times New Roman" w:cs="Times New Roman"/>
-          <w:i/>
-          <w:color w:val="auto"/>
-        </w:rPr>
-        <w:t>Natural Language Processing</w:t>
-      </w:r>
-      <w:r>
-        <w:rPr>
-          <w:rFonts w:ascii="Times New Roman" w:hAnsi="Times New Roman" w:cs="Times New Roman"/>
-          <w:color w:val="auto"/>
-        </w:rPr>
-        <w:t xml:space="preserve"> i testi delle recensioni sono trasformati in r</w:t>
-      </w:r>
-      <w:r>
-        <w:rPr>
-          <w:rFonts w:ascii="Times New Roman" w:hAnsi="Times New Roman" w:cs="Times New Roman"/>
-          <w:i/>
-          <w:color w:val="auto"/>
-        </w:rPr>
-        <w:t>app</w:t>
-      </w:r>
-      <w:r>
-        <w:rPr>
-          <w:rFonts w:ascii="Times New Roman" w:hAnsi="Times New Roman" w:cs="Times New Roman"/>
-          <w:color w:val="auto"/>
-        </w:rPr>
-        <w:t>resentazioni numeriche.</w:t>
+        <w:t xml:space="preserve">Le interazioni tra utenti sono state modellate come grafo con </w:t>
+      </w:r>
+      <w:proofErr w:type="spellStart"/>
+      <w:r>
+        <w:rPr>
+          <w:rFonts w:ascii="Times New Roman" w:hAnsi="Times New Roman" w:cs="Times New Roman"/>
+          <w:i/>
+          <w:color w:val="auto"/>
+        </w:rPr>
+        <w:t>NetworkX</w:t>
+      </w:r>
+      <w:proofErr w:type="spellEnd"/>
+      <w:r>
+        <w:rPr>
+          <w:rFonts w:ascii="Times New Roman" w:hAnsi="Times New Roman" w:cs="Times New Roman"/>
+          <w:color w:val="auto"/>
+        </w:rPr>
+        <w:t>. Tre sono le analisi principali:</w:t>
       </w:r>
     </w:p>
     <w:p>
       <w:pPr>
-        <w:pStyle w:val="Titolo2"/>
-        <w:keepNext/>
-        <w:rPr>
-          <w:rFonts w:ascii="Times New Roman" w:hAnsi="Times New Roman" w:cs="Times New Roman"/>
-          <w:color w:val="auto"/>
-        </w:rPr>
-      </w:pPr>
-      <w:r>
-        <w:rPr>
-          <w:rFonts w:ascii="Times New Roman" w:hAnsi="Times New Roman" w:cs="Times New Roman"/>
-          <w:color w:val="auto"/>
-        </w:rPr>
-        <w:t xml:space="preserve">5.1 </w:t>
-      </w:r>
-      <w:r>
-        <w:rPr>
-          <w:rFonts w:ascii="Times New Roman" w:hAnsi="Times New Roman" w:cs="Times New Roman"/>
-          <w:i/>
-          <w:color w:val="auto"/>
-        </w:rPr>
-        <w:t>TF-IDF</w:t>
+        <w:pStyle w:val="Paragrafoelenco"/>
+        <w:numPr>
+          <w:ilvl w:val="0"/>
+          <w:numId w:val="2"/>
+        </w:numPr>
+        <w:spacing w:after="80" w:line="290" w:lineRule="auto"/>
+        <w:rPr>
+          <w:rFonts w:ascii="Times New Roman" w:hAnsi="Times New Roman" w:cs="Times New Roman"/>
+          <w:color w:val="auto"/>
+        </w:rPr>
+      </w:pPr>
+      <w:r>
+        <w:rPr>
+          <w:rFonts w:ascii="Times New Roman" w:hAnsi="Times New Roman" w:cs="Times New Roman"/>
+          <w:i/>
+          <w:color w:val="auto"/>
+        </w:rPr>
+        <w:t>Opinion leader</w:t>
+      </w:r>
+      <w:r>
+        <w:rPr>
+          <w:rFonts w:ascii="Times New Roman" w:hAnsi="Times New Roman" w:cs="Times New Roman"/>
+          <w:color w:val="auto"/>
+        </w:rPr>
+        <w:t xml:space="preserve">: gli utenti più influenti sono estratti tramite </w:t>
+      </w:r>
+      <w:r>
+        <w:rPr>
+          <w:rFonts w:ascii="Times New Roman" w:hAnsi="Times New Roman" w:cs="Times New Roman"/>
+          <w:i/>
+          <w:color w:val="auto"/>
+        </w:rPr>
+        <w:t xml:space="preserve">Degree </w:t>
+      </w:r>
+      <w:proofErr w:type="spellStart"/>
+      <w:r>
+        <w:rPr>
+          <w:rFonts w:ascii="Times New Roman" w:hAnsi="Times New Roman" w:cs="Times New Roman"/>
+          <w:i/>
+          <w:color w:val="auto"/>
+        </w:rPr>
+        <w:t>Centrality</w:t>
+      </w:r>
+      <w:proofErr w:type="spellEnd"/>
+      <w:r>
+        <w:rPr>
+          <w:rFonts w:ascii="Times New Roman" w:hAnsi="Times New Roman" w:cs="Times New Roman"/>
+          <w:color w:val="auto"/>
+        </w:rPr>
+        <w:t>.</w:t>
       </w:r>
     </w:p>
     <w:p>
       <w:pPr>
-        <w:spacing w:after="120" w:line="300" w:lineRule="auto"/>
-        <w:jc w:val="both"/>
-        <w:rPr>
-          <w:rFonts w:ascii="Times New Roman" w:hAnsi="Times New Roman" w:cs="Times New Roman"/>
-          <w:color w:val="auto"/>
-        </w:rPr>
-      </w:pPr>
-      <w:r>
-        <w:rPr>
-          <w:rFonts w:ascii="Times New Roman" w:hAnsi="Times New Roman" w:cs="Times New Roman"/>
-          <w:color w:val="auto"/>
-        </w:rPr>
-        <w:t xml:space="preserve">La metrica </w:t>
-      </w:r>
-      <w:r>
-        <w:rPr>
-          <w:rFonts w:ascii="Times New Roman" w:hAnsi="Times New Roman" w:cs="Times New Roman"/>
-          <w:i/>
-          <w:color w:val="auto"/>
-        </w:rPr>
-        <w:t>TF-IDF</w:t>
-      </w:r>
-      <w:r>
-        <w:rPr>
-          <w:rFonts w:ascii="Times New Roman" w:hAnsi="Times New Roman" w:cs="Times New Roman"/>
-          <w:color w:val="auto"/>
-        </w:rPr>
-        <w:t xml:space="preserve"> converte il testo in matrici numeriche sparse e misura l'importanza di un termine t in un documento d all'interno di un corpus D:</w:t>
+        <w:pStyle w:val="Paragrafoelenco"/>
+        <w:numPr>
+          <w:ilvl w:val="0"/>
+          <w:numId w:val="2"/>
+        </w:numPr>
+        <w:spacing w:after="80" w:line="290" w:lineRule="auto"/>
+        <w:rPr>
+          <w:rFonts w:ascii="Times New Roman" w:hAnsi="Times New Roman" w:cs="Times New Roman"/>
+          <w:color w:val="auto"/>
+        </w:rPr>
+      </w:pPr>
+      <w:r>
+        <w:rPr>
+          <w:rFonts w:ascii="Times New Roman" w:hAnsi="Times New Roman" w:cs="Times New Roman"/>
+          <w:color w:val="auto"/>
+        </w:rPr>
+        <w:t xml:space="preserve">Distribuzione </w:t>
+      </w:r>
+      <w:r>
+        <w:rPr>
+          <w:rFonts w:ascii="Times New Roman" w:hAnsi="Times New Roman" w:cs="Times New Roman"/>
+          <w:i/>
+          <w:color w:val="auto"/>
+        </w:rPr>
+        <w:t>Power-Law</w:t>
+      </w:r>
+      <w:r>
+        <w:rPr>
+          <w:rFonts w:ascii="Times New Roman" w:hAnsi="Times New Roman" w:cs="Times New Roman"/>
+          <w:color w:val="auto"/>
+        </w:rPr>
+        <w:t>: l'80% degli utenti scrive al massimo 5 recensioni, mentre pochi utenti molto attivi concentrano gran parte dell'attività.</w:t>
       </w:r>
     </w:p>
     <w:p>
       <w:pPr>
-        <w:shd w:val="clear" w:color="auto" w:fill="F3F3F6"/>
-        <w:spacing w:before="120" w:after="160"/>
-        <w:jc w:val="center"/>
-        <w:rPr>
-          <w:rFonts w:ascii="Times New Roman" w:hAnsi="Times New Roman" w:cs="Times New Roman"/>
-          <w:color w:val="auto"/>
-        </w:rPr>
-      </w:pPr>
-      <w:r>
-        <w:rPr>
-          <w:rFonts w:ascii="Times New Roman" w:eastAsia="Cambria" w:hAnsi="Times New Roman" w:cs="Times New Roman"/>
-          <w:i/>
-          <w:iCs/>
-          <w:color w:val="auto"/>
-          <w:sz w:val="24"/>
-          <w:szCs w:val="24"/>
-        </w:rPr>
-        <w:t>TFIDF(t, d, D) = TF(t, d) × log( |D| / (1 + DF(t, D)) )</w:t>
-      </w:r>
-    </w:p>
-    <w:p>
-      <w:pPr>
-        <w:pStyle w:val="Titolo2"/>
-        <w:keepNext/>
-        <w:rPr>
-          <w:rFonts w:ascii="Times New Roman" w:hAnsi="Times New Roman" w:cs="Times New Roman"/>
-          <w:color w:val="auto"/>
-        </w:rPr>
-      </w:pPr>
-      <w:r>
-        <w:rPr>
-          <w:rFonts w:ascii="Times New Roman" w:hAnsi="Times New Roman" w:cs="Times New Roman"/>
-          <w:color w:val="auto"/>
-        </w:rPr>
-        <w:t>5.2 Classificazione del sentiment</w:t>
-      </w:r>
-    </w:p>
-    <w:p>
-      <w:pPr>
-        <w:spacing w:after="120" w:line="300" w:lineRule="auto"/>
-        <w:jc w:val="both"/>
-        <w:rPr>
-          <w:rFonts w:ascii="Times New Roman" w:hAnsi="Times New Roman" w:cs="Times New Roman"/>
-          <w:color w:val="auto"/>
-        </w:rPr>
-      </w:pPr>
-      <w:r>
-        <w:rPr>
-          <w:rFonts w:ascii="Times New Roman" w:hAnsi="Times New Roman" w:cs="Times New Roman"/>
-          <w:color w:val="auto"/>
-        </w:rPr>
-        <w:t xml:space="preserve">Una </w:t>
-      </w:r>
-      <w:r>
-        <w:rPr>
-          <w:rFonts w:ascii="Times New Roman" w:hAnsi="Times New Roman" w:cs="Times New Roman"/>
-          <w:i/>
-          <w:color w:val="auto"/>
-        </w:rPr>
-        <w:t>Logistic Regression</w:t>
-      </w:r>
-      <w:r>
-        <w:rPr>
-          <w:rFonts w:ascii="Times New Roman" w:hAnsi="Times New Roman" w:cs="Times New Roman"/>
-          <w:color w:val="auto"/>
-        </w:rPr>
-        <w:t xml:space="preserve"> addestrata sulla matrice </w:t>
-      </w:r>
-      <w:r>
-        <w:rPr>
-          <w:rFonts w:ascii="Times New Roman" w:hAnsi="Times New Roman" w:cs="Times New Roman"/>
-          <w:i/>
-          <w:color w:val="auto"/>
-        </w:rPr>
-        <w:t>TF-IDF</w:t>
-      </w:r>
-      <w:r>
-        <w:rPr>
-          <w:rFonts w:ascii="Times New Roman" w:hAnsi="Times New Roman" w:cs="Times New Roman"/>
-          <w:color w:val="auto"/>
-        </w:rPr>
-        <w:t xml:space="preserve"> classifica il testo inserito dall'utente come positivo o negativo in tempo reale. Come modello di confronto è stato usato un </w:t>
-      </w:r>
-      <w:r>
-        <w:rPr>
-          <w:rFonts w:ascii="Times New Roman" w:hAnsi="Times New Roman" w:cs="Times New Roman"/>
-          <w:i/>
-          <w:color w:val="auto"/>
-        </w:rPr>
-        <w:t>Multinomial Naive Bayes</w:t>
-      </w:r>
-      <w:r>
-        <w:rPr>
-          <w:rFonts w:ascii="Times New Roman" w:hAnsi="Times New Roman" w:cs="Times New Roman"/>
-          <w:color w:val="auto"/>
-        </w:rPr>
-        <w:t>. Per gestire lo s</w:t>
-      </w:r>
-      <w:r>
-        <w:rPr>
-          <w:rFonts w:ascii="Times New Roman" w:hAnsi="Times New Roman" w:cs="Times New Roman"/>
-          <w:i/>
-          <w:color w:val="auto"/>
-        </w:rPr>
-        <w:t>bi</w:t>
-      </w:r>
-      <w:r>
-        <w:rPr>
-          <w:rFonts w:ascii="Times New Roman" w:hAnsi="Times New Roman" w:cs="Times New Roman"/>
-          <w:color w:val="auto"/>
-        </w:rPr>
-        <w:t>lanciamento delle classi e valutare l'equilibrio tra falsi positivi e falsi negativi, la validazione si è basata sull'</w:t>
-      </w:r>
-      <w:r>
-        <w:rPr>
-          <w:rFonts w:ascii="Times New Roman" w:hAnsi="Times New Roman" w:cs="Times New Roman"/>
-          <w:i/>
-          <w:color w:val="auto"/>
-        </w:rPr>
-        <w:t>F1-score</w:t>
-      </w:r>
-      <w:r>
-        <w:rPr>
-          <w:rFonts w:ascii="Times New Roman" w:hAnsi="Times New Roman" w:cs="Times New Roman"/>
-          <w:color w:val="auto"/>
-        </w:rPr>
-        <w:t>:</w:t>
-      </w:r>
-    </w:p>
-    <w:p>
-      <w:pPr>
-        <w:shd w:val="clear" w:color="auto" w:fill="F3F3F6"/>
-        <w:spacing w:before="120" w:after="160"/>
-        <w:jc w:val="center"/>
-        <w:rPr>
-          <w:rFonts w:ascii="Times New Roman" w:hAnsi="Times New Roman" w:cs="Times New Roman"/>
-          <w:color w:val="auto"/>
-          <w:lang w:val="en-US"/>
-        </w:rPr>
-      </w:pPr>
-      <w:r>
-        <w:rPr>
-          <w:rFonts w:ascii="Times New Roman" w:hAnsi="Times New Roman" w:cs="Times New Roman"/>
-          <w:color w:val="auto"/>
-          <w:lang w:val="en-US"/>
-        </w:rPr>
-        <w:t>F1 = 2 × (</w:t>
-      </w:r>
-      <w:r>
-        <w:rPr>
-          <w:rFonts w:ascii="Times New Roman" w:hAnsi="Times New Roman" w:cs="Times New Roman"/>
-          <w:i/>
-          <w:color w:val="auto"/>
-          <w:lang w:val="en-US"/>
-        </w:rPr>
-        <w:t>Precision</w:t>
-      </w:r>
-      <w:r>
-        <w:rPr>
-          <w:rFonts w:ascii="Times New Roman" w:hAnsi="Times New Roman" w:cs="Times New Roman"/>
-          <w:color w:val="auto"/>
-          <w:lang w:val="en-US"/>
-        </w:rPr>
-        <w:t xml:space="preserve"> × </w:t>
-      </w:r>
-      <w:r>
-        <w:rPr>
-          <w:rFonts w:ascii="Times New Roman" w:hAnsi="Times New Roman" w:cs="Times New Roman"/>
-          <w:i/>
-          <w:color w:val="auto"/>
-          <w:lang w:val="en-US"/>
-        </w:rPr>
-        <w:t>Recall</w:t>
-      </w:r>
-      <w:r>
-        <w:rPr>
-          <w:rFonts w:ascii="Times New Roman" w:hAnsi="Times New Roman" w:cs="Times New Roman"/>
-          <w:color w:val="auto"/>
-          <w:lang w:val="en-US"/>
-        </w:rPr>
-        <w:t>) / (</w:t>
-      </w:r>
-      <w:r>
-        <w:rPr>
-          <w:rFonts w:ascii="Times New Roman" w:hAnsi="Times New Roman" w:cs="Times New Roman"/>
-          <w:i/>
-          <w:color w:val="auto"/>
-          <w:lang w:val="en-US"/>
-        </w:rPr>
-        <w:t>Precision</w:t>
-      </w:r>
-      <w:r>
-        <w:rPr>
-          <w:rFonts w:ascii="Times New Roman" w:hAnsi="Times New Roman" w:cs="Times New Roman"/>
-          <w:color w:val="auto"/>
-          <w:lang w:val="en-US"/>
-        </w:rPr>
-        <w:t xml:space="preserve"> + </w:t>
-      </w:r>
-      <w:r>
-        <w:rPr>
-          <w:rFonts w:ascii="Times New Roman" w:hAnsi="Times New Roman" w:cs="Times New Roman"/>
-          <w:i/>
-          <w:color w:val="auto"/>
-          <w:lang w:val="en-US"/>
-        </w:rPr>
-        <w:t>Recall</w:t>
-      </w:r>
-      <w:r>
-        <w:rPr>
-          <w:rFonts w:ascii="Times New Roman" w:hAnsi="Times New Roman" w:cs="Times New Roman"/>
-          <w:color w:val="auto"/>
-          <w:lang w:val="en-US"/>
-        </w:rPr>
-        <w:t>)</w:t>
-      </w:r>
-    </w:p>
-    <w:p>
-      <w:pPr>
-        <w:spacing w:after="120" w:line="300" w:lineRule="auto"/>
-        <w:jc w:val="both"/>
-        <w:rPr>
-          <w:rFonts w:ascii="Times New Roman" w:hAnsi="Times New Roman" w:cs="Times New Roman"/>
-          <w:color w:val="auto"/>
-        </w:rPr>
-      </w:pPr>
-      <w:r>
-        <w:rPr>
-          <w:rFonts w:ascii="Times New Roman" w:hAnsi="Times New Roman" w:cs="Times New Roman"/>
-          <w:color w:val="auto"/>
-        </w:rPr>
-        <w:t xml:space="preserve">Il modello raggiunge un F1 di circa 0,97 con </w:t>
-      </w:r>
-      <w:r>
-        <w:rPr>
-          <w:rFonts w:ascii="Times New Roman" w:hAnsi="Times New Roman" w:cs="Times New Roman"/>
-          <w:i/>
-          <w:color w:val="auto"/>
-        </w:rPr>
-        <w:t>AUC</w:t>
-      </w:r>
-      <w:r>
-        <w:rPr>
-          <w:rFonts w:ascii="Times New Roman" w:hAnsi="Times New Roman" w:cs="Times New Roman"/>
-          <w:color w:val="auto"/>
-        </w:rPr>
-        <w:t xml:space="preserve"> pari a 0,985.</w:t>
-      </w:r>
-    </w:p>
-    <w:p>
-      <w:pPr>
-        <w:pStyle w:val="Titolo2"/>
-        <w:keepNext/>
-        <w:rPr>
-          <w:rFonts w:ascii="Times New Roman" w:hAnsi="Times New Roman" w:cs="Times New Roman"/>
-          <w:color w:val="auto"/>
-        </w:rPr>
-      </w:pPr>
-      <w:r>
-        <w:rPr>
-          <w:rFonts w:ascii="Times New Roman" w:hAnsi="Times New Roman" w:cs="Times New Roman"/>
-          <w:color w:val="auto"/>
-        </w:rPr>
-        <w:t xml:space="preserve">5.3 </w:t>
-      </w:r>
-      <w:r>
-        <w:rPr>
-          <w:rFonts w:ascii="Times New Roman" w:hAnsi="Times New Roman" w:cs="Times New Roman"/>
-          <w:i/>
-          <w:color w:val="auto"/>
-        </w:rPr>
-        <w:t>Topic modeling</w:t>
-      </w:r>
-      <w:r>
-        <w:rPr>
-          <w:rFonts w:ascii="Times New Roman" w:hAnsi="Times New Roman" w:cs="Times New Roman"/>
-          <w:color w:val="auto"/>
-        </w:rPr>
-        <w:t xml:space="preserve"> (LDA)</w:t>
-      </w:r>
-    </w:p>
-    <w:p>
-      <w:pPr>
-        <w:spacing w:after="120" w:line="300" w:lineRule="auto"/>
-        <w:jc w:val="both"/>
-        <w:rPr>
-          <w:rFonts w:ascii="Times New Roman" w:hAnsi="Times New Roman" w:cs="Times New Roman"/>
-          <w:color w:val="auto"/>
-        </w:rPr>
-      </w:pPr>
-      <w:r>
-        <w:rPr>
-          <w:rFonts w:ascii="Times New Roman" w:hAnsi="Times New Roman" w:cs="Times New Roman"/>
-          <w:color w:val="auto"/>
-        </w:rPr>
-        <w:t xml:space="preserve">La </w:t>
-      </w:r>
-      <w:r>
-        <w:rPr>
-          <w:rFonts w:ascii="Times New Roman" w:hAnsi="Times New Roman" w:cs="Times New Roman"/>
-          <w:i/>
-          <w:color w:val="auto"/>
-        </w:rPr>
-        <w:t>Latent Dirichlet Allocation</w:t>
-      </w:r>
-      <w:r>
-        <w:rPr>
-          <w:rFonts w:ascii="Times New Roman" w:hAnsi="Times New Roman" w:cs="Times New Roman"/>
-          <w:color w:val="auto"/>
-        </w:rPr>
-        <w:t xml:space="preserve"> raggruppa i concetti espressi dai clienti in cinque macro-temi: servizio, cibo, attese, prezzo e atmosfera. Com</w:t>
-      </w:r>
-      <w:r>
-        <w:rPr>
-          <w:rFonts w:ascii="Times New Roman" w:hAnsi="Times New Roman" w:cs="Times New Roman"/>
-          <w:i/>
-          <w:color w:val="auto"/>
-        </w:rPr>
-        <w:t>bi</w:t>
-      </w:r>
-      <w:r>
-        <w:rPr>
-          <w:rFonts w:ascii="Times New Roman" w:hAnsi="Times New Roman" w:cs="Times New Roman"/>
-          <w:color w:val="auto"/>
-        </w:rPr>
-        <w:t xml:space="preserve">nando i topic con i </w:t>
-      </w:r>
-      <w:r>
-        <w:rPr>
-          <w:rFonts w:ascii="Times New Roman" w:hAnsi="Times New Roman" w:cs="Times New Roman"/>
-          <w:i/>
-          <w:color w:val="auto"/>
-        </w:rPr>
-        <w:t>rating</w:t>
-      </w:r>
-      <w:r>
-        <w:rPr>
-          <w:rFonts w:ascii="Times New Roman" w:hAnsi="Times New Roman" w:cs="Times New Roman"/>
-          <w:color w:val="auto"/>
-        </w:rPr>
-        <w:t xml:space="preserve"> è possi</w:t>
-      </w:r>
-      <w:r>
-        <w:rPr>
-          <w:rFonts w:ascii="Times New Roman" w:hAnsi="Times New Roman" w:cs="Times New Roman"/>
-          <w:i/>
-          <w:color w:val="auto"/>
-        </w:rPr>
-        <w:t>bi</w:t>
-      </w:r>
-      <w:r>
-        <w:rPr>
-          <w:rFonts w:ascii="Times New Roman" w:hAnsi="Times New Roman" w:cs="Times New Roman"/>
-          <w:color w:val="auto"/>
-        </w:rPr>
-        <w:t xml:space="preserve">le capire perché un locale perde stelle e dove intervenire. Le </w:t>
-      </w:r>
-      <w:r>
-        <w:rPr>
-          <w:rFonts w:ascii="Times New Roman" w:hAnsi="Times New Roman" w:cs="Times New Roman"/>
-          <w:i/>
-          <w:color w:val="auto"/>
-        </w:rPr>
-        <w:t>word cloud</w:t>
-      </w:r>
-      <w:r>
-        <w:rPr>
-          <w:rFonts w:ascii="Times New Roman" w:hAnsi="Times New Roman" w:cs="Times New Roman"/>
-          <w:color w:val="auto"/>
-        </w:rPr>
-        <w:t xml:space="preserve"> mostrano un lessico positivo legato a cortesia e cibo e uno negativo legato ad attese e servizio freddo.</w:t>
+        <w:pStyle w:val="Paragrafoelenco"/>
+        <w:numPr>
+          <w:ilvl w:val="0"/>
+          <w:numId w:val="2"/>
+        </w:numPr>
+        <w:spacing w:after="80" w:line="290" w:lineRule="auto"/>
+        <w:rPr>
+          <w:rFonts w:ascii="Times New Roman" w:hAnsi="Times New Roman" w:cs="Times New Roman"/>
+          <w:color w:val="auto"/>
+        </w:rPr>
+      </w:pPr>
+      <w:r>
+        <w:rPr>
+          <w:rFonts w:ascii="Times New Roman" w:hAnsi="Times New Roman" w:cs="Times New Roman"/>
+          <w:i/>
+          <w:color w:val="auto"/>
+        </w:rPr>
+        <w:t xml:space="preserve">Community </w:t>
+      </w:r>
+      <w:proofErr w:type="spellStart"/>
+      <w:r>
+        <w:rPr>
+          <w:rFonts w:ascii="Times New Roman" w:hAnsi="Times New Roman" w:cs="Times New Roman"/>
+          <w:i/>
+          <w:color w:val="auto"/>
+        </w:rPr>
+        <w:t>Detection</w:t>
+      </w:r>
+      <w:proofErr w:type="spellEnd"/>
+      <w:r>
+        <w:rPr>
+          <w:rFonts w:ascii="Times New Roman" w:hAnsi="Times New Roman" w:cs="Times New Roman"/>
+          <w:color w:val="auto"/>
+        </w:rPr>
+        <w:t xml:space="preserve">: il partizionamento con l'algoritmo di </w:t>
+      </w:r>
+      <w:proofErr w:type="spellStart"/>
+      <w:r>
+        <w:rPr>
+          <w:rFonts w:ascii="Times New Roman" w:hAnsi="Times New Roman" w:cs="Times New Roman"/>
+          <w:color w:val="auto"/>
+        </w:rPr>
+        <w:t>Louvain</w:t>
+      </w:r>
+      <w:proofErr w:type="spellEnd"/>
+      <w:r>
+        <w:rPr>
+          <w:rFonts w:ascii="Times New Roman" w:hAnsi="Times New Roman" w:cs="Times New Roman"/>
+          <w:color w:val="auto"/>
+        </w:rPr>
+        <w:t xml:space="preserve"> individua gruppi di utenti coesi.</w:t>
       </w:r>
     </w:p>
     <w:p>
@@ -3011,10 +3093,10 @@
           <w:color w:val="auto"/>
         </w:rPr>
         <w:drawing>
-          <wp:inline distT="0" distB="0" distL="0" distR="0" wp14:anchorId="5404BFB6" wp14:editId="553B8354">
-            <wp:extent cx="4953000" cy="1752600"/>
+          <wp:inline distT="0" distB="0" distL="0" distR="0" wp14:anchorId="5599B90B" wp14:editId="055CCBD8">
+            <wp:extent cx="2571750" cy="2571750"/>
             <wp:effectExtent l="0" t="0" r="0" b="0"/>
-            <wp:docPr id="371144293" name="Word cloud recensioni positive e negative" descr="Word cloud recensioni positive e negative" title="Word cloud recensioni positive e negative"/>
+            <wp:docPr id="812397696" name="Grafo con community detection" descr="Grafo con community detection" title="Grafo con community detection"/>
             <wp:cNvGraphicFramePr>
               <a:graphicFrameLocks xmlns:a="http://schemas.openxmlformats.org/drawingml/2006/main" noChangeAspect="1"/>
             </wp:cNvGraphicFramePr>
@@ -3037,7 +3119,7 @@
                   <pic:spPr bwMode="auto">
                     <a:xfrm>
                       <a:off x="0" y="0"/>
-                      <a:ext cx="4953000" cy="1752600"/>
+                      <a:ext cx="2571750" cy="2571750"/>
                     </a:xfrm>
                     <a:prstGeom prst="rect">
                       <a:avLst/>
@@ -3057,29 +3139,831 @@
         <w:rPr>
           <w:rFonts w:ascii="Times New Roman" w:hAnsi="Times New Roman" w:cs="Times New Roman"/>
           <w:color w:val="auto"/>
-        </w:rPr>
-      </w:pPr>
-      <w:r>
-        <w:rPr>
-          <w:rFonts w:ascii="Times New Roman" w:hAnsi="Times New Roman" w:cs="Times New Roman"/>
-          <w:color w:val="auto"/>
-        </w:rPr>
-        <w:t xml:space="preserve">Figura 4 - </w:t>
-      </w:r>
-      <w:r>
-        <w:rPr>
-          <w:rFonts w:ascii="Times New Roman" w:hAnsi="Times New Roman" w:cs="Times New Roman"/>
-          <w:i/>
-          <w:color w:val="auto"/>
-        </w:rPr>
-        <w:t>Word cloud</w:t>
-      </w:r>
-      <w:r>
-        <w:rPr>
-          <w:rFonts w:ascii="Times New Roman" w:hAnsi="Times New Roman" w:cs="Times New Roman"/>
-          <w:color w:val="auto"/>
-        </w:rPr>
-        <w:t xml:space="preserve"> delle recensioni positive e negative</w:t>
+          <w:lang w:val="en-US"/>
+        </w:rPr>
+      </w:pPr>
+      <w:proofErr w:type="spellStart"/>
+      <w:r>
+        <w:rPr>
+          <w:rFonts w:ascii="Times New Roman" w:hAnsi="Times New Roman" w:cs="Times New Roman"/>
+          <w:color w:val="auto"/>
+          <w:lang w:val="en-US"/>
+        </w:rPr>
+        <w:t>Figura</w:t>
+      </w:r>
+      <w:proofErr w:type="spellEnd"/>
+      <w:r>
+        <w:rPr>
+          <w:rFonts w:ascii="Times New Roman" w:hAnsi="Times New Roman" w:cs="Times New Roman"/>
+          <w:color w:val="auto"/>
+          <w:lang w:val="en-US"/>
+        </w:rPr>
+        <w:t xml:space="preserve"> 3 - </w:t>
+      </w:r>
+      <w:proofErr w:type="spellStart"/>
+      <w:r>
+        <w:rPr>
+          <w:rFonts w:ascii="Times New Roman" w:hAnsi="Times New Roman" w:cs="Times New Roman"/>
+          <w:color w:val="auto"/>
+          <w:lang w:val="en-US"/>
+        </w:rPr>
+        <w:t>Grafo</w:t>
+      </w:r>
+      <w:proofErr w:type="spellEnd"/>
+      <w:r>
+        <w:rPr>
+          <w:rFonts w:ascii="Times New Roman" w:hAnsi="Times New Roman" w:cs="Times New Roman"/>
+          <w:color w:val="auto"/>
+          <w:lang w:val="en-US"/>
+        </w:rPr>
+        <w:t xml:space="preserve"> della rete con </w:t>
+      </w:r>
+      <w:r>
+        <w:rPr>
+          <w:rFonts w:ascii="Times New Roman" w:hAnsi="Times New Roman" w:cs="Times New Roman"/>
+          <w:i/>
+          <w:iCs/>
+          <w:color w:val="auto"/>
+          <w:lang w:val="en-US"/>
+        </w:rPr>
+        <w:t>layout</w:t>
+      </w:r>
+      <w:r>
+        <w:rPr>
+          <w:rFonts w:ascii="Times New Roman" w:hAnsi="Times New Roman" w:cs="Times New Roman"/>
+          <w:color w:val="auto"/>
+          <w:lang w:val="en-US"/>
+        </w:rPr>
+        <w:t xml:space="preserve"> </w:t>
+      </w:r>
+      <w:r>
+        <w:rPr>
+          <w:rFonts w:ascii="Times New Roman" w:hAnsi="Times New Roman" w:cs="Times New Roman"/>
+          <w:i/>
+          <w:iCs/>
+          <w:color w:val="auto"/>
+          <w:lang w:val="en-US"/>
+        </w:rPr>
+        <w:t>spring</w:t>
+      </w:r>
+      <w:r>
+        <w:rPr>
+          <w:rFonts w:ascii="Times New Roman" w:hAnsi="Times New Roman" w:cs="Times New Roman"/>
+          <w:color w:val="auto"/>
+          <w:lang w:val="en-US"/>
+        </w:rPr>
+        <w:t xml:space="preserve"> (</w:t>
+      </w:r>
+      <w:r>
+        <w:rPr>
+          <w:rFonts w:ascii="Times New Roman" w:hAnsi="Times New Roman" w:cs="Times New Roman"/>
+          <w:i/>
+          <w:color w:val="auto"/>
+          <w:lang w:val="en-US"/>
+        </w:rPr>
+        <w:t>community detection</w:t>
+      </w:r>
+      <w:r>
+        <w:rPr>
+          <w:rFonts w:ascii="Times New Roman" w:hAnsi="Times New Roman" w:cs="Times New Roman"/>
+          <w:color w:val="auto"/>
+          <w:lang w:val="en-US"/>
+        </w:rPr>
+        <w:t>)</w:t>
+      </w:r>
+    </w:p>
+    <w:p>
+      <w:pPr>
+        <w:pStyle w:val="Titolo1"/>
+        <w:keepNext/>
+        <w:rPr>
+          <w:rFonts w:ascii="Times New Roman" w:hAnsi="Times New Roman" w:cs="Times New Roman"/>
+          <w:color w:val="auto"/>
+          <w:lang w:val="en-US"/>
+        </w:rPr>
+      </w:pPr>
+      <w:r>
+        <w:rPr>
+          <w:rFonts w:ascii="Times New Roman" w:hAnsi="Times New Roman" w:cs="Times New Roman"/>
+          <w:color w:val="auto"/>
+          <w:lang w:val="en-US"/>
+        </w:rPr>
+        <w:lastRenderedPageBreak/>
+        <w:t xml:space="preserve">5. Text mining e </w:t>
+      </w:r>
+      <w:r>
+        <w:rPr>
+          <w:rFonts w:ascii="Times New Roman" w:hAnsi="Times New Roman" w:cs="Times New Roman"/>
+          <w:i/>
+          <w:color w:val="auto"/>
+          <w:lang w:val="en-US"/>
+        </w:rPr>
+        <w:t>topic modeling</w:t>
+      </w:r>
+    </w:p>
+    <w:p>
+      <w:pPr>
+        <w:spacing w:after="120" w:line="300" w:lineRule="auto"/>
+        <w:jc w:val="both"/>
+        <w:rPr>
+          <w:rFonts w:ascii="Times New Roman" w:hAnsi="Times New Roman" w:cs="Times New Roman"/>
+          <w:color w:val="auto"/>
+        </w:rPr>
+      </w:pPr>
+      <w:r>
+        <w:rPr>
+          <w:rFonts w:ascii="Times New Roman" w:hAnsi="Times New Roman" w:cs="Times New Roman"/>
+          <w:color w:val="auto"/>
+        </w:rPr>
+        <w:t xml:space="preserve">Attraverso il </w:t>
+      </w:r>
+      <w:r>
+        <w:rPr>
+          <w:rFonts w:ascii="Times New Roman" w:hAnsi="Times New Roman" w:cs="Times New Roman"/>
+          <w:i/>
+          <w:color w:val="auto"/>
+        </w:rPr>
+        <w:t>Natural Language Processing</w:t>
+      </w:r>
+      <w:r>
+        <w:rPr>
+          <w:rFonts w:ascii="Times New Roman" w:hAnsi="Times New Roman" w:cs="Times New Roman"/>
+          <w:color w:val="auto"/>
+        </w:rPr>
+        <w:t xml:space="preserve"> i testi delle recensioni sono trasformati in r</w:t>
+      </w:r>
+      <w:r>
+        <w:rPr>
+          <w:rFonts w:ascii="Times New Roman" w:hAnsi="Times New Roman" w:cs="Times New Roman"/>
+          <w:i/>
+          <w:color w:val="auto"/>
+        </w:rPr>
+        <w:t>app</w:t>
+      </w:r>
+      <w:r>
+        <w:rPr>
+          <w:rFonts w:ascii="Times New Roman" w:hAnsi="Times New Roman" w:cs="Times New Roman"/>
+          <w:color w:val="auto"/>
+        </w:rPr>
+        <w:t>resentazioni numeriche.</w:t>
+      </w:r>
+    </w:p>
+    <w:p>
+      <w:pPr>
+        <w:pStyle w:val="Titolo2"/>
+        <w:keepNext/>
+        <w:rPr>
+          <w:rFonts w:ascii="Times New Roman" w:hAnsi="Times New Roman" w:cs="Times New Roman"/>
+          <w:color w:val="auto"/>
+        </w:rPr>
+      </w:pPr>
+      <w:r>
+        <w:rPr>
+          <w:rFonts w:ascii="Times New Roman" w:hAnsi="Times New Roman" w:cs="Times New Roman"/>
+          <w:color w:val="auto"/>
+        </w:rPr>
+        <w:t xml:space="preserve">5.1 </w:t>
+      </w:r>
+      <w:r>
+        <w:rPr>
+          <w:rFonts w:ascii="Times New Roman" w:hAnsi="Times New Roman" w:cs="Times New Roman"/>
+          <w:i/>
+          <w:color w:val="auto"/>
+        </w:rPr>
+        <w:t>TF-IDF</w:t>
+      </w:r>
+    </w:p>
+    <w:p>
+      <w:pPr>
+        <w:spacing w:after="120" w:line="300" w:lineRule="auto"/>
+        <w:jc w:val="both"/>
+        <w:rPr>
+          <w:rFonts w:ascii="Times New Roman" w:hAnsi="Times New Roman" w:cs="Times New Roman"/>
+          <w:color w:val="auto"/>
+        </w:rPr>
+      </w:pPr>
+      <w:r>
+        <w:rPr>
+          <w:rFonts w:ascii="Times New Roman" w:hAnsi="Times New Roman" w:cs="Times New Roman"/>
+          <w:color w:val="auto"/>
+        </w:rPr>
+        <w:t xml:space="preserve">La metrica </w:t>
+      </w:r>
+      <w:r>
+        <w:rPr>
+          <w:rFonts w:ascii="Times New Roman" w:hAnsi="Times New Roman" w:cs="Times New Roman"/>
+          <w:i/>
+          <w:color w:val="auto"/>
+        </w:rPr>
+        <w:t>TF-IDF</w:t>
+      </w:r>
+      <w:r>
+        <w:rPr>
+          <w:rFonts w:ascii="Times New Roman" w:hAnsi="Times New Roman" w:cs="Times New Roman"/>
+          <w:color w:val="auto"/>
+        </w:rPr>
+        <w:t xml:space="preserve"> converte il testo in matrici numeriche sparse e misura l'importanza di un termine t in un documento </w:t>
+      </w:r>
+      <w:proofErr w:type="gramStart"/>
+      <w:r>
+        <w:rPr>
+          <w:rFonts w:ascii="Times New Roman" w:hAnsi="Times New Roman" w:cs="Times New Roman"/>
+          <w:color w:val="auto"/>
+        </w:rPr>
+        <w:t>d all'interno</w:t>
+      </w:r>
+      <w:proofErr w:type="gramEnd"/>
+      <w:r>
+        <w:rPr>
+          <w:rFonts w:ascii="Times New Roman" w:hAnsi="Times New Roman" w:cs="Times New Roman"/>
+          <w:color w:val="auto"/>
+        </w:rPr>
+        <w:t xml:space="preserve"> di un corpus D:</w:t>
+      </w:r>
+    </w:p>
+    <w:p>
+      <w:pPr>
+        <w:shd w:val="clear" w:color="auto" w:fill="F3F3F6"/>
+        <w:spacing w:before="120" w:after="160"/>
+        <w:jc w:val="center"/>
+        <w:rPr>
+          <w:rFonts w:ascii="Times New Roman" w:hAnsi="Times New Roman" w:cs="Times New Roman"/>
+          <w:color w:val="auto"/>
+        </w:rPr>
+      </w:pPr>
+      <w:proofErr w:type="gramStart"/>
+      <w:r>
+        <w:rPr>
+          <w:rFonts w:ascii="Times New Roman" w:eastAsia="Cambria" w:hAnsi="Times New Roman" w:cs="Times New Roman"/>
+          <w:i/>
+          <w:iCs/>
+          <w:color w:val="auto"/>
+          <w:sz w:val="24"/>
+          <w:szCs w:val="24"/>
+        </w:rPr>
+        <w:t>TFIDF(</w:t>
+      </w:r>
+      <w:proofErr w:type="gramEnd"/>
+      <w:r>
+        <w:rPr>
+          <w:rFonts w:ascii="Times New Roman" w:eastAsia="Cambria" w:hAnsi="Times New Roman" w:cs="Times New Roman"/>
+          <w:i/>
+          <w:iCs/>
+          <w:color w:val="auto"/>
+          <w:sz w:val="24"/>
+          <w:szCs w:val="24"/>
+        </w:rPr>
+        <w:t xml:space="preserve">t, d, D) = </w:t>
+      </w:r>
+      <w:proofErr w:type="gramStart"/>
+      <w:r>
+        <w:rPr>
+          <w:rFonts w:ascii="Times New Roman" w:eastAsia="Cambria" w:hAnsi="Times New Roman" w:cs="Times New Roman"/>
+          <w:i/>
+          <w:iCs/>
+          <w:color w:val="auto"/>
+          <w:sz w:val="24"/>
+          <w:szCs w:val="24"/>
+        </w:rPr>
+        <w:t>TF(</w:t>
+      </w:r>
+      <w:proofErr w:type="gramEnd"/>
+      <w:r>
+        <w:rPr>
+          <w:rFonts w:ascii="Times New Roman" w:eastAsia="Cambria" w:hAnsi="Times New Roman" w:cs="Times New Roman"/>
+          <w:i/>
+          <w:iCs/>
+          <w:color w:val="auto"/>
+          <w:sz w:val="24"/>
+          <w:szCs w:val="24"/>
+        </w:rPr>
+        <w:t xml:space="preserve">t, d) × </w:t>
+      </w:r>
+      <w:proofErr w:type="gramStart"/>
+      <w:r>
+        <w:rPr>
+          <w:rFonts w:ascii="Times New Roman" w:eastAsia="Cambria" w:hAnsi="Times New Roman" w:cs="Times New Roman"/>
+          <w:i/>
+          <w:iCs/>
+          <w:color w:val="auto"/>
+          <w:sz w:val="24"/>
+          <w:szCs w:val="24"/>
+        </w:rPr>
+        <w:t>log( |</w:t>
+      </w:r>
+      <w:proofErr w:type="gramEnd"/>
+      <w:r>
+        <w:rPr>
+          <w:rFonts w:ascii="Times New Roman" w:eastAsia="Cambria" w:hAnsi="Times New Roman" w:cs="Times New Roman"/>
+          <w:i/>
+          <w:iCs/>
+          <w:color w:val="auto"/>
+          <w:sz w:val="24"/>
+          <w:szCs w:val="24"/>
+        </w:rPr>
+        <w:t xml:space="preserve">D| / (1 + </w:t>
+      </w:r>
+      <w:proofErr w:type="gramStart"/>
+      <w:r>
+        <w:rPr>
+          <w:rFonts w:ascii="Times New Roman" w:eastAsia="Cambria" w:hAnsi="Times New Roman" w:cs="Times New Roman"/>
+          <w:i/>
+          <w:iCs/>
+          <w:color w:val="auto"/>
+          <w:sz w:val="24"/>
+          <w:szCs w:val="24"/>
+        </w:rPr>
+        <w:t>DF(</w:t>
+      </w:r>
+      <w:proofErr w:type="gramEnd"/>
+      <w:r>
+        <w:rPr>
+          <w:rFonts w:ascii="Times New Roman" w:eastAsia="Cambria" w:hAnsi="Times New Roman" w:cs="Times New Roman"/>
+          <w:i/>
+          <w:iCs/>
+          <w:color w:val="auto"/>
+          <w:sz w:val="24"/>
+          <w:szCs w:val="24"/>
+        </w:rPr>
+        <w:t>t, D)</w:t>
+      </w:r>
+      <w:proofErr w:type="gramStart"/>
+      <w:r>
+        <w:rPr>
+          <w:rFonts w:ascii="Times New Roman" w:eastAsia="Cambria" w:hAnsi="Times New Roman" w:cs="Times New Roman"/>
+          <w:i/>
+          <w:iCs/>
+          <w:color w:val="auto"/>
+          <w:sz w:val="24"/>
+          <w:szCs w:val="24"/>
+        </w:rPr>
+        <w:t>) )</w:t>
+      </w:r>
+      <w:proofErr w:type="gramEnd"/>
+    </w:p>
+    <w:p>
+      <w:pPr>
+        <w:pStyle w:val="Titolo2"/>
+        <w:keepNext/>
+        <w:rPr>
+          <w:rFonts w:ascii="Times New Roman" w:hAnsi="Times New Roman" w:cs="Times New Roman"/>
+          <w:color w:val="auto"/>
+        </w:rPr>
+      </w:pPr>
+      <w:r>
+        <w:rPr>
+          <w:rFonts w:ascii="Times New Roman" w:hAnsi="Times New Roman" w:cs="Times New Roman"/>
+          <w:color w:val="auto"/>
+        </w:rPr>
+        <w:t>5.2 Classificazione del sentiment</w:t>
+      </w:r>
+    </w:p>
+    <w:p>
+      <w:pPr>
+        <w:spacing w:after="120" w:line="300" w:lineRule="auto"/>
+        <w:jc w:val="both"/>
+        <w:rPr>
+          <w:rFonts w:ascii="Times New Roman" w:hAnsi="Times New Roman" w:cs="Times New Roman"/>
+          <w:color w:val="auto"/>
+        </w:rPr>
+      </w:pPr>
+      <w:r>
+        <w:rPr>
+          <w:rFonts w:ascii="Times New Roman" w:hAnsi="Times New Roman" w:cs="Times New Roman"/>
+          <w:color w:val="auto"/>
+        </w:rPr>
+        <w:t xml:space="preserve">Una </w:t>
+      </w:r>
+      <w:proofErr w:type="spellStart"/>
+      <w:r>
+        <w:rPr>
+          <w:rFonts w:ascii="Times New Roman" w:hAnsi="Times New Roman" w:cs="Times New Roman"/>
+          <w:i/>
+          <w:color w:val="auto"/>
+        </w:rPr>
+        <w:t>Logistic</w:t>
+      </w:r>
+      <w:proofErr w:type="spellEnd"/>
+      <w:r>
+        <w:rPr>
+          <w:rFonts w:ascii="Times New Roman" w:hAnsi="Times New Roman" w:cs="Times New Roman"/>
+          <w:i/>
+          <w:color w:val="auto"/>
+        </w:rPr>
+        <w:t xml:space="preserve"> </w:t>
+      </w:r>
+      <w:proofErr w:type="spellStart"/>
+      <w:r>
+        <w:rPr>
+          <w:rFonts w:ascii="Times New Roman" w:hAnsi="Times New Roman" w:cs="Times New Roman"/>
+          <w:i/>
+          <w:color w:val="auto"/>
+        </w:rPr>
+        <w:t>Regression</w:t>
+      </w:r>
+      <w:proofErr w:type="spellEnd"/>
+      <w:r>
+        <w:rPr>
+          <w:rFonts w:ascii="Times New Roman" w:hAnsi="Times New Roman" w:cs="Times New Roman"/>
+          <w:color w:val="auto"/>
+        </w:rPr>
+        <w:t xml:space="preserve"> addestrata sulla matrice </w:t>
+      </w:r>
+      <w:r>
+        <w:rPr>
+          <w:rFonts w:ascii="Times New Roman" w:hAnsi="Times New Roman" w:cs="Times New Roman"/>
+          <w:i/>
+          <w:color w:val="auto"/>
+        </w:rPr>
+        <w:t>TF-IDF</w:t>
+      </w:r>
+      <w:r>
+        <w:rPr>
+          <w:rFonts w:ascii="Times New Roman" w:hAnsi="Times New Roman" w:cs="Times New Roman"/>
+          <w:color w:val="auto"/>
+        </w:rPr>
+        <w:t xml:space="preserve"> classifica il testo inserito dall'utente come positivo o negativo in tempo reale. Come modello di confronto è stato usato un </w:t>
+      </w:r>
+      <w:proofErr w:type="spellStart"/>
+      <w:r>
+        <w:rPr>
+          <w:rFonts w:ascii="Times New Roman" w:hAnsi="Times New Roman" w:cs="Times New Roman"/>
+          <w:i/>
+          <w:color w:val="auto"/>
+        </w:rPr>
+        <w:t>Multinomial</w:t>
+      </w:r>
+      <w:proofErr w:type="spellEnd"/>
+      <w:r>
+        <w:rPr>
+          <w:rFonts w:ascii="Times New Roman" w:hAnsi="Times New Roman" w:cs="Times New Roman"/>
+          <w:i/>
+          <w:color w:val="auto"/>
+        </w:rPr>
+        <w:t xml:space="preserve"> </w:t>
+      </w:r>
+      <w:proofErr w:type="spellStart"/>
+      <w:r>
+        <w:rPr>
+          <w:rFonts w:ascii="Times New Roman" w:hAnsi="Times New Roman" w:cs="Times New Roman"/>
+          <w:i/>
+          <w:color w:val="auto"/>
+        </w:rPr>
+        <w:t>Naive</w:t>
+      </w:r>
+      <w:proofErr w:type="spellEnd"/>
+      <w:r>
+        <w:rPr>
+          <w:rFonts w:ascii="Times New Roman" w:hAnsi="Times New Roman" w:cs="Times New Roman"/>
+          <w:i/>
+          <w:color w:val="auto"/>
+        </w:rPr>
+        <w:t xml:space="preserve"> Bayes</w:t>
+      </w:r>
+      <w:r>
+        <w:rPr>
+          <w:rFonts w:ascii="Times New Roman" w:hAnsi="Times New Roman" w:cs="Times New Roman"/>
+          <w:color w:val="auto"/>
+        </w:rPr>
+        <w:t>. Per gestire lo s</w:t>
+      </w:r>
+      <w:r>
+        <w:rPr>
+          <w:rFonts w:ascii="Times New Roman" w:hAnsi="Times New Roman" w:cs="Times New Roman"/>
+          <w:i/>
+          <w:color w:val="auto"/>
+        </w:rPr>
+        <w:t>bi</w:t>
+      </w:r>
+      <w:r>
+        <w:rPr>
+          <w:rFonts w:ascii="Times New Roman" w:hAnsi="Times New Roman" w:cs="Times New Roman"/>
+          <w:color w:val="auto"/>
+        </w:rPr>
+        <w:t>lanciamento delle classi e valutare l'equilibrio tra falsi positivi e falsi negativi, la validazione si è basata sull'</w:t>
+      </w:r>
+      <w:r>
+        <w:rPr>
+          <w:rFonts w:ascii="Times New Roman" w:hAnsi="Times New Roman" w:cs="Times New Roman"/>
+          <w:i/>
+          <w:color w:val="auto"/>
+        </w:rPr>
+        <w:t>F1-score</w:t>
+      </w:r>
+      <w:r>
+        <w:rPr>
+          <w:rFonts w:ascii="Times New Roman" w:hAnsi="Times New Roman" w:cs="Times New Roman"/>
+          <w:color w:val="auto"/>
+        </w:rPr>
+        <w:t>:</w:t>
+      </w:r>
+    </w:p>
+    <w:p>
+      <w:pPr>
+        <w:shd w:val="clear" w:color="auto" w:fill="F3F3F6"/>
+        <w:spacing w:before="120" w:after="160"/>
+        <w:jc w:val="center"/>
+        <w:rPr>
+          <w:rFonts w:ascii="Times New Roman" w:hAnsi="Times New Roman" w:cs="Times New Roman"/>
+          <w:color w:val="auto"/>
+          <w:lang w:val="en-US"/>
+        </w:rPr>
+      </w:pPr>
+      <w:r>
+        <w:rPr>
+          <w:rFonts w:ascii="Times New Roman" w:hAnsi="Times New Roman" w:cs="Times New Roman"/>
+          <w:color w:val="auto"/>
+          <w:lang w:val="en-US"/>
+        </w:rPr>
+        <w:t>F1 = 2 × (</w:t>
+      </w:r>
+      <w:r>
+        <w:rPr>
+          <w:rFonts w:ascii="Times New Roman" w:hAnsi="Times New Roman" w:cs="Times New Roman"/>
+          <w:i/>
+          <w:color w:val="auto"/>
+          <w:lang w:val="en-US"/>
+        </w:rPr>
+        <w:t>Precision</w:t>
+      </w:r>
+      <w:r>
+        <w:rPr>
+          <w:rFonts w:ascii="Times New Roman" w:hAnsi="Times New Roman" w:cs="Times New Roman"/>
+          <w:color w:val="auto"/>
+          <w:lang w:val="en-US"/>
+        </w:rPr>
+        <w:t xml:space="preserve"> × </w:t>
+      </w:r>
+      <w:r>
+        <w:rPr>
+          <w:rFonts w:ascii="Times New Roman" w:hAnsi="Times New Roman" w:cs="Times New Roman"/>
+          <w:i/>
+          <w:color w:val="auto"/>
+          <w:lang w:val="en-US"/>
+        </w:rPr>
+        <w:t>Recall</w:t>
+      </w:r>
+      <w:r>
+        <w:rPr>
+          <w:rFonts w:ascii="Times New Roman" w:hAnsi="Times New Roman" w:cs="Times New Roman"/>
+          <w:color w:val="auto"/>
+          <w:lang w:val="en-US"/>
+        </w:rPr>
+        <w:t>) / (</w:t>
+      </w:r>
+      <w:r>
+        <w:rPr>
+          <w:rFonts w:ascii="Times New Roman" w:hAnsi="Times New Roman" w:cs="Times New Roman"/>
+          <w:i/>
+          <w:color w:val="auto"/>
+          <w:lang w:val="en-US"/>
+        </w:rPr>
+        <w:t>Precision</w:t>
+      </w:r>
+      <w:r>
+        <w:rPr>
+          <w:rFonts w:ascii="Times New Roman" w:hAnsi="Times New Roman" w:cs="Times New Roman"/>
+          <w:color w:val="auto"/>
+          <w:lang w:val="en-US"/>
+        </w:rPr>
+        <w:t xml:space="preserve"> + </w:t>
+      </w:r>
+      <w:r>
+        <w:rPr>
+          <w:rFonts w:ascii="Times New Roman" w:hAnsi="Times New Roman" w:cs="Times New Roman"/>
+          <w:i/>
+          <w:color w:val="auto"/>
+          <w:lang w:val="en-US"/>
+        </w:rPr>
+        <w:t>Recall</w:t>
+      </w:r>
+      <w:r>
+        <w:rPr>
+          <w:rFonts w:ascii="Times New Roman" w:hAnsi="Times New Roman" w:cs="Times New Roman"/>
+          <w:color w:val="auto"/>
+          <w:lang w:val="en-US"/>
+        </w:rPr>
+        <w:t>)</w:t>
+      </w:r>
+    </w:p>
+    <w:p>
+      <w:pPr>
+        <w:spacing w:after="120" w:line="300" w:lineRule="auto"/>
+        <w:jc w:val="both"/>
+        <w:rPr>
+          <w:rFonts w:ascii="Times New Roman" w:hAnsi="Times New Roman" w:cs="Times New Roman"/>
+          <w:color w:val="auto"/>
+        </w:rPr>
+      </w:pPr>
+      <w:r>
+        <w:rPr>
+          <w:rFonts w:ascii="Times New Roman" w:hAnsi="Times New Roman" w:cs="Times New Roman"/>
+          <w:color w:val="auto"/>
+        </w:rPr>
+        <w:t xml:space="preserve">Il modello raggiunge un F1 di circa 0,97 con </w:t>
+      </w:r>
+      <w:r>
+        <w:rPr>
+          <w:rFonts w:ascii="Times New Roman" w:hAnsi="Times New Roman" w:cs="Times New Roman"/>
+          <w:i/>
+          <w:color w:val="auto"/>
+        </w:rPr>
+        <w:t>AUC</w:t>
+      </w:r>
+      <w:r>
+        <w:rPr>
+          <w:rFonts w:ascii="Times New Roman" w:hAnsi="Times New Roman" w:cs="Times New Roman"/>
+          <w:color w:val="auto"/>
+        </w:rPr>
+        <w:t xml:space="preserve"> pari a 0,985.</w:t>
+      </w:r>
+    </w:p>
+    <w:p>
+      <w:pPr>
+        <w:pStyle w:val="Titolo2"/>
+        <w:keepNext/>
+        <w:rPr>
+          <w:rFonts w:ascii="Times New Roman" w:hAnsi="Times New Roman" w:cs="Times New Roman"/>
+          <w:color w:val="auto"/>
+        </w:rPr>
+      </w:pPr>
+      <w:r>
+        <w:rPr>
+          <w:rFonts w:ascii="Times New Roman" w:hAnsi="Times New Roman" w:cs="Times New Roman"/>
+          <w:color w:val="auto"/>
+        </w:rPr>
+        <w:t xml:space="preserve">5.3 </w:t>
+      </w:r>
+      <w:r>
+        <w:rPr>
+          <w:rFonts w:ascii="Times New Roman" w:hAnsi="Times New Roman" w:cs="Times New Roman"/>
+          <w:i/>
+          <w:color w:val="auto"/>
+        </w:rPr>
+        <w:t xml:space="preserve">Topic </w:t>
+      </w:r>
+      <w:proofErr w:type="spellStart"/>
+      <w:r>
+        <w:rPr>
+          <w:rFonts w:ascii="Times New Roman" w:hAnsi="Times New Roman" w:cs="Times New Roman"/>
+          <w:i/>
+          <w:color w:val="auto"/>
+        </w:rPr>
+        <w:t>modeling</w:t>
+      </w:r>
+      <w:proofErr w:type="spellEnd"/>
+      <w:r>
+        <w:rPr>
+          <w:rFonts w:ascii="Times New Roman" w:hAnsi="Times New Roman" w:cs="Times New Roman"/>
+          <w:color w:val="auto"/>
+        </w:rPr>
+        <w:t xml:space="preserve"> (LDA)</w:t>
+      </w:r>
+    </w:p>
+    <w:p>
+      <w:pPr>
+        <w:spacing w:after="120" w:line="300" w:lineRule="auto"/>
+        <w:jc w:val="both"/>
+        <w:rPr>
+          <w:rFonts w:ascii="Times New Roman" w:hAnsi="Times New Roman" w:cs="Times New Roman"/>
+          <w:color w:val="auto"/>
+        </w:rPr>
+      </w:pPr>
+      <w:r>
+        <w:rPr>
+          <w:rFonts w:ascii="Times New Roman" w:hAnsi="Times New Roman" w:cs="Times New Roman"/>
+          <w:color w:val="auto"/>
+        </w:rPr>
+        <w:t xml:space="preserve">La </w:t>
+      </w:r>
+      <w:proofErr w:type="spellStart"/>
+      <w:r>
+        <w:rPr>
+          <w:rFonts w:ascii="Times New Roman" w:hAnsi="Times New Roman" w:cs="Times New Roman"/>
+          <w:i/>
+          <w:color w:val="auto"/>
+        </w:rPr>
+        <w:t>Latent</w:t>
+      </w:r>
+      <w:proofErr w:type="spellEnd"/>
+      <w:r>
+        <w:rPr>
+          <w:rFonts w:ascii="Times New Roman" w:hAnsi="Times New Roman" w:cs="Times New Roman"/>
+          <w:i/>
+          <w:color w:val="auto"/>
+        </w:rPr>
+        <w:t xml:space="preserve"> </w:t>
+      </w:r>
+      <w:proofErr w:type="spellStart"/>
+      <w:r>
+        <w:rPr>
+          <w:rFonts w:ascii="Times New Roman" w:hAnsi="Times New Roman" w:cs="Times New Roman"/>
+          <w:i/>
+          <w:color w:val="auto"/>
+        </w:rPr>
+        <w:t>Dirichlet</w:t>
+      </w:r>
+      <w:proofErr w:type="spellEnd"/>
+      <w:r>
+        <w:rPr>
+          <w:rFonts w:ascii="Times New Roman" w:hAnsi="Times New Roman" w:cs="Times New Roman"/>
+          <w:i/>
+          <w:color w:val="auto"/>
+        </w:rPr>
+        <w:t xml:space="preserve"> </w:t>
+      </w:r>
+      <w:proofErr w:type="spellStart"/>
+      <w:r>
+        <w:rPr>
+          <w:rFonts w:ascii="Times New Roman" w:hAnsi="Times New Roman" w:cs="Times New Roman"/>
+          <w:i/>
+          <w:color w:val="auto"/>
+        </w:rPr>
+        <w:t>Allocation</w:t>
+      </w:r>
+      <w:proofErr w:type="spellEnd"/>
+      <w:r>
+        <w:rPr>
+          <w:rFonts w:ascii="Times New Roman" w:hAnsi="Times New Roman" w:cs="Times New Roman"/>
+          <w:color w:val="auto"/>
+        </w:rPr>
+        <w:t xml:space="preserve"> raggruppa i concetti espressi dai clienti in cinque macro-temi: servizio, cibo, attese, prezzo e atmosfera. Com</w:t>
+      </w:r>
+      <w:r>
+        <w:rPr>
+          <w:rFonts w:ascii="Times New Roman" w:hAnsi="Times New Roman" w:cs="Times New Roman"/>
+          <w:i/>
+          <w:color w:val="auto"/>
+        </w:rPr>
+        <w:t>bi</w:t>
+      </w:r>
+      <w:r>
+        <w:rPr>
+          <w:rFonts w:ascii="Times New Roman" w:hAnsi="Times New Roman" w:cs="Times New Roman"/>
+          <w:color w:val="auto"/>
+        </w:rPr>
+        <w:t xml:space="preserve">nando i </w:t>
+      </w:r>
+      <w:proofErr w:type="spellStart"/>
+      <w:r>
+        <w:rPr>
+          <w:rFonts w:ascii="Times New Roman" w:hAnsi="Times New Roman" w:cs="Times New Roman"/>
+          <w:color w:val="auto"/>
+        </w:rPr>
+        <w:t>topic</w:t>
+      </w:r>
+      <w:proofErr w:type="spellEnd"/>
+      <w:r>
+        <w:rPr>
+          <w:rFonts w:ascii="Times New Roman" w:hAnsi="Times New Roman" w:cs="Times New Roman"/>
+          <w:color w:val="auto"/>
+        </w:rPr>
+        <w:t xml:space="preserve"> con i </w:t>
+      </w:r>
+      <w:r>
+        <w:rPr>
+          <w:rFonts w:ascii="Times New Roman" w:hAnsi="Times New Roman" w:cs="Times New Roman"/>
+          <w:i/>
+          <w:color w:val="auto"/>
+        </w:rPr>
+        <w:t>rating</w:t>
+      </w:r>
+      <w:r>
+        <w:rPr>
+          <w:rFonts w:ascii="Times New Roman" w:hAnsi="Times New Roman" w:cs="Times New Roman"/>
+          <w:color w:val="auto"/>
+        </w:rPr>
+        <w:t xml:space="preserve"> è possi</w:t>
+      </w:r>
+      <w:r>
+        <w:rPr>
+          <w:rFonts w:ascii="Times New Roman" w:hAnsi="Times New Roman" w:cs="Times New Roman"/>
+          <w:i/>
+          <w:color w:val="auto"/>
+        </w:rPr>
+        <w:t>bi</w:t>
+      </w:r>
+      <w:r>
+        <w:rPr>
+          <w:rFonts w:ascii="Times New Roman" w:hAnsi="Times New Roman" w:cs="Times New Roman"/>
+          <w:color w:val="auto"/>
+        </w:rPr>
+        <w:t xml:space="preserve">le capire perché un locale perde stelle e dove intervenire. Le </w:t>
+      </w:r>
+      <w:r>
+        <w:rPr>
+          <w:rFonts w:ascii="Times New Roman" w:hAnsi="Times New Roman" w:cs="Times New Roman"/>
+          <w:i/>
+          <w:color w:val="auto"/>
+        </w:rPr>
+        <w:t>word cloud</w:t>
+      </w:r>
+      <w:r>
+        <w:rPr>
+          <w:rFonts w:ascii="Times New Roman" w:hAnsi="Times New Roman" w:cs="Times New Roman"/>
+          <w:color w:val="auto"/>
+        </w:rPr>
+        <w:t xml:space="preserve"> mostrano un lessico positivo legato a cortesia e cibo e uno negativo legato ad attese e servizio freddo.</w:t>
       </w:r>
     </w:p>
     <w:p>
@@ -3098,12 +3982,11 @@
           <w:noProof/>
           <w:color w:val="auto"/>
         </w:rPr>
-        <w:lastRenderedPageBreak/>
         <w:drawing>
-          <wp:inline distT="0" distB="0" distL="0" distR="0" wp14:anchorId="672A2207" wp14:editId="566851B0">
-            <wp:extent cx="4762500" cy="2409825"/>
+          <wp:inline distT="0" distB="0" distL="0" distR="0" wp14:anchorId="5404BFB6" wp14:editId="553B8354">
+            <wp:extent cx="4953000" cy="1752600"/>
             <wp:effectExtent l="0" t="0" r="0" b="0"/>
-            <wp:docPr id="1962413010" name="Dashboard sentiment e LDA" descr="Dashboard sentiment e LDA" title="Dashboard sentiment e LDA"/>
+            <wp:docPr id="371144293" name="Word cloud recensioni positive e negative" descr="Word cloud recensioni positive e negative" title="Word cloud recensioni positive e negative"/>
             <wp:cNvGraphicFramePr>
               <a:graphicFrameLocks xmlns:a="http://schemas.openxmlformats.org/drawingml/2006/main" noChangeAspect="1"/>
             </wp:cNvGraphicFramePr>
@@ -3126,6 +4009,95 @@
                   <pic:spPr bwMode="auto">
                     <a:xfrm>
                       <a:off x="0" y="0"/>
+                      <a:ext cx="4953000" cy="1752600"/>
+                    </a:xfrm>
+                    <a:prstGeom prst="rect">
+                      <a:avLst/>
+                    </a:prstGeom>
+                  </pic:spPr>
+                </pic:pic>
+              </a:graphicData>
+            </a:graphic>
+          </wp:inline>
+        </w:drawing>
+      </w:r>
+    </w:p>
+    <w:p>
+      <w:pPr>
+        <w:spacing w:before="60" w:after="240"/>
+        <w:jc w:val="center"/>
+        <w:rPr>
+          <w:rFonts w:ascii="Times New Roman" w:hAnsi="Times New Roman" w:cs="Times New Roman"/>
+          <w:color w:val="auto"/>
+        </w:rPr>
+      </w:pPr>
+      <w:r>
+        <w:rPr>
+          <w:rFonts w:ascii="Times New Roman" w:hAnsi="Times New Roman" w:cs="Times New Roman"/>
+          <w:color w:val="auto"/>
+        </w:rPr>
+        <w:t xml:space="preserve">Figura 4 - </w:t>
+      </w:r>
+      <w:r>
+        <w:rPr>
+          <w:rFonts w:ascii="Times New Roman" w:hAnsi="Times New Roman" w:cs="Times New Roman"/>
+          <w:i/>
+          <w:color w:val="auto"/>
+        </w:rPr>
+        <w:t>Word cloud</w:t>
+      </w:r>
+      <w:r>
+        <w:rPr>
+          <w:rFonts w:ascii="Times New Roman" w:hAnsi="Times New Roman" w:cs="Times New Roman"/>
+          <w:color w:val="auto"/>
+        </w:rPr>
+        <w:t xml:space="preserve"> delle recensioni positive e negative</w:t>
+      </w:r>
+    </w:p>
+    <w:p>
+      <w:pPr>
+        <w:keepNext/>
+        <w:spacing w:before="120"/>
+        <w:jc w:val="center"/>
+        <w:rPr>
+          <w:rFonts w:ascii="Times New Roman" w:hAnsi="Times New Roman" w:cs="Times New Roman"/>
+          <w:color w:val="auto"/>
+        </w:rPr>
+      </w:pPr>
+      <w:r>
+        <w:rPr>
+          <w:rFonts w:ascii="Times New Roman" w:hAnsi="Times New Roman" w:cs="Times New Roman"/>
+          <w:noProof/>
+          <w:color w:val="auto"/>
+        </w:rPr>
+        <w:lastRenderedPageBreak/>
+        <w:drawing>
+          <wp:inline distT="0" distB="0" distL="0" distR="0" wp14:anchorId="672A2207" wp14:editId="566851B0">
+            <wp:extent cx="4762500" cy="2409825"/>
+            <wp:effectExtent l="0" t="0" r="0" b="0"/>
+            <wp:docPr id="1962413010" name="Dashboard sentiment e LDA" descr="Dashboard sentiment e LDA" title="Dashboard sentiment e LDA"/>
+            <wp:cNvGraphicFramePr>
+              <a:graphicFrameLocks xmlns:a="http://schemas.openxmlformats.org/drawingml/2006/main" noChangeAspect="1"/>
+            </wp:cNvGraphicFramePr>
+            <a:graphic xmlns:a="http://schemas.openxmlformats.org/drawingml/2006/main">
+              <a:graphicData uri="http://schemas.openxmlformats.org/drawingml/2006/picture">
+                <pic:pic xmlns:pic="http://schemas.openxmlformats.org/drawingml/2006/picture">
+                  <pic:nvPicPr>
+                    <pic:cNvPr id="0" name=""/>
+                    <pic:cNvPicPr>
+                      <a:picLocks noChangeAspect="1" noChangeArrowheads="1"/>
+                    </pic:cNvPicPr>
+                  </pic:nvPicPr>
+                  <pic:blipFill>
+                    <a:blip r:embed="rId13"/>
+                    <a:srcRect/>
+                    <a:stretch>
+                      <a:fillRect/>
+                    </a:stretch>
+                  </pic:blipFill>
+                  <pic:spPr bwMode="auto">
+                    <a:xfrm>
+                      <a:off x="0" y="0"/>
                       <a:ext cx="4762500" cy="2409825"/>
                     </a:xfrm>
                     <a:prstGeom prst="rect">
@@ -3149,21 +4121,31 @@
           <w:lang w:val="en-US"/>
         </w:rPr>
       </w:pPr>
+      <w:proofErr w:type="spellStart"/>
       <w:r>
         <w:rPr>
           <w:rFonts w:ascii="Times New Roman" w:hAnsi="Times New Roman" w:cs="Times New Roman"/>
           <w:color w:val="auto"/>
           <w:lang w:val="en-US"/>
         </w:rPr>
-        <w:t xml:space="preserve">Figura 5 - </w:t>
-      </w:r>
-      <w:r>
-        <w:rPr>
-          <w:rFonts w:ascii="Times New Roman" w:hAnsi="Times New Roman" w:cs="Times New Roman"/>
-          <w:i/>
+        <w:t>Figura</w:t>
+      </w:r>
+      <w:proofErr w:type="spellEnd"/>
+      <w:r>
+        <w:rPr>
+          <w:rFonts w:ascii="Times New Roman" w:hAnsi="Times New Roman" w:cs="Times New Roman"/>
           <w:color w:val="auto"/>
           <w:lang w:val="en-US"/>
         </w:rPr>
+        <w:t xml:space="preserve"> 5 - </w:t>
+      </w:r>
+      <w:r>
+        <w:rPr>
+          <w:rFonts w:ascii="Times New Roman" w:hAnsi="Times New Roman" w:cs="Times New Roman"/>
+          <w:i/>
+          <w:color w:val="auto"/>
+          <w:lang w:val="en-US"/>
+        </w:rPr>
         <w:t>Dashboard</w:t>
       </w:r>
       <w:r>
@@ -3174,6 +4156,7 @@
         </w:rPr>
         <w:t xml:space="preserve"> </w:t>
       </w:r>
+      <w:proofErr w:type="spellStart"/>
       <w:r>
         <w:rPr>
           <w:rFonts w:ascii="Times New Roman" w:hAnsi="Times New Roman" w:cs="Times New Roman"/>
@@ -3183,6 +4166,7 @@
         </w:rPr>
         <w:t>Streamlit</w:t>
       </w:r>
+      <w:proofErr w:type="spellEnd"/>
       <w:r>
         <w:rPr>
           <w:rFonts w:ascii="Times New Roman" w:hAnsi="Times New Roman" w:cs="Times New Roman"/>
@@ -3290,8 +4274,18 @@
           <w:i/>
           <w:color w:val="auto"/>
         </w:rPr>
-        <w:t>Cosine Similarity</w:t>
-      </w:r>
+        <w:t xml:space="preserve">Cosine </w:t>
+      </w:r>
+      <w:proofErr w:type="spellStart"/>
+      <w:r>
+        <w:rPr>
+          <w:rFonts w:ascii="Times New Roman" w:hAnsi="Times New Roman" w:cs="Times New Roman"/>
+          <w:i/>
+          <w:color w:val="auto"/>
+        </w:rPr>
+        <w:t>Similarity</w:t>
+      </w:r>
+      <w:proofErr w:type="spellEnd"/>
       <w:r>
         <w:rPr>
           <w:rFonts w:ascii="Times New Roman" w:hAnsi="Times New Roman" w:cs="Times New Roman"/>
@@ -3310,6 +4304,8 @@
           <w:color w:val="auto"/>
         </w:rPr>
       </w:pPr>
+      <w:proofErr w:type="spellStart"/>
+      <w:proofErr w:type="gramStart"/>
       <w:r>
         <w:rPr>
           <w:rFonts w:ascii="Times New Roman" w:eastAsia="Cambria" w:hAnsi="Times New Roman" w:cs="Times New Roman"/>
@@ -3319,7 +4315,31 @@
           <w:sz w:val="24"/>
           <w:szCs w:val="24"/>
         </w:rPr>
-        <w:t>sim(A, B) = cos(θ) = (A · B) / (‖A‖ ‖B‖)</w:t>
+        <w:t>sim</w:t>
+      </w:r>
+      <w:proofErr w:type="spellEnd"/>
+      <w:r>
+        <w:rPr>
+          <w:rFonts w:ascii="Times New Roman" w:eastAsia="Cambria" w:hAnsi="Times New Roman" w:cs="Times New Roman"/>
+          <w:i/>
+          <w:iCs/>
+          <w:color w:val="auto"/>
+          <w:sz w:val="24"/>
+          <w:szCs w:val="24"/>
+        </w:rPr>
+        <w:t>(</w:t>
+      </w:r>
+      <w:proofErr w:type="gramEnd"/>
+      <w:r>
+        <w:rPr>
+          <w:rFonts w:ascii="Times New Roman" w:eastAsia="Cambria" w:hAnsi="Times New Roman" w:cs="Times New Roman"/>
+          <w:i/>
+          <w:iCs/>
+          <w:color w:val="auto"/>
+          <w:sz w:val="24"/>
+          <w:szCs w:val="24"/>
+        </w:rPr>
+        <w:t>A, B) = cos(θ) = (A · B) / (‖A‖ ‖B‖)</w:t>
       </w:r>
     </w:p>
     <w:p>
@@ -3368,13 +4388,23 @@
         </w:rPr>
         <w:t xml:space="preserve">osizione diretta degli attributi, mentre il denominatore normalizza i vettori mitigando l'effetto della loro lunghezza. Il valore è compreso tra 0 e 1. Il metodo è immune al problema del </w:t>
       </w:r>
-      <w:r>
-        <w:rPr>
-          <w:rFonts w:ascii="Times New Roman" w:hAnsi="Times New Roman" w:cs="Times New Roman"/>
-          <w:i/>
-          <w:color w:val="auto"/>
-        </w:rPr>
-        <w:t>cold-start</w:t>
+      <w:proofErr w:type="spellStart"/>
+      <w:r>
+        <w:rPr>
+          <w:rFonts w:ascii="Times New Roman" w:hAnsi="Times New Roman" w:cs="Times New Roman"/>
+          <w:i/>
+          <w:color w:val="auto"/>
+        </w:rPr>
+        <w:t>cold</w:t>
+      </w:r>
+      <w:proofErr w:type="spellEnd"/>
+      <w:r>
+        <w:rPr>
+          <w:rFonts w:ascii="Times New Roman" w:hAnsi="Times New Roman" w:cs="Times New Roman"/>
+          <w:i/>
+          <w:color w:val="auto"/>
+        </w:rPr>
+        <w:t>-start</w:t>
       </w:r>
       <w:r>
         <w:rPr>
@@ -3415,13 +4445,23 @@
         </w:rPr>
         <w:t xml:space="preserve"> (</w:t>
       </w:r>
-      <w:r>
-        <w:rPr>
-          <w:rFonts w:ascii="Times New Roman" w:hAnsi="Times New Roman" w:cs="Times New Roman"/>
-          <w:i/>
-          <w:color w:val="auto"/>
-        </w:rPr>
-        <w:t>Truncated SVD</w:t>
+      <w:proofErr w:type="spellStart"/>
+      <w:r>
+        <w:rPr>
+          <w:rFonts w:ascii="Times New Roman" w:hAnsi="Times New Roman" w:cs="Times New Roman"/>
+          <w:i/>
+          <w:color w:val="auto"/>
+        </w:rPr>
+        <w:t>Truncated</w:t>
+      </w:r>
+      <w:proofErr w:type="spellEnd"/>
+      <w:r>
+        <w:rPr>
+          <w:rFonts w:ascii="Times New Roman" w:hAnsi="Times New Roman" w:cs="Times New Roman"/>
+          <w:i/>
+          <w:color w:val="auto"/>
+        </w:rPr>
+        <w:t xml:space="preserve"> SVD</w:t>
       </w:r>
       <w:r>
         <w:rPr>
@@ -3586,6 +4626,7 @@
         </w:rPr>
         <w:t xml:space="preserve">Con </w:t>
       </w:r>
+      <w:proofErr w:type="spellStart"/>
       <w:r>
         <w:rPr>
           <w:rFonts w:ascii="Times New Roman" w:hAnsi="Times New Roman" w:cs="Times New Roman"/>
@@ -3594,6 +4635,7 @@
         </w:rPr>
         <w:t>Keras</w:t>
       </w:r>
+      <w:proofErr w:type="spellEnd"/>
       <w:r>
         <w:rPr>
           <w:rFonts w:ascii="Times New Roman" w:hAnsi="Times New Roman" w:cs="Times New Roman"/>
@@ -3601,6 +4643,7 @@
         </w:rPr>
         <w:t xml:space="preserve"> si addestrano strati di </w:t>
       </w:r>
+      <w:proofErr w:type="spellStart"/>
       <w:r>
         <w:rPr>
           <w:rFonts w:ascii="Times New Roman" w:hAnsi="Times New Roman" w:cs="Times New Roman"/>
@@ -3609,6 +4652,7 @@
         </w:rPr>
         <w:t>embedding</w:t>
       </w:r>
+      <w:proofErr w:type="spellEnd"/>
       <w:r>
         <w:rPr>
           <w:rFonts w:ascii="Times New Roman" w:hAnsi="Times New Roman" w:cs="Times New Roman"/>
@@ -3670,7 +4714,39 @@
           <w:rFonts w:ascii="Times New Roman" w:hAnsi="Times New Roman" w:cs="Times New Roman"/>
           <w:color w:val="auto"/>
         </w:rPr>
-        <w:t xml:space="preserve"> = √( (1/n) Σ (yᵢ − ŷᵢ)² )</w:t>
+        <w:t xml:space="preserve"> = </w:t>
+      </w:r>
+      <w:proofErr w:type="gramStart"/>
+      <w:r>
+        <w:rPr>
+          <w:rFonts w:ascii="Times New Roman" w:hAnsi="Times New Roman" w:cs="Times New Roman"/>
+          <w:color w:val="auto"/>
+        </w:rPr>
+        <w:t>√( (</w:t>
+      </w:r>
+      <w:proofErr w:type="gramEnd"/>
+      <w:r>
+        <w:rPr>
+          <w:rFonts w:ascii="Times New Roman" w:hAnsi="Times New Roman" w:cs="Times New Roman"/>
+          <w:color w:val="auto"/>
+        </w:rPr>
+        <w:t xml:space="preserve">1/n) Σ (yᵢ − </w:t>
+      </w:r>
+      <w:proofErr w:type="gramStart"/>
+      <w:r>
+        <w:rPr>
+          <w:rFonts w:ascii="Times New Roman" w:hAnsi="Times New Roman" w:cs="Times New Roman"/>
+          <w:color w:val="auto"/>
+        </w:rPr>
+        <w:t>ŷᵢ)²</w:t>
+      </w:r>
+      <w:proofErr w:type="gramEnd"/>
+      <w:r>
+        <w:rPr>
+          <w:rFonts w:ascii="Times New Roman" w:hAnsi="Times New Roman" w:cs="Times New Roman"/>
+          <w:color w:val="auto"/>
+        </w:rPr>
+        <w:t xml:space="preserve"> )</w:t>
       </w:r>
     </w:p>
     <w:p>
@@ -3943,7 +5019,27 @@
                 <w:sz w:val="20"/>
                 <w:szCs w:val="20"/>
               </w:rPr>
-              <w:t>Cosine Similarity (KNN)</w:t>
+              <w:t xml:space="preserve">Cosine </w:t>
+            </w:r>
+            <w:proofErr w:type="spellStart"/>
+            <w:r>
+              <w:rPr>
+                <w:rFonts w:ascii="Times New Roman" w:hAnsi="Times New Roman" w:cs="Times New Roman"/>
+                <w:color w:val="auto"/>
+                <w:sz w:val="20"/>
+                <w:szCs w:val="20"/>
+              </w:rPr>
+              <w:t>Similarity</w:t>
+            </w:r>
+            <w:proofErr w:type="spellEnd"/>
+            <w:r>
+              <w:rPr>
+                <w:rFonts w:ascii="Times New Roman" w:hAnsi="Times New Roman" w:cs="Times New Roman"/>
+                <w:color w:val="auto"/>
+                <w:sz w:val="20"/>
+                <w:szCs w:val="20"/>
+              </w:rPr>
+              <w:t xml:space="preserve"> (KNN)</w:t>
             </w:r>
           </w:p>
         </w:tc>
@@ -3979,7 +5075,27 @@
                 <w:sz w:val="20"/>
                 <w:szCs w:val="20"/>
               </w:rPr>
-              <w:t>Nessun cold-start</w:t>
+              <w:t xml:space="preserve">Nessun </w:t>
+            </w:r>
+            <w:proofErr w:type="spellStart"/>
+            <w:r>
+              <w:rPr>
+                <w:rFonts w:ascii="Times New Roman" w:hAnsi="Times New Roman" w:cs="Times New Roman"/>
+                <w:color w:val="auto"/>
+                <w:sz w:val="20"/>
+                <w:szCs w:val="20"/>
+              </w:rPr>
+              <w:t>cold</w:t>
+            </w:r>
+            <w:proofErr w:type="spellEnd"/>
+            <w:r>
+              <w:rPr>
+                <w:rFonts w:ascii="Times New Roman" w:hAnsi="Times New Roman" w:cs="Times New Roman"/>
+                <w:color w:val="auto"/>
+                <w:sz w:val="20"/>
+                <w:szCs w:val="20"/>
+              </w:rPr>
+              <w:t>-start</w:t>
             </w:r>
           </w:p>
         </w:tc>
@@ -4015,8 +5131,19 @@
                 <w:sz w:val="20"/>
                 <w:szCs w:val="20"/>
               </w:rPr>
-              <w:t>~55 ms</w:t>
-            </w:r>
+              <w:t xml:space="preserve">~55 </w:t>
+            </w:r>
+            <w:proofErr w:type="spellStart"/>
+            <w:r>
+              <w:rPr>
+                <w:rFonts w:ascii="Times New Roman" w:hAnsi="Times New Roman" w:cs="Times New Roman"/>
+                <w:color w:val="auto"/>
+                <w:sz w:val="20"/>
+                <w:szCs w:val="20"/>
+              </w:rPr>
+              <w:t>ms</w:t>
+            </w:r>
+            <w:proofErr w:type="spellEnd"/>
           </w:p>
         </w:tc>
       </w:tr>
@@ -4085,14 +5212,25 @@
                 <w:color w:val="auto"/>
               </w:rPr>
             </w:pPr>
-            <w:r>
-              <w:rPr>
-                <w:rFonts w:ascii="Times New Roman" w:hAnsi="Times New Roman" w:cs="Times New Roman"/>
-                <w:color w:val="auto"/>
-                <w:sz w:val="20"/>
-                <w:szCs w:val="20"/>
-              </w:rPr>
-              <w:t>Truncated SVD</w:t>
+            <w:proofErr w:type="spellStart"/>
+            <w:r>
+              <w:rPr>
+                <w:rFonts w:ascii="Times New Roman" w:hAnsi="Times New Roman" w:cs="Times New Roman"/>
+                <w:color w:val="auto"/>
+                <w:sz w:val="20"/>
+                <w:szCs w:val="20"/>
+              </w:rPr>
+              <w:t>Truncated</w:t>
+            </w:r>
+            <w:proofErr w:type="spellEnd"/>
+            <w:r>
+              <w:rPr>
+                <w:rFonts w:ascii="Times New Roman" w:hAnsi="Times New Roman" w:cs="Times New Roman"/>
+                <w:color w:val="auto"/>
+                <w:sz w:val="20"/>
+                <w:szCs w:val="20"/>
+              </w:rPr>
+              <w:t xml:space="preserve"> SVD</w:t>
             </w:r>
           </w:p>
         </w:tc>
@@ -4157,6 +5295,7 @@
                 <w:color w:val="auto"/>
               </w:rPr>
             </w:pPr>
+            <w:proofErr w:type="spellStart"/>
             <w:r>
               <w:rPr>
                 <w:rFonts w:ascii="Times New Roman" w:hAnsi="Times New Roman" w:cs="Times New Roman"/>
@@ -4166,6 +5305,7 @@
               </w:rPr>
               <w:t>n.d.</w:t>
             </w:r>
+            <w:proofErr w:type="spellEnd"/>
           </w:p>
         </w:tc>
       </w:tr>
@@ -4232,14 +5372,45 @@
                 <w:color w:val="auto"/>
               </w:rPr>
             </w:pPr>
-            <w:r>
-              <w:rPr>
-                <w:rFonts w:ascii="Times New Roman" w:hAnsi="Times New Roman" w:cs="Times New Roman"/>
-                <w:color w:val="auto"/>
-                <w:sz w:val="20"/>
-                <w:szCs w:val="20"/>
-              </w:rPr>
-              <w:t>Keras Embeddings (NCF)</w:t>
+            <w:proofErr w:type="spellStart"/>
+            <w:r>
+              <w:rPr>
+                <w:rFonts w:ascii="Times New Roman" w:hAnsi="Times New Roman" w:cs="Times New Roman"/>
+                <w:color w:val="auto"/>
+                <w:sz w:val="20"/>
+                <w:szCs w:val="20"/>
+              </w:rPr>
+              <w:t>Keras</w:t>
+            </w:r>
+            <w:proofErr w:type="spellEnd"/>
+            <w:r>
+              <w:rPr>
+                <w:rFonts w:ascii="Times New Roman" w:hAnsi="Times New Roman" w:cs="Times New Roman"/>
+                <w:color w:val="auto"/>
+                <w:sz w:val="20"/>
+                <w:szCs w:val="20"/>
+              </w:rPr>
+              <w:t xml:space="preserve"> </w:t>
+            </w:r>
+            <w:proofErr w:type="spellStart"/>
+            <w:r>
+              <w:rPr>
+                <w:rFonts w:ascii="Times New Roman" w:hAnsi="Times New Roman" w:cs="Times New Roman"/>
+                <w:color w:val="auto"/>
+                <w:sz w:val="20"/>
+                <w:szCs w:val="20"/>
+              </w:rPr>
+              <w:t>Embeddings</w:t>
+            </w:r>
+            <w:proofErr w:type="spellEnd"/>
+            <w:r>
+              <w:rPr>
+                <w:rFonts w:ascii="Times New Roman" w:hAnsi="Times New Roman" w:cs="Times New Roman"/>
+                <w:color w:val="auto"/>
+                <w:sz w:val="20"/>
+                <w:szCs w:val="20"/>
+              </w:rPr>
+              <w:t xml:space="preserve"> (NCF)</w:t>
             </w:r>
           </w:p>
         </w:tc>
@@ -4309,8 +5480,19 @@
                 <w:sz w:val="20"/>
                 <w:szCs w:val="20"/>
               </w:rPr>
-              <w:t>~436 ms</w:t>
-            </w:r>
+              <w:t xml:space="preserve">~436 </w:t>
+            </w:r>
+            <w:proofErr w:type="spellStart"/>
+            <w:r>
+              <w:rPr>
+                <w:rFonts w:ascii="Times New Roman" w:hAnsi="Times New Roman" w:cs="Times New Roman"/>
+                <w:color w:val="auto"/>
+                <w:sz w:val="20"/>
+                <w:szCs w:val="20"/>
+              </w:rPr>
+              <w:t>ms</w:t>
+            </w:r>
+            <w:proofErr w:type="spellEnd"/>
           </w:p>
         </w:tc>
       </w:tr>
@@ -4370,7 +5552,7 @@
                     </pic:cNvPicPr>
                   </pic:nvPicPr>
                   <pic:blipFill>
-                    <a:blip r:embed="rId13"/>
+                    <a:blip r:embed="rId14"/>
                     <a:srcRect/>
                     <a:stretch>
                       <a:fillRect/>
@@ -4423,6 +5605,7 @@
         </w:rPr>
         <w:t xml:space="preserve"> </w:t>
       </w:r>
+      <w:proofErr w:type="spellStart"/>
       <w:r>
         <w:rPr>
           <w:rFonts w:ascii="Times New Roman" w:hAnsi="Times New Roman" w:cs="Times New Roman"/>
@@ -4431,6 +5614,7 @@
         </w:rPr>
         <w:t>Streamlit</w:t>
       </w:r>
+      <w:proofErr w:type="spellEnd"/>
       <w:r>
         <w:rPr>
           <w:rFonts w:ascii="Times New Roman" w:hAnsi="Times New Roman" w:cs="Times New Roman"/>
@@ -4517,6 +5701,7 @@
         </w:rPr>
         <w:t xml:space="preserve"> interattiva in </w:t>
       </w:r>
+      <w:proofErr w:type="spellStart"/>
       <w:r>
         <w:rPr>
           <w:rFonts w:ascii="Times New Roman" w:hAnsi="Times New Roman" w:cs="Times New Roman"/>
@@ -4525,6 +5710,7 @@
         </w:rPr>
         <w:t>Streamlit</w:t>
       </w:r>
+      <w:proofErr w:type="spellEnd"/>
       <w:r>
         <w:rPr>
           <w:rFonts w:ascii="Times New Roman" w:hAnsi="Times New Roman" w:cs="Times New Roman"/>
@@ -4566,8 +5752,25 @@
           <w:rFonts w:ascii="Times New Roman" w:hAnsi="Times New Roman" w:cs="Times New Roman"/>
           <w:color w:val="auto"/>
         </w:rPr>
-        <w:t xml:space="preserve">: ogni interazione, come la selezione di un profilo dal menù a tendina, aggiorna il </w:t>
-      </w:r>
+        <w:t xml:space="preserve">: ogni interazione, come la selezione di un profilo dal </w:t>
+      </w:r>
+      <w:proofErr w:type="spellStart"/>
+      <w:r>
+        <w:rPr>
+          <w:rFonts w:ascii="Times New Roman" w:hAnsi="Times New Roman" w:cs="Times New Roman"/>
+          <w:color w:val="auto"/>
+        </w:rPr>
+        <w:t>menù</w:t>
+      </w:r>
+      <w:proofErr w:type="spellEnd"/>
+      <w:r>
+        <w:rPr>
+          <w:rFonts w:ascii="Times New Roman" w:hAnsi="Times New Roman" w:cs="Times New Roman"/>
+          <w:color w:val="auto"/>
+        </w:rPr>
+        <w:t xml:space="preserve"> a tendina, aggiorna il </w:t>
+      </w:r>
+      <w:proofErr w:type="spellStart"/>
       <w:r>
         <w:rPr>
           <w:rFonts w:ascii="Times New Roman" w:hAnsi="Times New Roman" w:cs="Times New Roman"/>
@@ -4576,6 +5779,7 @@
         </w:rPr>
         <w:t>DataFrame</w:t>
       </w:r>
+      <w:proofErr w:type="spellEnd"/>
       <w:r>
         <w:rPr>
           <w:rFonts w:ascii="Times New Roman" w:hAnsi="Times New Roman" w:cs="Times New Roman"/>
@@ -4617,7 +5821,50 @@
           <w:rFonts w:ascii="Times New Roman" w:hAnsi="Times New Roman" w:cs="Times New Roman"/>
           <w:color w:val="auto"/>
         </w:rPr>
-        <w:t xml:space="preserve">Caching (@st.cache_data): modelli serializzati (.joblib), reti neurali e file </w:t>
+        <w:t>Caching (@</w:t>
+      </w:r>
+      <w:proofErr w:type="gramStart"/>
+      <w:r>
+        <w:rPr>
+          <w:rFonts w:ascii="Times New Roman" w:hAnsi="Times New Roman" w:cs="Times New Roman"/>
+          <w:color w:val="auto"/>
+        </w:rPr>
+        <w:t>st.cache</w:t>
+      </w:r>
+      <w:proofErr w:type="gramEnd"/>
+      <w:r>
+        <w:rPr>
+          <w:rFonts w:ascii="Times New Roman" w:hAnsi="Times New Roman" w:cs="Times New Roman"/>
+          <w:color w:val="auto"/>
+        </w:rPr>
+        <w:t xml:space="preserve">_data): modelli serializzati </w:t>
+      </w:r>
+      <w:proofErr w:type="gramStart"/>
+      <w:r>
+        <w:rPr>
+          <w:rFonts w:ascii="Times New Roman" w:hAnsi="Times New Roman" w:cs="Times New Roman"/>
+          <w:color w:val="auto"/>
+        </w:rPr>
+        <w:t>(.</w:t>
+      </w:r>
+      <w:proofErr w:type="spellStart"/>
+      <w:r>
+        <w:rPr>
+          <w:rFonts w:ascii="Times New Roman" w:hAnsi="Times New Roman" w:cs="Times New Roman"/>
+          <w:i/>
+          <w:iCs/>
+          <w:color w:val="auto"/>
+        </w:rPr>
+        <w:t>joblib</w:t>
+      </w:r>
+      <w:proofErr w:type="spellEnd"/>
+      <w:proofErr w:type="gramEnd"/>
+      <w:r>
+        <w:rPr>
+          <w:rFonts w:ascii="Times New Roman" w:hAnsi="Times New Roman" w:cs="Times New Roman"/>
+          <w:color w:val="auto"/>
+        </w:rPr>
+        <w:t xml:space="preserve">), reti neurali e file </w:t>
       </w:r>
       <w:r>
         <w:rPr>
@@ -4728,7 +5975,25 @@
           <w:rFonts w:ascii="Times New Roman" w:hAnsi="Times New Roman" w:cs="Times New Roman"/>
           <w:color w:val="auto"/>
         </w:rPr>
-        <w:t xml:space="preserve"> del sentiment in tempo reale, comparatore dei recommender e plancia di </w:t>
+        <w:t xml:space="preserve"> del sentiment in tempo reale, comparatore dei </w:t>
+      </w:r>
+      <w:proofErr w:type="spellStart"/>
+      <w:r>
+        <w:rPr>
+          <w:rFonts w:ascii="Times New Roman" w:hAnsi="Times New Roman" w:cs="Times New Roman"/>
+          <w:i/>
+          <w:iCs/>
+          <w:color w:val="auto"/>
+        </w:rPr>
+        <w:t>recommender</w:t>
+      </w:r>
+      <w:proofErr w:type="spellEnd"/>
+      <w:r>
+        <w:rPr>
+          <w:rFonts w:ascii="Times New Roman" w:hAnsi="Times New Roman" w:cs="Times New Roman"/>
+          <w:color w:val="auto"/>
+        </w:rPr>
+        <w:t xml:space="preserve"> e plancia di </w:t>
       </w:r>
       <w:r>
         <w:rPr>
@@ -5061,7 +6326,47 @@
                 <w:sz w:val="20"/>
                 <w:szCs w:val="20"/>
               </w:rPr>
-              <w:t>Sentiment (Logistic Regression)</w:t>
+              <w:t>Sentiment (</w:t>
+            </w:r>
+            <w:proofErr w:type="spellStart"/>
+            <w:r>
+              <w:rPr>
+                <w:rFonts w:ascii="Times New Roman" w:hAnsi="Times New Roman" w:cs="Times New Roman"/>
+                <w:color w:val="auto"/>
+                <w:sz w:val="20"/>
+                <w:szCs w:val="20"/>
+              </w:rPr>
+              <w:t>Logistic</w:t>
+            </w:r>
+            <w:proofErr w:type="spellEnd"/>
+            <w:r>
+              <w:rPr>
+                <w:rFonts w:ascii="Times New Roman" w:hAnsi="Times New Roman" w:cs="Times New Roman"/>
+                <w:color w:val="auto"/>
+                <w:sz w:val="20"/>
+                <w:szCs w:val="20"/>
+              </w:rPr>
+              <w:t xml:space="preserve"> </w:t>
+            </w:r>
+            <w:proofErr w:type="spellStart"/>
+            <w:r>
+              <w:rPr>
+                <w:rFonts w:ascii="Times New Roman" w:hAnsi="Times New Roman" w:cs="Times New Roman"/>
+                <w:color w:val="auto"/>
+                <w:sz w:val="20"/>
+                <w:szCs w:val="20"/>
+              </w:rPr>
+              <w:t>Regression</w:t>
+            </w:r>
+            <w:proofErr w:type="spellEnd"/>
+            <w:r>
+              <w:rPr>
+                <w:rFonts w:ascii="Times New Roman" w:hAnsi="Times New Roman" w:cs="Times New Roman"/>
+                <w:color w:val="auto"/>
+                <w:sz w:val="20"/>
+                <w:szCs w:val="20"/>
+              </w:rPr>
+              <w:t>)</w:t>
             </w:r>
           </w:p>
         </w:tc>
@@ -5174,7 +6479,47 @@
                 <w:sz w:val="20"/>
                 <w:szCs w:val="20"/>
               </w:rPr>
-              <w:t>Sentiment (Logistic Regression)</w:t>
+              <w:t>Sentiment (</w:t>
+            </w:r>
+            <w:proofErr w:type="spellStart"/>
+            <w:r>
+              <w:rPr>
+                <w:rFonts w:ascii="Times New Roman" w:hAnsi="Times New Roman" w:cs="Times New Roman"/>
+                <w:color w:val="auto"/>
+                <w:sz w:val="20"/>
+                <w:szCs w:val="20"/>
+              </w:rPr>
+              <w:t>Logistic</w:t>
+            </w:r>
+            <w:proofErr w:type="spellEnd"/>
+            <w:r>
+              <w:rPr>
+                <w:rFonts w:ascii="Times New Roman" w:hAnsi="Times New Roman" w:cs="Times New Roman"/>
+                <w:color w:val="auto"/>
+                <w:sz w:val="20"/>
+                <w:szCs w:val="20"/>
+              </w:rPr>
+              <w:t xml:space="preserve"> </w:t>
+            </w:r>
+            <w:proofErr w:type="spellStart"/>
+            <w:r>
+              <w:rPr>
+                <w:rFonts w:ascii="Times New Roman" w:hAnsi="Times New Roman" w:cs="Times New Roman"/>
+                <w:color w:val="auto"/>
+                <w:sz w:val="20"/>
+                <w:szCs w:val="20"/>
+              </w:rPr>
+              <w:t>Regression</w:t>
+            </w:r>
+            <w:proofErr w:type="spellEnd"/>
+            <w:r>
+              <w:rPr>
+                <w:rFonts w:ascii="Times New Roman" w:hAnsi="Times New Roman" w:cs="Times New Roman"/>
+                <w:color w:val="auto"/>
+                <w:sz w:val="20"/>
+                <w:szCs w:val="20"/>
+              </w:rPr>
+              <w:t>)</w:t>
             </w:r>
           </w:p>
         </w:tc>
@@ -5280,14 +6625,25 @@
                 <w:color w:val="auto"/>
               </w:rPr>
             </w:pPr>
-            <w:r>
-              <w:rPr>
-                <w:rFonts w:ascii="Times New Roman" w:hAnsi="Times New Roman" w:cs="Times New Roman"/>
-                <w:color w:val="auto"/>
-                <w:sz w:val="20"/>
-                <w:szCs w:val="20"/>
-              </w:rPr>
-              <w:t>Recommender neurale</w:t>
+            <w:proofErr w:type="spellStart"/>
+            <w:r>
+              <w:rPr>
+                <w:rFonts w:ascii="Times New Roman" w:hAnsi="Times New Roman" w:cs="Times New Roman"/>
+                <w:color w:val="auto"/>
+                <w:sz w:val="20"/>
+                <w:szCs w:val="20"/>
+              </w:rPr>
+              <w:t>Recommender</w:t>
+            </w:r>
+            <w:proofErr w:type="spellEnd"/>
+            <w:r>
+              <w:rPr>
+                <w:rFonts w:ascii="Times New Roman" w:hAnsi="Times New Roman" w:cs="Times New Roman"/>
+                <w:color w:val="auto"/>
+                <w:sz w:val="20"/>
+                <w:szCs w:val="20"/>
+              </w:rPr>
+              <w:t xml:space="preserve"> neurale</w:t>
             </w:r>
           </w:p>
         </w:tc>
@@ -5359,7 +6715,25 @@
                 <w:sz w:val="20"/>
                 <w:szCs w:val="20"/>
               </w:rPr>
-              <w:t>0,76 (errore medio &lt; 1 stella)</w:t>
+              <w:t xml:space="preserve">0,76 (errore medio &lt; 1 </w:t>
+            </w:r>
+            <w:r>
+              <w:rPr>
+                <w:rFonts w:ascii="Times New Roman" w:hAnsi="Times New Roman" w:cs="Times New Roman"/>
+                <w:color w:val="auto"/>
+                <w:sz w:val="20"/>
+                <w:szCs w:val="20"/>
+              </w:rPr>
+              <w:t>star</w:t>
+            </w:r>
+            <w:r>
+              <w:rPr>
+                <w:rFonts w:ascii="Times New Roman" w:hAnsi="Times New Roman" w:cs="Times New Roman"/>
+                <w:color w:val="auto"/>
+                <w:sz w:val="20"/>
+                <w:szCs w:val="20"/>
+              </w:rPr>
+              <w:t>)</w:t>
             </w:r>
           </w:p>
         </w:tc>
@@ -5393,14 +6767,25 @@
                 <w:color w:val="auto"/>
               </w:rPr>
             </w:pPr>
-            <w:r>
-              <w:rPr>
-                <w:rFonts w:ascii="Times New Roman" w:hAnsi="Times New Roman" w:cs="Times New Roman"/>
-                <w:color w:val="auto"/>
-                <w:sz w:val="20"/>
-                <w:szCs w:val="20"/>
-              </w:rPr>
-              <w:t>Recommender neurale</w:t>
+            <w:proofErr w:type="spellStart"/>
+            <w:r>
+              <w:rPr>
+                <w:rFonts w:ascii="Times New Roman" w:hAnsi="Times New Roman" w:cs="Times New Roman"/>
+                <w:color w:val="auto"/>
+                <w:sz w:val="20"/>
+                <w:szCs w:val="20"/>
+              </w:rPr>
+              <w:t>Recommender</w:t>
+            </w:r>
+            <w:proofErr w:type="spellEnd"/>
+            <w:r>
+              <w:rPr>
+                <w:rFonts w:ascii="Times New Roman" w:hAnsi="Times New Roman" w:cs="Times New Roman"/>
+                <w:color w:val="auto"/>
+                <w:sz w:val="20"/>
+                <w:szCs w:val="20"/>
+              </w:rPr>
+              <w:t xml:space="preserve"> neurale</w:t>
             </w:r>
           </w:p>
         </w:tc>
@@ -5585,8 +6970,19 @@
                 <w:sz w:val="20"/>
                 <w:szCs w:val="20"/>
               </w:rPr>
-              <w:t>~55 ms</w:t>
-            </w:r>
+              <w:t xml:space="preserve">~55 </w:t>
+            </w:r>
+            <w:proofErr w:type="spellStart"/>
+            <w:r>
+              <w:rPr>
+                <w:rFonts w:ascii="Times New Roman" w:hAnsi="Times New Roman" w:cs="Times New Roman"/>
+                <w:color w:val="auto"/>
+                <w:sz w:val="20"/>
+                <w:szCs w:val="20"/>
+              </w:rPr>
+              <w:t>ms</w:t>
+            </w:r>
+            <w:proofErr w:type="spellEnd"/>
           </w:p>
         </w:tc>
       </w:tr>
@@ -5695,8 +7091,19 @@
                 <w:sz w:val="20"/>
                 <w:szCs w:val="20"/>
               </w:rPr>
-              <w:t>~436 ms</w:t>
-            </w:r>
+              <w:t xml:space="preserve">~436 </w:t>
+            </w:r>
+            <w:proofErr w:type="spellStart"/>
+            <w:r>
+              <w:rPr>
+                <w:rFonts w:ascii="Times New Roman" w:hAnsi="Times New Roman" w:cs="Times New Roman"/>
+                <w:color w:val="auto"/>
+                <w:sz w:val="20"/>
+                <w:szCs w:val="20"/>
+              </w:rPr>
+              <w:t>ms</w:t>
+            </w:r>
+            <w:proofErr w:type="spellEnd"/>
           </w:p>
         </w:tc>
       </w:tr>
@@ -5767,7 +7174,23 @@
           <w:rFonts w:ascii="Times New Roman" w:hAnsi="Times New Roman" w:cs="Times New Roman"/>
           <w:color w:val="auto"/>
         </w:rPr>
-        <w:t xml:space="preserve">, con circa 55 ms di risposta, è ideale per </w:t>
+        <w:t xml:space="preserve">, con circa 55 </w:t>
+      </w:r>
+      <w:proofErr w:type="spellStart"/>
+      <w:r>
+        <w:rPr>
+          <w:rFonts w:ascii="Times New Roman" w:hAnsi="Times New Roman" w:cs="Times New Roman"/>
+          <w:color w:val="auto"/>
+        </w:rPr>
+        <w:t>ms</w:t>
+      </w:r>
+      <w:proofErr w:type="spellEnd"/>
+      <w:r>
+        <w:rPr>
+          <w:rFonts w:ascii="Times New Roman" w:hAnsi="Times New Roman" w:cs="Times New Roman"/>
+          <w:color w:val="auto"/>
+        </w:rPr>
+        <w:t xml:space="preserve"> di risposta, è ideale per </w:t>
       </w:r>
       <w:r>
         <w:rPr>
@@ -5797,7 +7220,23 @@
           <w:rFonts w:ascii="Times New Roman" w:hAnsi="Times New Roman" w:cs="Times New Roman"/>
           <w:color w:val="auto"/>
         </w:rPr>
-        <w:t xml:space="preserve"> impiega circa 436 ms ma offre previsioni molto più precise. L'integrazione dei due </w:t>
+        <w:t xml:space="preserve"> impiega circa 436 </w:t>
+      </w:r>
+      <w:proofErr w:type="spellStart"/>
+      <w:r>
+        <w:rPr>
+          <w:rFonts w:ascii="Times New Roman" w:hAnsi="Times New Roman" w:cs="Times New Roman"/>
+          <w:color w:val="auto"/>
+        </w:rPr>
+        <w:t>ms</w:t>
+      </w:r>
+      <w:proofErr w:type="spellEnd"/>
+      <w:r>
+        <w:rPr>
+          <w:rFonts w:ascii="Times New Roman" w:hAnsi="Times New Roman" w:cs="Times New Roman"/>
+          <w:color w:val="auto"/>
+        </w:rPr>
+        <w:t xml:space="preserve"> ma offre previsioni molto più precise. L'integrazione dei due </w:t>
       </w:r>
       <w:r>
         <w:rPr>
@@ -5851,102 +7290,6 @@
             <wp:extent cx="3810000" cy="1647825"/>
             <wp:effectExtent l="0" t="0" r="0" b="0"/>
             <wp:docPr id="1069196345" name="Confronto delle latenze KNN e Deep Learning" descr="Confronto delle latenze KNN e Deep Learning" title="Confronto delle latenze KNN e Deep Learning"/>
-            <wp:cNvGraphicFramePr>
-              <a:graphicFrameLocks xmlns:a="http://schemas.openxmlformats.org/drawingml/2006/main" noChangeAspect="1"/>
-            </wp:cNvGraphicFramePr>
-            <a:graphic xmlns:a="http://schemas.openxmlformats.org/drawingml/2006/main">
-              <a:graphicData uri="http://schemas.openxmlformats.org/drawingml/2006/picture">
-                <pic:pic xmlns:pic="http://schemas.openxmlformats.org/drawingml/2006/picture">
-                  <pic:nvPicPr>
-                    <pic:cNvPr id="0" name=""/>
-                    <pic:cNvPicPr>
-                      <a:picLocks noChangeAspect="1" noChangeArrowheads="1"/>
-                    </pic:cNvPicPr>
-                  </pic:nvPicPr>
-                  <pic:blipFill>
-                    <a:blip r:embed="rId14"/>
-                    <a:srcRect/>
-                    <a:stretch>
-                      <a:fillRect/>
-                    </a:stretch>
-                  </pic:blipFill>
-                  <pic:spPr bwMode="auto">
-                    <a:xfrm>
-                      <a:off x="0" y="0"/>
-                      <a:ext cx="3810000" cy="1647825"/>
-                    </a:xfrm>
-                    <a:prstGeom prst="rect">
-                      <a:avLst/>
-                    </a:prstGeom>
-                  </pic:spPr>
-                </pic:pic>
-              </a:graphicData>
-            </a:graphic>
-          </wp:inline>
-        </w:drawing>
-      </w:r>
-    </w:p>
-    <w:p>
-      <w:pPr>
-        <w:spacing w:before="60" w:after="240"/>
-        <w:jc w:val="center"/>
-        <w:rPr>
-          <w:rFonts w:ascii="Times New Roman" w:hAnsi="Times New Roman" w:cs="Times New Roman"/>
-          <w:color w:val="auto"/>
-        </w:rPr>
-      </w:pPr>
-      <w:r>
-        <w:rPr>
-          <w:rFonts w:ascii="Times New Roman" w:hAnsi="Times New Roman" w:cs="Times New Roman"/>
-          <w:color w:val="auto"/>
-        </w:rPr>
-        <w:t xml:space="preserve">Figura 7 - Latenza di risposta: </w:t>
-      </w:r>
-      <w:r>
-        <w:rPr>
-          <w:rFonts w:ascii="Times New Roman" w:hAnsi="Times New Roman" w:cs="Times New Roman"/>
-          <w:i/>
-          <w:color w:val="auto"/>
-        </w:rPr>
-        <w:t>KNN</w:t>
-      </w:r>
-      <w:r>
-        <w:rPr>
-          <w:rFonts w:ascii="Times New Roman" w:hAnsi="Times New Roman" w:cs="Times New Roman"/>
-          <w:color w:val="auto"/>
-        </w:rPr>
-        <w:t xml:space="preserve"> contro </w:t>
-      </w:r>
-      <w:r>
-        <w:rPr>
-          <w:rFonts w:ascii="Times New Roman" w:hAnsi="Times New Roman" w:cs="Times New Roman"/>
-          <w:i/>
-          <w:color w:val="auto"/>
-        </w:rPr>
-        <w:t>Deep Learning</w:t>
-      </w:r>
-    </w:p>
-    <w:p>
-      <w:pPr>
-        <w:keepNext/>
-        <w:spacing w:before="120"/>
-        <w:jc w:val="center"/>
-        <w:rPr>
-          <w:rFonts w:ascii="Times New Roman" w:hAnsi="Times New Roman" w:cs="Times New Roman"/>
-          <w:color w:val="auto"/>
-        </w:rPr>
-      </w:pPr>
-      <w:r>
-        <w:rPr>
-          <w:rFonts w:ascii="Times New Roman" w:hAnsi="Times New Roman" w:cs="Times New Roman"/>
-          <w:noProof/>
-          <w:color w:val="auto"/>
-        </w:rPr>
-        <w:drawing>
-          <wp:inline distT="0" distB="0" distL="0" distR="0" wp14:anchorId="6409E71E" wp14:editId="6AF4557E">
-            <wp:extent cx="4191000" cy="2171700"/>
-            <wp:effectExtent l="0" t="0" r="0" b="0"/>
-            <wp:docPr id="689222988" name="Dashboard benchmark" descr="Dashboard benchmark" title="Dashboard benchmark"/>
             <wp:cNvGraphicFramePr>
               <a:graphicFrameLocks xmlns:a="http://schemas.openxmlformats.org/drawingml/2006/main" noChangeAspect="1"/>
             </wp:cNvGraphicFramePr>
@@ -5969,6 +7312,102 @@
                   <pic:spPr bwMode="auto">
                     <a:xfrm>
                       <a:off x="0" y="0"/>
+                      <a:ext cx="3810000" cy="1647825"/>
+                    </a:xfrm>
+                    <a:prstGeom prst="rect">
+                      <a:avLst/>
+                    </a:prstGeom>
+                  </pic:spPr>
+                </pic:pic>
+              </a:graphicData>
+            </a:graphic>
+          </wp:inline>
+        </w:drawing>
+      </w:r>
+    </w:p>
+    <w:p>
+      <w:pPr>
+        <w:spacing w:before="60" w:after="240"/>
+        <w:jc w:val="center"/>
+        <w:rPr>
+          <w:rFonts w:ascii="Times New Roman" w:hAnsi="Times New Roman" w:cs="Times New Roman"/>
+          <w:color w:val="auto"/>
+        </w:rPr>
+      </w:pPr>
+      <w:r>
+        <w:rPr>
+          <w:rFonts w:ascii="Times New Roman" w:hAnsi="Times New Roman" w:cs="Times New Roman"/>
+          <w:color w:val="auto"/>
+        </w:rPr>
+        <w:t xml:space="preserve">Figura 7 - Latenza di risposta: </w:t>
+      </w:r>
+      <w:r>
+        <w:rPr>
+          <w:rFonts w:ascii="Times New Roman" w:hAnsi="Times New Roman" w:cs="Times New Roman"/>
+          <w:i/>
+          <w:color w:val="auto"/>
+        </w:rPr>
+        <w:t>KNN</w:t>
+      </w:r>
+      <w:r>
+        <w:rPr>
+          <w:rFonts w:ascii="Times New Roman" w:hAnsi="Times New Roman" w:cs="Times New Roman"/>
+          <w:color w:val="auto"/>
+        </w:rPr>
+        <w:t xml:space="preserve"> contro </w:t>
+      </w:r>
+      <w:r>
+        <w:rPr>
+          <w:rFonts w:ascii="Times New Roman" w:hAnsi="Times New Roman" w:cs="Times New Roman"/>
+          <w:i/>
+          <w:color w:val="auto"/>
+        </w:rPr>
+        <w:t>Deep Learning</w:t>
+      </w:r>
+    </w:p>
+    <w:p>
+      <w:pPr>
+        <w:keepNext/>
+        <w:spacing w:before="120"/>
+        <w:jc w:val="center"/>
+        <w:rPr>
+          <w:rFonts w:ascii="Times New Roman" w:hAnsi="Times New Roman" w:cs="Times New Roman"/>
+          <w:color w:val="auto"/>
+        </w:rPr>
+      </w:pPr>
+      <w:r>
+        <w:rPr>
+          <w:rFonts w:ascii="Times New Roman" w:hAnsi="Times New Roman" w:cs="Times New Roman"/>
+          <w:noProof/>
+          <w:color w:val="auto"/>
+        </w:rPr>
+        <w:drawing>
+          <wp:inline distT="0" distB="0" distL="0" distR="0" wp14:anchorId="6409E71E" wp14:editId="6AF4557E">
+            <wp:extent cx="4191000" cy="2171700"/>
+            <wp:effectExtent l="0" t="0" r="0" b="0"/>
+            <wp:docPr id="689222988" name="Dashboard benchmark" descr="Dashboard benchmark" title="Dashboard benchmark"/>
+            <wp:cNvGraphicFramePr>
+              <a:graphicFrameLocks xmlns:a="http://schemas.openxmlformats.org/drawingml/2006/main" noChangeAspect="1"/>
+            </wp:cNvGraphicFramePr>
+            <a:graphic xmlns:a="http://schemas.openxmlformats.org/drawingml/2006/main">
+              <a:graphicData uri="http://schemas.openxmlformats.org/drawingml/2006/picture">
+                <pic:pic xmlns:pic="http://schemas.openxmlformats.org/drawingml/2006/picture">
+                  <pic:nvPicPr>
+                    <pic:cNvPr id="0" name=""/>
+                    <pic:cNvPicPr>
+                      <a:picLocks noChangeAspect="1" noChangeArrowheads="1"/>
+                    </pic:cNvPicPr>
+                  </pic:nvPicPr>
+                  <pic:blipFill>
+                    <a:blip r:embed="rId16"/>
+                    <a:srcRect/>
+                    <a:stretch>
+                      <a:fillRect/>
+                    </a:stretch>
+                  </pic:blipFill>
+                  <pic:spPr bwMode="auto">
+                    <a:xfrm>
+                      <a:off x="0" y="0"/>
                       <a:ext cx="4191000" cy="2171700"/>
                     </a:xfrm>
                     <a:prstGeom prst="rect">
@@ -5992,21 +7431,31 @@
           <w:lang w:val="en-US"/>
         </w:rPr>
       </w:pPr>
+      <w:proofErr w:type="spellStart"/>
       <w:r>
         <w:rPr>
           <w:rFonts w:ascii="Times New Roman" w:hAnsi="Times New Roman" w:cs="Times New Roman"/>
           <w:color w:val="auto"/>
           <w:lang w:val="en-US"/>
         </w:rPr>
-        <w:t xml:space="preserve">Figura 8 - </w:t>
-      </w:r>
-      <w:r>
-        <w:rPr>
-          <w:rFonts w:ascii="Times New Roman" w:hAnsi="Times New Roman" w:cs="Times New Roman"/>
-          <w:i/>
+        <w:t>Figura</w:t>
+      </w:r>
+      <w:proofErr w:type="spellEnd"/>
+      <w:r>
+        <w:rPr>
+          <w:rFonts w:ascii="Times New Roman" w:hAnsi="Times New Roman" w:cs="Times New Roman"/>
           <w:color w:val="auto"/>
           <w:lang w:val="en-US"/>
         </w:rPr>
+        <w:t xml:space="preserve"> 8 - </w:t>
+      </w:r>
+      <w:r>
+        <w:rPr>
+          <w:rFonts w:ascii="Times New Roman" w:hAnsi="Times New Roman" w:cs="Times New Roman"/>
+          <w:i/>
+          <w:color w:val="auto"/>
+          <w:lang w:val="en-US"/>
+        </w:rPr>
         <w:t>Dashboard</w:t>
       </w:r>
       <w:r>
@@ -6017,6 +7466,7 @@
         </w:rPr>
         <w:t xml:space="preserve"> </w:t>
       </w:r>
+      <w:proofErr w:type="spellStart"/>
       <w:r>
         <w:rPr>
           <w:rFonts w:ascii="Times New Roman" w:hAnsi="Times New Roman" w:cs="Times New Roman"/>
@@ -6026,6 +7476,7 @@
         </w:rPr>
         <w:t>Streamlit</w:t>
       </w:r>
+      <w:proofErr w:type="spellEnd"/>
       <w:r>
         <w:rPr>
           <w:rFonts w:ascii="Times New Roman" w:hAnsi="Times New Roman" w:cs="Times New Roman"/>
@@ -6123,8 +7574,18 @@
           <w:i/>
           <w:color w:val="auto"/>
         </w:rPr>
-        <w:t>Text Acquisition</w:t>
-      </w:r>
+        <w:t xml:space="preserve">Text </w:t>
+      </w:r>
+      <w:proofErr w:type="spellStart"/>
+      <w:r>
+        <w:rPr>
+          <w:rFonts w:ascii="Times New Roman" w:hAnsi="Times New Roman" w:cs="Times New Roman"/>
+          <w:i/>
+          <w:color w:val="auto"/>
+        </w:rPr>
+        <w:t>Acquisition</w:t>
+      </w:r>
+      <w:proofErr w:type="spellEnd"/>
       <w:r>
         <w:rPr>
           <w:rFonts w:ascii="Times New Roman" w:hAnsi="Times New Roman" w:cs="Times New Roman"/>
@@ -6138,8 +7599,18 @@
           <w:i/>
           <w:color w:val="auto"/>
         </w:rPr>
-        <w:t>Information Retrieval</w:t>
-      </w:r>
+        <w:t xml:space="preserve">Information </w:t>
+      </w:r>
+      <w:proofErr w:type="spellStart"/>
+      <w:r>
+        <w:rPr>
+          <w:rFonts w:ascii="Times New Roman" w:hAnsi="Times New Roman" w:cs="Times New Roman"/>
+          <w:i/>
+          <w:color w:val="auto"/>
+        </w:rPr>
+        <w:t>Retrieval</w:t>
+      </w:r>
+      <w:proofErr w:type="spellEnd"/>
       <w:r>
         <w:rPr>
           <w:rFonts w:ascii="Times New Roman" w:hAnsi="Times New Roman" w:cs="Times New Roman"/>
@@ -6177,13 +7648,23 @@
         </w:rPr>
         <w:t xml:space="preserve"> e </w:t>
       </w:r>
-      <w:r>
-        <w:rPr>
-          <w:rFonts w:ascii="Times New Roman" w:hAnsi="Times New Roman" w:cs="Times New Roman"/>
-          <w:i/>
-          <w:color w:val="auto"/>
-        </w:rPr>
-        <w:t>Recommender Systems</w:t>
+      <w:proofErr w:type="spellStart"/>
+      <w:r>
+        <w:rPr>
+          <w:rFonts w:ascii="Times New Roman" w:hAnsi="Times New Roman" w:cs="Times New Roman"/>
+          <w:i/>
+          <w:color w:val="auto"/>
+        </w:rPr>
+        <w:t>Recommender</w:t>
+      </w:r>
+      <w:proofErr w:type="spellEnd"/>
+      <w:r>
+        <w:rPr>
+          <w:rFonts w:ascii="Times New Roman" w:hAnsi="Times New Roman" w:cs="Times New Roman"/>
+          <w:i/>
+          <w:color w:val="auto"/>
+        </w:rPr>
+        <w:t xml:space="preserve"> Systems</w:t>
       </w:r>
       <w:r>
         <w:rPr>
@@ -6217,21 +7698,40 @@
           <w:color w:val="auto"/>
         </w:rPr>
       </w:pPr>
-      <w:r>
-        <w:rPr>
-          <w:rFonts w:ascii="Times New Roman" w:hAnsi="Times New Roman" w:cs="Times New Roman"/>
-          <w:color w:val="auto"/>
-        </w:rPr>
-        <w:t xml:space="preserve">Yelp AI Suite unisce l'immediatezza della </w:t>
-      </w:r>
-      <w:r>
-        <w:rPr>
-          <w:rFonts w:ascii="Times New Roman" w:hAnsi="Times New Roman" w:cs="Times New Roman"/>
-          <w:i/>
-          <w:color w:val="auto"/>
-        </w:rPr>
-        <w:t>Cosine Similarity</w:t>
-      </w:r>
+      <w:proofErr w:type="spellStart"/>
+      <w:r>
+        <w:rPr>
+          <w:rFonts w:ascii="Times New Roman" w:hAnsi="Times New Roman" w:cs="Times New Roman"/>
+          <w:color w:val="auto"/>
+        </w:rPr>
+        <w:t>Yelp</w:t>
+      </w:r>
+      <w:proofErr w:type="spellEnd"/>
+      <w:r>
+        <w:rPr>
+          <w:rFonts w:ascii="Times New Roman" w:hAnsi="Times New Roman" w:cs="Times New Roman"/>
+          <w:color w:val="auto"/>
+        </w:rPr>
+        <w:t xml:space="preserve"> AI Suite unisce l'immediatezza della </w:t>
+      </w:r>
+      <w:r>
+        <w:rPr>
+          <w:rFonts w:ascii="Times New Roman" w:hAnsi="Times New Roman" w:cs="Times New Roman"/>
+          <w:i/>
+          <w:color w:val="auto"/>
+        </w:rPr>
+        <w:t xml:space="preserve">Cosine </w:t>
+      </w:r>
+      <w:proofErr w:type="spellStart"/>
+      <w:r>
+        <w:rPr>
+          <w:rFonts w:ascii="Times New Roman" w:hAnsi="Times New Roman" w:cs="Times New Roman"/>
+          <w:i/>
+          <w:color w:val="auto"/>
+        </w:rPr>
+        <w:t>Similarity</w:t>
+      </w:r>
+      <w:proofErr w:type="spellEnd"/>
       <w:r>
         <w:rPr>
           <w:rFonts w:ascii="Times New Roman" w:hAnsi="Times New Roman" w:cs="Times New Roman"/>
@@ -6254,6 +7754,7 @@
         </w:rPr>
         <w:t>e delle reti neurali, offrendo un'esperienza d'uso reattiva e un quadro analitico completo, dall'</w:t>
       </w:r>
+      <w:proofErr w:type="spellStart"/>
       <w:r>
         <w:rPr>
           <w:rFonts w:ascii="Times New Roman" w:hAnsi="Times New Roman" w:cs="Times New Roman"/>
@@ -6262,6 +7763,7 @@
         </w:rPr>
         <w:t>ingestion</w:t>
       </w:r>
+      <w:proofErr w:type="spellEnd"/>
       <w:r>
         <w:rPr>
           <w:rFonts w:ascii="Times New Roman" w:hAnsi="Times New Roman" w:cs="Times New Roman"/>
@@ -6323,6 +7825,7 @@
         </w:rPr>
         <w:t xml:space="preserve">Yelp Open </w:t>
       </w:r>
+      <w:proofErr w:type="gramStart"/>
       <w:r>
         <w:rPr>
           <w:rFonts w:ascii="Times New Roman" w:hAnsi="Times New Roman" w:cs="Times New Roman"/>
@@ -6339,14 +7842,24 @@
           <w:color w:val="auto"/>
           <w:lang w:val="en-US"/>
         </w:rPr>
-        <w:t>(JSON)</w:t>
-      </w:r>
-      <w:r>
-        <w:rPr>
-          <w:rFonts w:ascii="Times New Roman" w:hAnsi="Times New Roman" w:cs="Times New Roman"/>
+        <w:t>(</w:t>
+      </w:r>
+      <w:proofErr w:type="gramEnd"/>
+      <w:r>
+        <w:rPr>
+          <w:rFonts w:ascii="Times New Roman" w:hAnsi="Times New Roman" w:cs="Times New Roman"/>
+          <w:i/>
           <w:color w:val="auto"/>
           <w:lang w:val="en-US"/>
         </w:rPr>
+        <w:t>JSON)</w:t>
+      </w:r>
+      <w:r>
+        <w:rPr>
+          <w:rFonts w:ascii="Times New Roman" w:hAnsi="Times New Roman" w:cs="Times New Roman"/>
+          <w:color w:val="auto"/>
+          <w:lang w:val="en-US"/>
+        </w:rPr>
         <w:t xml:space="preserve">: </w:t>
       </w:r>
       <w:r>
@@ -6357,7 +7870,7 @@
         </w:rPr>
         <w:t xml:space="preserve"> </w:t>
       </w:r>
-      <w:hyperlink r:id="rId16" w:history="1">
+      <w:hyperlink r:id="rId17" w:history="1">
         <w:r>
           <w:rPr>
             <w:rStyle w:val="Collegamentoipertestuale"/>
@@ -6395,7 +7908,7 @@
         </w:rPr>
         <w:t xml:space="preserve">Repository del progetto: </w:t>
       </w:r>
-      <w:hyperlink r:id="rId17" w:history="1">
+      <w:hyperlink r:id="rId18" w:history="1">
         <w:r>
           <w:rPr>
             <w:rStyle w:val="Collegamentoipertestuale"/>
@@ -6413,12 +7926,12 @@
       </w:r>
     </w:p>
     <w:sectPr>
-      <w:headerReference w:type="even" r:id="rId18"/>
-      <w:headerReference w:type="default" r:id="rId19"/>
-      <w:footerReference w:type="even" r:id="rId20"/>
-      <w:footerReference w:type="default" r:id="rId21"/>
-      <w:headerReference w:type="first" r:id="rId22"/>
-      <w:footerReference w:type="first" r:id="rId23"/>
+      <w:headerReference w:type="even" r:id="rId19"/>
+      <w:headerReference w:type="default" r:id="rId20"/>
+      <w:footerReference w:type="even" r:id="rId21"/>
+      <w:footerReference w:type="default" r:id="rId22"/>
+      <w:headerReference w:type="first" r:id="rId23"/>
+      <w:footerReference w:type="first" r:id="rId24"/>
       <w:pgSz w:w="11906" w:h="16838"/>
       <w:pgMar w:top="1440" w:right="1440" w:bottom="1300" w:left="1440" w:header="708" w:footer="708" w:gutter="0"/>
       <w:cols w:space="720"/>
@@ -7222,6 +8735,7 @@
   <w:style w:type="character" w:default="1" w:styleId="Carpredefinitoparagrafo">
     <w:name w:val="Default Paragraph Font"/>
     <w:uiPriority w:val="1"/>
+    <w:semiHidden/>
     <w:unhideWhenUsed/>
   </w:style>
   <w:style w:type="table" w:default="1" w:styleId="Tabellanormale">

</xml_diff>

<commit_message>
docs: aggiornamento relazione tecnica (docx e pdf)
</commit_message>
<xml_diff>
--- a/Relazione_Tecnica_Yelp_AI_Suite_Fiorentini_Valerio_641622.docx
+++ b/Relazione_Tecnica_Yelp_AI_Suite_Fiorentini_Valerio_641622.docx
@@ -127,14 +127,27 @@
           <w:rFonts w:ascii="Times New Roman" w:hAnsi="Times New Roman" w:cs="Times New Roman"/>
           <w:color w:val="auto"/>
         </w:rPr>
-        <w:t xml:space="preserve">Codice sorgente: </w:t>
+        <w:t>Codice sorgente:</w:t>
+      </w:r>
+      <w:r>
+        <w:rPr>
+          <w:rFonts w:ascii="Times New Roman" w:hAnsi="Times New Roman" w:cs="Times New Roman"/>
+          <w:color w:val="auto"/>
+        </w:rPr>
+        <w:t xml:space="preserve"> </w:t>
+      </w:r>
+      <w:r>
+        <w:rPr>
+          <w:rFonts w:ascii="Times New Roman" w:hAnsi="Times New Roman" w:cs="Times New Roman"/>
+          <w:color w:val="auto"/>
+        </w:rPr>
+        <w:t xml:space="preserve"> </w:t>
       </w:r>
       <w:hyperlink r:id="rId7" w:history="1">
         <w:r>
           <w:rPr>
             <w:rStyle w:val="Collegamentoipertestuale"/>
             <w:rFonts w:ascii="Times New Roman" w:hAnsi="Times New Roman" w:cs="Times New Roman"/>
-            <w:color w:val="auto"/>
           </w:rPr>
           <w:t>https://github.com/valeriofiorentini/yelp-bigdata-mining-recommender</w:t>
         </w:r>
@@ -144,14 +157,7 @@
           <w:rFonts w:ascii="Times New Roman" w:hAnsi="Times New Roman" w:cs="Times New Roman"/>
           <w:color w:val="auto"/>
         </w:rPr>
-        <w:t xml:space="preserve"> </w:t>
-      </w:r>
-      <w:r>
-        <w:rPr>
-          <w:rFonts w:ascii="Times New Roman" w:hAnsi="Times New Roman" w:cs="Times New Roman"/>
-          <w:color w:val="auto"/>
-        </w:rPr>
-        <w:t xml:space="preserve">                             </w:t>
+        <w:t xml:space="preserve">                    </w:t>
       </w:r>
       <w:proofErr w:type="spellStart"/>
       <w:r>
@@ -242,7 +248,56 @@
           <w:rFonts w:ascii="Times New Roman" w:hAnsi="Times New Roman" w:cs="Times New Roman"/>
           <w:color w:val="auto"/>
         </w:rPr>
-        <w:t xml:space="preserve">Questa relazione descrive lo sviluppo di </w:t>
+        <w:t>L</w:t>
+      </w:r>
+      <w:r>
+        <w:rPr>
+          <w:rFonts w:ascii="Times New Roman" w:hAnsi="Times New Roman" w:cs="Times New Roman"/>
+          <w:color w:val="auto"/>
+        </w:rPr>
+        <w:t xml:space="preserve">a </w:t>
+      </w:r>
+      <w:r>
+        <w:rPr>
+          <w:rFonts w:ascii="Times New Roman" w:hAnsi="Times New Roman" w:cs="Times New Roman"/>
+          <w:color w:val="auto"/>
+        </w:rPr>
+        <w:t xml:space="preserve">presente </w:t>
+      </w:r>
+      <w:r>
+        <w:rPr>
+          <w:rFonts w:ascii="Times New Roman" w:hAnsi="Times New Roman" w:cs="Times New Roman"/>
+          <w:color w:val="auto"/>
+        </w:rPr>
+        <w:t>relazione</w:t>
+      </w:r>
+      <w:r>
+        <w:rPr>
+          <w:rFonts w:ascii="Times New Roman" w:hAnsi="Times New Roman" w:cs="Times New Roman"/>
+          <w:color w:val="auto"/>
+        </w:rPr>
+        <w:t xml:space="preserve"> si propone di</w:t>
+      </w:r>
+      <w:r>
+        <w:rPr>
+          <w:rFonts w:ascii="Times New Roman" w:hAnsi="Times New Roman" w:cs="Times New Roman"/>
+          <w:color w:val="auto"/>
+        </w:rPr>
+        <w:t xml:space="preserve"> descrive</w:t>
+      </w:r>
+      <w:r>
+        <w:rPr>
+          <w:rFonts w:ascii="Times New Roman" w:hAnsi="Times New Roman" w:cs="Times New Roman"/>
+          <w:color w:val="auto"/>
+        </w:rPr>
+        <w:t>re</w:t>
+      </w:r>
+      <w:r>
+        <w:rPr>
+          <w:rFonts w:ascii="Times New Roman" w:hAnsi="Times New Roman" w:cs="Times New Roman"/>
+          <w:color w:val="auto"/>
+        </w:rPr>
+        <w:t xml:space="preserve"> lo sviluppo di </w:t>
       </w:r>
       <w:proofErr w:type="spellStart"/>
       <w:r>
@@ -393,7 +448,35 @@
           <w:rFonts w:ascii="Times New Roman" w:hAnsi="Times New Roman" w:cs="Times New Roman"/>
           <w:color w:val="auto"/>
         </w:rPr>
-        <w:t xml:space="preserve">I risultati principali sono una compressione dei dati superiore al 95%, un </w:t>
+        <w:t>Si riportano come</w:t>
+      </w:r>
+      <w:r>
+        <w:rPr>
+          <w:rFonts w:ascii="Times New Roman" w:hAnsi="Times New Roman" w:cs="Times New Roman"/>
+          <w:color w:val="auto"/>
+        </w:rPr>
+        <w:t xml:space="preserve"> risultati principali</w:t>
+      </w:r>
+      <w:r>
+        <w:rPr>
+          <w:rFonts w:ascii="Times New Roman" w:hAnsi="Times New Roman" w:cs="Times New Roman"/>
+          <w:color w:val="auto"/>
+        </w:rPr>
+        <w:softHyphen/>
+      </w:r>
+      <w:r>
+        <w:rPr>
+          <w:rFonts w:ascii="Times New Roman" w:hAnsi="Times New Roman" w:cs="Times New Roman"/>
+          <w:color w:val="auto"/>
+        </w:rPr>
+        <w:t xml:space="preserve">: </w:t>
+      </w:r>
+      <w:r>
+        <w:rPr>
+          <w:rFonts w:ascii="Times New Roman" w:hAnsi="Times New Roman" w:cs="Times New Roman"/>
+          <w:color w:val="auto"/>
+        </w:rPr>
+        <w:t xml:space="preserve">una compressione dei dati superiore al 95%, un </w:t>
       </w:r>
       <w:r>
         <w:rPr>
@@ -472,21 +555,7 @@
           <w:rFonts w:ascii="Times New Roman" w:hAnsi="Times New Roman" w:cs="Times New Roman"/>
           <w:color w:val="auto"/>
         </w:rPr>
-        <w:t xml:space="preserve"> neurale, con un compromesso </w:t>
-      </w:r>
-      <w:r>
-        <w:rPr>
-          <w:rFonts w:ascii="Times New Roman" w:hAnsi="Times New Roman" w:cs="Times New Roman"/>
-          <w:color w:val="auto"/>
-        </w:rPr>
-        <w:t>misurabile</w:t>
-      </w:r>
-      <w:r>
-        <w:rPr>
-          <w:rFonts w:ascii="Times New Roman" w:hAnsi="Times New Roman" w:cs="Times New Roman"/>
-          <w:color w:val="auto"/>
-        </w:rPr>
-        <w:t xml:space="preserve"> tra latenza (</w:t>
+        <w:t xml:space="preserve"> neurale, con un compromesso misurabile tra latenza (</w:t>
       </w:r>
       <w:r>
         <w:rPr>
@@ -582,7 +651,21 @@
           <w:rFonts w:ascii="Times New Roman" w:hAnsi="Times New Roman" w:cs="Times New Roman"/>
           <w:color w:val="auto"/>
         </w:rPr>
-        <w:t>Lo scopo del progetto è sviluppare una suite di intelligenza artificiale per l'</w:t>
+        <w:t>Lo scopo del progetto è</w:t>
+      </w:r>
+      <w:r>
+        <w:rPr>
+          <w:rFonts w:ascii="Times New Roman" w:hAnsi="Times New Roman" w:cs="Times New Roman"/>
+          <w:color w:val="auto"/>
+        </w:rPr>
+        <w:t xml:space="preserve"> di</w:t>
+      </w:r>
+      <w:r>
+        <w:rPr>
+          <w:rFonts w:ascii="Times New Roman" w:hAnsi="Times New Roman" w:cs="Times New Roman"/>
+          <w:color w:val="auto"/>
+        </w:rPr>
+        <w:t xml:space="preserve"> sviluppare una suite di intelligenza artificiale per l'</w:t>
       </w:r>
       <w:r>
         <w:rPr>
@@ -607,7 +690,21 @@
           <w:rFonts w:ascii="Times New Roman" w:hAnsi="Times New Roman" w:cs="Times New Roman"/>
           <w:color w:val="auto"/>
         </w:rPr>
-        <w:t xml:space="preserve">, il </w:t>
+        <w:t xml:space="preserve">, </w:t>
+      </w:r>
+      <w:r>
+        <w:rPr>
+          <w:rFonts w:ascii="Times New Roman" w:hAnsi="Times New Roman" w:cs="Times New Roman"/>
+          <w:color w:val="auto"/>
+        </w:rPr>
+        <w:t xml:space="preserve">per </w:t>
+      </w:r>
+      <w:r>
+        <w:rPr>
+          <w:rFonts w:ascii="Times New Roman" w:hAnsi="Times New Roman" w:cs="Times New Roman"/>
+          <w:color w:val="auto"/>
+        </w:rPr>
+        <w:t xml:space="preserve">il </w:t>
       </w:r>
       <w:r>
         <w:rPr>
@@ -622,7 +719,21 @@
           <w:rFonts w:ascii="Times New Roman" w:hAnsi="Times New Roman" w:cs="Times New Roman"/>
           <w:color w:val="auto"/>
         </w:rPr>
-        <w:t xml:space="preserve"> e la </w:t>
+        <w:t xml:space="preserve"> e</w:t>
+      </w:r>
+      <w:r>
+        <w:rPr>
+          <w:rFonts w:ascii="Times New Roman" w:hAnsi="Times New Roman" w:cs="Times New Roman"/>
+          <w:color w:val="auto"/>
+        </w:rPr>
+        <w:t xml:space="preserve"> per</w:t>
+      </w:r>
+      <w:r>
+        <w:rPr>
+          <w:rFonts w:ascii="Times New Roman" w:hAnsi="Times New Roman" w:cs="Times New Roman"/>
+          <w:color w:val="auto"/>
+        </w:rPr>
+        <w:t xml:space="preserve"> la </w:t>
       </w:r>
       <w:r>
         <w:rPr>
@@ -699,7 +810,51 @@
           <w:rFonts w:ascii="Times New Roman" w:hAnsi="Times New Roman" w:cs="Times New Roman"/>
           <w:color w:val="auto"/>
         </w:rPr>
-        <w:t xml:space="preserve">. Il progetto si concentra sull'estrazione di conoscenza, l'analisi dei </w:t>
+        <w:t xml:space="preserve">. </w:t>
+      </w:r>
+      <w:r>
+        <w:rPr>
+          <w:rFonts w:ascii="Times New Roman" w:hAnsi="Times New Roman" w:cs="Times New Roman"/>
+          <w:color w:val="auto"/>
+        </w:rPr>
+        <w:t xml:space="preserve">Tale </w:t>
+      </w:r>
+      <w:r>
+        <w:rPr>
+          <w:rFonts w:ascii="Times New Roman" w:hAnsi="Times New Roman" w:cs="Times New Roman"/>
+          <w:color w:val="auto"/>
+        </w:rPr>
+        <w:t xml:space="preserve">progetto si concentra </w:t>
+      </w:r>
+      <w:proofErr w:type="gramStart"/>
+      <w:r>
+        <w:rPr>
+          <w:rFonts w:ascii="Times New Roman" w:hAnsi="Times New Roman" w:cs="Times New Roman"/>
+          <w:color w:val="auto"/>
+        </w:rPr>
+        <w:t>su</w:t>
+      </w:r>
+      <w:r>
+        <w:rPr>
+          <w:rFonts w:ascii="Times New Roman" w:hAnsi="Times New Roman" w:cs="Times New Roman"/>
+          <w:color w:val="auto"/>
+        </w:rPr>
+        <w:t xml:space="preserve"> </w:t>
+      </w:r>
+      <w:r>
+        <w:rPr>
+          <w:rFonts w:ascii="Times New Roman" w:hAnsi="Times New Roman" w:cs="Times New Roman"/>
+          <w:color w:val="auto"/>
+        </w:rPr>
+        <w:t xml:space="preserve"> analisi</w:t>
+      </w:r>
+      <w:proofErr w:type="gramEnd"/>
+      <w:r>
+        <w:rPr>
+          <w:rFonts w:ascii="Times New Roman" w:hAnsi="Times New Roman" w:cs="Times New Roman"/>
+          <w:color w:val="auto"/>
+        </w:rPr>
+        <w:t xml:space="preserve"> di </w:t>
       </w:r>
       <w:proofErr w:type="spellStart"/>
       <w:r>
@@ -715,7 +870,7 @@
           <w:rFonts w:ascii="Times New Roman" w:hAnsi="Times New Roman" w:cs="Times New Roman"/>
           <w:color w:val="auto"/>
         </w:rPr>
-        <w:t xml:space="preserve"> e la creazione di un </w:t>
+        <w:t xml:space="preserve"> e creazione di un </w:t>
       </w:r>
       <w:proofErr w:type="spellStart"/>
       <w:r>
@@ -757,7 +912,14 @@
           <w:rFonts w:ascii="Times New Roman" w:hAnsi="Times New Roman" w:cs="Times New Roman"/>
           <w:color w:val="auto"/>
         </w:rPr>
-        <w:t>Gli obiettivi tecnici sono stati:</w:t>
+        <w:t>Si riassumono gli obiettivi tecnici nei seguenti punti</w:t>
+      </w:r>
+      <w:r>
+        <w:rPr>
+          <w:rFonts w:ascii="Times New Roman" w:hAnsi="Times New Roman" w:cs="Times New Roman"/>
+          <w:color w:val="auto"/>
+        </w:rPr>
+        <w:t>:</w:t>
       </w:r>
     </w:p>
     <w:p>
@@ -778,7 +940,21 @@
           <w:rFonts w:ascii="Times New Roman" w:hAnsi="Times New Roman" w:cs="Times New Roman"/>
           <w:color w:val="auto"/>
         </w:rPr>
-        <w:t xml:space="preserve">Efficienza: elaborare il </w:t>
+        <w:t>Efficienza: elabora</w:t>
+      </w:r>
+      <w:r>
+        <w:rPr>
+          <w:rFonts w:ascii="Times New Roman" w:hAnsi="Times New Roman" w:cs="Times New Roman"/>
+          <w:color w:val="auto"/>
+        </w:rPr>
+        <w:t>zione de</w:t>
+      </w:r>
+      <w:r>
+        <w:rPr>
+          <w:rFonts w:ascii="Times New Roman" w:hAnsi="Times New Roman" w:cs="Times New Roman"/>
+          <w:color w:val="auto"/>
+        </w:rPr>
+        <w:t xml:space="preserve">l </w:t>
       </w:r>
       <w:r>
         <w:rPr>
@@ -823,7 +999,21 @@
           <w:rFonts w:ascii="Times New Roman" w:hAnsi="Times New Roman" w:cs="Times New Roman"/>
           <w:color w:val="auto"/>
         </w:rPr>
-        <w:t xml:space="preserve"> offrire esplorazione geospaziale, analisi delle reti sociali e dei testi delle recensioni.</w:t>
+        <w:t xml:space="preserve"> </w:t>
+      </w:r>
+      <w:r>
+        <w:rPr>
+          <w:rFonts w:ascii="Times New Roman" w:hAnsi="Times New Roman" w:cs="Times New Roman"/>
+          <w:color w:val="auto"/>
+        </w:rPr>
+        <w:t xml:space="preserve">disponibilità di </w:t>
+      </w:r>
+      <w:r>
+        <w:rPr>
+          <w:rFonts w:ascii="Times New Roman" w:hAnsi="Times New Roman" w:cs="Times New Roman"/>
+          <w:color w:val="auto"/>
+        </w:rPr>
+        <w:t>esplorazione geospaziale, analisi delle reti sociali e dei testi delle recensioni.</w:t>
       </w:r>
     </w:p>
     <w:p>
@@ -853,7 +1043,21 @@
           <w:rFonts w:ascii="Times New Roman" w:hAnsi="Times New Roman" w:cs="Times New Roman"/>
           <w:color w:val="auto"/>
         </w:rPr>
-        <w:t xml:space="preserve"> suggerire ristoranti e locali affini ai gusti dell'utente con tre approcci complementari.</w:t>
+        <w:t xml:space="preserve"> </w:t>
+      </w:r>
+      <w:r>
+        <w:rPr>
+          <w:rFonts w:ascii="Times New Roman" w:hAnsi="Times New Roman" w:cs="Times New Roman"/>
+          <w:color w:val="auto"/>
+        </w:rPr>
+        <w:t xml:space="preserve">presenza di suggerimenti di </w:t>
+      </w:r>
+      <w:r>
+        <w:rPr>
+          <w:rFonts w:ascii="Times New Roman" w:hAnsi="Times New Roman" w:cs="Times New Roman"/>
+          <w:color w:val="auto"/>
+        </w:rPr>
+        <w:t>ristoranti e locali affini ai gusti dell'utente con tre approcci complementari.</w:t>
       </w:r>
     </w:p>
     <w:p>
@@ -889,7 +1093,7 @@
           <w:rFonts w:ascii="Times New Roman" w:hAnsi="Times New Roman" w:cs="Times New Roman"/>
           <w:color w:val="auto"/>
         </w:rPr>
-        <w:t>lità: rendere tutto accessi</w:t>
+        <w:t>lità: accessi</w:t>
       </w:r>
       <w:r>
         <w:rPr>
@@ -904,7 +1108,35 @@
           <w:rFonts w:ascii="Times New Roman" w:hAnsi="Times New Roman" w:cs="Times New Roman"/>
           <w:color w:val="auto"/>
         </w:rPr>
-        <w:t xml:space="preserve">le tramite una </w:t>
+        <w:t>l</w:t>
+      </w:r>
+      <w:r>
+        <w:rPr>
+          <w:rFonts w:ascii="Times New Roman" w:hAnsi="Times New Roman" w:cs="Times New Roman"/>
+          <w:color w:val="auto"/>
+        </w:rPr>
+        <w:t>ità</w:t>
+      </w:r>
+      <w:r>
+        <w:rPr>
+          <w:rFonts w:ascii="Times New Roman" w:hAnsi="Times New Roman" w:cs="Times New Roman"/>
+          <w:color w:val="auto"/>
+        </w:rPr>
+        <w:t xml:space="preserve"> </w:t>
+      </w:r>
+      <w:r>
+        <w:rPr>
+          <w:rFonts w:ascii="Times New Roman" w:hAnsi="Times New Roman" w:cs="Times New Roman"/>
+          <w:color w:val="auto"/>
+        </w:rPr>
+        <w:t xml:space="preserve">resa possibile </w:t>
+      </w:r>
+      <w:r>
+        <w:rPr>
+          <w:rFonts w:ascii="Times New Roman" w:hAnsi="Times New Roman" w:cs="Times New Roman"/>
+          <w:color w:val="auto"/>
+        </w:rPr>
+        <w:t xml:space="preserve">tramite una </w:t>
       </w:r>
       <w:r>
         <w:rPr>
@@ -1267,7 +1499,21 @@
           <w:rFonts w:ascii="Times New Roman" w:hAnsi="Times New Roman" w:cs="Times New Roman"/>
           <w:color w:val="auto"/>
         </w:rPr>
-        <w:t>Le librerie Python sono state scelte per bilanciare il carico computazionale, evitare crash di memoria e garantire un'esplorazione in tempo reale.</w:t>
+        <w:t xml:space="preserve">Le librerie Python </w:t>
+      </w:r>
+      <w:r>
+        <w:rPr>
+          <w:rFonts w:ascii="Times New Roman" w:hAnsi="Times New Roman" w:cs="Times New Roman"/>
+          <w:color w:val="auto"/>
+        </w:rPr>
+        <w:t>vengono</w:t>
+      </w:r>
+      <w:r>
+        <w:rPr>
+          <w:rFonts w:ascii="Times New Roman" w:hAnsi="Times New Roman" w:cs="Times New Roman"/>
+          <w:color w:val="auto"/>
+        </w:rPr>
+        <w:t xml:space="preserve"> scelte per bilanciare il carico computazionale, evitare crash di memoria e garantire un'esplorazione in tempo reale.</w:t>
       </w:r>
     </w:p>
     <w:tbl>
@@ -2518,7 +2764,44 @@
           <w:rFonts w:ascii="Times New Roman" w:hAnsi="Times New Roman" w:cs="Times New Roman"/>
           <w:color w:val="auto"/>
         </w:rPr>
-        <w:t xml:space="preserve">roccio ha prodotto una base dati solida per le successive fasi di </w:t>
+        <w:t xml:space="preserve">roccio </w:t>
+      </w:r>
+      <w:proofErr w:type="gramStart"/>
+      <w:r>
+        <w:rPr>
+          <w:rFonts w:ascii="Times New Roman" w:hAnsi="Times New Roman" w:cs="Times New Roman"/>
+          <w:color w:val="auto"/>
+        </w:rPr>
+        <w:t>difatti  serve</w:t>
+      </w:r>
+      <w:proofErr w:type="gramEnd"/>
+      <w:r>
+        <w:rPr>
+          <w:rFonts w:ascii="Times New Roman" w:hAnsi="Times New Roman" w:cs="Times New Roman"/>
+          <w:color w:val="auto"/>
+        </w:rPr>
+        <w:t xml:space="preserve"> a </w:t>
+      </w:r>
+      <w:r>
+        <w:rPr>
+          <w:rFonts w:ascii="Times New Roman" w:hAnsi="Times New Roman" w:cs="Times New Roman"/>
+          <w:color w:val="auto"/>
+        </w:rPr>
+        <w:t>prod</w:t>
+      </w:r>
+      <w:r>
+        <w:rPr>
+          <w:rFonts w:ascii="Times New Roman" w:hAnsi="Times New Roman" w:cs="Times New Roman"/>
+          <w:color w:val="auto"/>
+        </w:rPr>
+        <w:t>urre</w:t>
+      </w:r>
+      <w:r>
+        <w:rPr>
+          <w:rFonts w:ascii="Times New Roman" w:hAnsi="Times New Roman" w:cs="Times New Roman"/>
+          <w:color w:val="auto"/>
+        </w:rPr>
+        <w:t xml:space="preserve"> una base dati solida per le successive fasi di </w:t>
       </w:r>
       <w:r>
         <w:rPr>
@@ -2602,7 +2885,42 @@
           <w:rFonts w:ascii="Times New Roman" w:hAnsi="Times New Roman" w:cs="Times New Roman"/>
           <w:color w:val="auto"/>
         </w:rPr>
-        <w:t xml:space="preserve">I dati testuali e categorici vengono normalizzati. Descrizioni e categorie senza classificazione sono rimosse per evitare rumore. Sul testo delle recensioni si eliminano le </w:t>
+        <w:t>I dati testuali e categorici vengono normalizzati</w:t>
+      </w:r>
+      <w:r>
+        <w:rPr>
+          <w:rFonts w:ascii="Times New Roman" w:hAnsi="Times New Roman" w:cs="Times New Roman"/>
+          <w:color w:val="auto"/>
+        </w:rPr>
+        <w:t xml:space="preserve">; </w:t>
+      </w:r>
+      <w:r>
+        <w:rPr>
+          <w:rFonts w:ascii="Times New Roman" w:hAnsi="Times New Roman" w:cs="Times New Roman"/>
+          <w:color w:val="auto"/>
+        </w:rPr>
+        <w:t>descrizioni</w:t>
+      </w:r>
+      <w:r>
+        <w:rPr>
+          <w:rFonts w:ascii="Times New Roman" w:hAnsi="Times New Roman" w:cs="Times New Roman"/>
+          <w:color w:val="auto"/>
+        </w:rPr>
+        <w:t xml:space="preserve"> e categorie </w:t>
+      </w:r>
+      <w:r>
+        <w:rPr>
+          <w:rFonts w:ascii="Times New Roman" w:hAnsi="Times New Roman" w:cs="Times New Roman"/>
+          <w:color w:val="auto"/>
+        </w:rPr>
+        <w:t xml:space="preserve">prive di </w:t>
+      </w:r>
+      <w:r>
+        <w:rPr>
+          <w:rFonts w:ascii="Times New Roman" w:hAnsi="Times New Roman" w:cs="Times New Roman"/>
+          <w:color w:val="auto"/>
+        </w:rPr>
+        <w:t xml:space="preserve">classificazione sono rimosse per evitare rumore. Sul testo delle recensioni si eliminano le </w:t>
       </w:r>
       <w:r>
         <w:rPr>
@@ -2647,7 +2965,21 @@
           <w:rFonts w:ascii="Times New Roman" w:hAnsi="Times New Roman" w:cs="Times New Roman"/>
           <w:color w:val="auto"/>
         </w:rPr>
-        <w:t xml:space="preserve"> (stelle) sono </w:t>
+        <w:t xml:space="preserve"> (stelle) </w:t>
+      </w:r>
+      <w:r>
+        <w:rPr>
+          <w:rFonts w:ascii="Times New Roman" w:hAnsi="Times New Roman" w:cs="Times New Roman"/>
+          <w:color w:val="auto"/>
+        </w:rPr>
+        <w:t>risultano</w:t>
+      </w:r>
+      <w:r>
+        <w:rPr>
+          <w:rFonts w:ascii="Times New Roman" w:hAnsi="Times New Roman" w:cs="Times New Roman"/>
+          <w:color w:val="auto"/>
+        </w:rPr>
+        <w:t xml:space="preserve"> </w:t>
       </w:r>
       <w:r>
         <w:rPr>
@@ -2742,7 +3074,35 @@
           <w:rFonts w:ascii="Times New Roman" w:hAnsi="Times New Roman" w:cs="Times New Roman"/>
           <w:color w:val="auto"/>
         </w:rPr>
-        <w:t xml:space="preserve"> ha evidenziato dinamiche temporali chiare: i picchi di affluenza, individuati con matrici giorno/ora, si concentrano il venerdì e il sabato sera. L'analisi cartografica ha permesso di confrontare la struttura delle reti urbane (ad esempio la griglia ortogonale di Las Vegas rispetto alle città europee) tramite m</w:t>
+        <w:t xml:space="preserve"> ha evidenziato dinamiche temporali chiare: i picchi di affluenza, individuati con matrici giorno/ora, si concentrano</w:t>
+      </w:r>
+      <w:r>
+        <w:rPr>
+          <w:rFonts w:ascii="Times New Roman" w:hAnsi="Times New Roman" w:cs="Times New Roman"/>
+          <w:color w:val="auto"/>
+        </w:rPr>
+        <w:t xml:space="preserve"> tra</w:t>
+      </w:r>
+      <w:r>
+        <w:rPr>
+          <w:rFonts w:ascii="Times New Roman" w:hAnsi="Times New Roman" w:cs="Times New Roman"/>
+          <w:color w:val="auto"/>
+        </w:rPr>
+        <w:t xml:space="preserve"> il venerdì e il sabato sera. L'analisi cartografica ha permesso di confrontare la struttura delle reti urbane (ad esempio</w:t>
+      </w:r>
+      <w:r>
+        <w:rPr>
+          <w:rFonts w:ascii="Times New Roman" w:hAnsi="Times New Roman" w:cs="Times New Roman"/>
+          <w:color w:val="auto"/>
+        </w:rPr>
+        <w:t>,</w:t>
+      </w:r>
+      <w:r>
+        <w:rPr>
+          <w:rFonts w:ascii="Times New Roman" w:hAnsi="Times New Roman" w:cs="Times New Roman"/>
+          <w:color w:val="auto"/>
+        </w:rPr>
+        <w:t xml:space="preserve"> la griglia ortogonale di Las Vegas rispetto alle città europee) tramite m</w:t>
       </w:r>
       <w:r>
         <w:rPr>
@@ -2928,7 +3288,28 @@
           <w:rFonts w:ascii="Times New Roman" w:hAnsi="Times New Roman" w:cs="Times New Roman"/>
           <w:color w:val="auto"/>
         </w:rPr>
-        <w:t>. Tre sono le analisi principali:</w:t>
+        <w:t xml:space="preserve">. </w:t>
+      </w:r>
+      <w:r>
+        <w:rPr>
+          <w:rFonts w:ascii="Times New Roman" w:hAnsi="Times New Roman" w:cs="Times New Roman"/>
+          <w:color w:val="auto"/>
+        </w:rPr>
+        <w:t xml:space="preserve"> Da ciò si possono dedurre delle</w:t>
+      </w:r>
+      <w:r>
+        <w:rPr>
+          <w:rFonts w:ascii="Times New Roman" w:hAnsi="Times New Roman" w:cs="Times New Roman"/>
+          <w:color w:val="auto"/>
+        </w:rPr>
+        <w:t xml:space="preserve"> peculiarità:</w:t>
+      </w:r>
+      <w:r>
+        <w:rPr>
+          <w:rFonts w:ascii="Times New Roman" w:hAnsi="Times New Roman" w:cs="Times New Roman"/>
+          <w:color w:val="auto"/>
+        </w:rPr>
+        <w:t xml:space="preserve"> </w:t>
       </w:r>
     </w:p>
     <w:p>
@@ -2957,7 +3338,21 @@
           <w:rFonts w:ascii="Times New Roman" w:hAnsi="Times New Roman" w:cs="Times New Roman"/>
           <w:color w:val="auto"/>
         </w:rPr>
-        <w:t xml:space="preserve">: gli utenti più influenti sono estratti tramite </w:t>
+        <w:t xml:space="preserve">: gli utenti più influenti </w:t>
+      </w:r>
+      <w:r>
+        <w:rPr>
+          <w:rFonts w:ascii="Times New Roman" w:hAnsi="Times New Roman" w:cs="Times New Roman"/>
+          <w:color w:val="auto"/>
+        </w:rPr>
+        <w:t xml:space="preserve">vengono </w:t>
+      </w:r>
+      <w:r>
+        <w:rPr>
+          <w:rFonts w:ascii="Times New Roman" w:hAnsi="Times New Roman" w:cs="Times New Roman"/>
+          <w:color w:val="auto"/>
+        </w:rPr>
+        <w:t xml:space="preserve">estratti tramite </w:t>
       </w:r>
       <w:r>
         <w:rPr>
@@ -3018,7 +3413,49 @@
           <w:rFonts w:ascii="Times New Roman" w:hAnsi="Times New Roman" w:cs="Times New Roman"/>
           <w:color w:val="auto"/>
         </w:rPr>
-        <w:t>: l'80% degli utenti scrive al massimo 5 recensioni, mentre pochi utenti molto attivi concentrano gran parte dell'attività.</w:t>
+        <w:t xml:space="preserve">: l'80% degli utenti </w:t>
+      </w:r>
+      <w:r>
+        <w:rPr>
+          <w:rFonts w:ascii="Times New Roman" w:hAnsi="Times New Roman" w:cs="Times New Roman"/>
+          <w:color w:val="auto"/>
+        </w:rPr>
+        <w:t>esegue</w:t>
+      </w:r>
+      <w:r>
+        <w:rPr>
+          <w:rFonts w:ascii="Times New Roman" w:hAnsi="Times New Roman" w:cs="Times New Roman"/>
+          <w:color w:val="auto"/>
+        </w:rPr>
+        <w:t xml:space="preserve"> al massimo 5 recensioni, mentre pochi utenti</w:t>
+      </w:r>
+      <w:r>
+        <w:rPr>
+          <w:rFonts w:ascii="Times New Roman" w:hAnsi="Times New Roman" w:cs="Times New Roman"/>
+          <w:color w:val="auto"/>
+        </w:rPr>
+        <w:t xml:space="preserve"> si dimostrano particolarmente</w:t>
+      </w:r>
+      <w:r>
+        <w:rPr>
+          <w:rFonts w:ascii="Times New Roman" w:hAnsi="Times New Roman" w:cs="Times New Roman"/>
+          <w:color w:val="auto"/>
+        </w:rPr>
+        <w:t xml:space="preserve"> attivi</w:t>
+      </w:r>
+      <w:r>
+        <w:rPr>
+          <w:rFonts w:ascii="Times New Roman" w:hAnsi="Times New Roman" w:cs="Times New Roman"/>
+          <w:color w:val="auto"/>
+        </w:rPr>
+        <w:t xml:space="preserve"> tanto da rappresentare</w:t>
+      </w:r>
+      <w:r>
+        <w:rPr>
+          <w:rFonts w:ascii="Times New Roman" w:hAnsi="Times New Roman" w:cs="Times New Roman"/>
+          <w:color w:val="auto"/>
+        </w:rPr>
+        <w:t xml:space="preserve"> gran parte dell'attività.</w:t>
       </w:r>
     </w:p>
     <w:p>
@@ -3275,7 +3712,14 @@
           <w:rFonts w:ascii="Times New Roman" w:hAnsi="Times New Roman" w:cs="Times New Roman"/>
           <w:color w:val="auto"/>
         </w:rPr>
-        <w:t xml:space="preserve">Attraverso il </w:t>
+        <w:t>Mediante</w:t>
+      </w:r>
+      <w:r>
+        <w:rPr>
+          <w:rFonts w:ascii="Times New Roman" w:hAnsi="Times New Roman" w:cs="Times New Roman"/>
+          <w:color w:val="auto"/>
+        </w:rPr>
+        <w:t xml:space="preserve"> il </w:t>
       </w:r>
       <w:r>
         <w:rPr>
@@ -3290,7 +3734,28 @@
           <w:rFonts w:ascii="Times New Roman" w:hAnsi="Times New Roman" w:cs="Times New Roman"/>
           <w:color w:val="auto"/>
         </w:rPr>
-        <w:t xml:space="preserve"> i testi delle recensioni sono trasformati in r</w:t>
+        <w:t xml:space="preserve">, </w:t>
+      </w:r>
+      <w:r>
+        <w:rPr>
+          <w:rFonts w:ascii="Times New Roman" w:hAnsi="Times New Roman" w:cs="Times New Roman"/>
+          <w:color w:val="auto"/>
+        </w:rPr>
+        <w:t xml:space="preserve">i testi delle recensioni </w:t>
+      </w:r>
+      <w:r>
+        <w:rPr>
+          <w:rFonts w:ascii="Times New Roman" w:hAnsi="Times New Roman" w:cs="Times New Roman"/>
+          <w:color w:val="auto"/>
+        </w:rPr>
+        <w:t>vengon</w:t>
+      </w:r>
+      <w:r>
+        <w:rPr>
+          <w:rFonts w:ascii="Times New Roman" w:hAnsi="Times New Roman" w:cs="Times New Roman"/>
+          <w:color w:val="auto"/>
+        </w:rPr>
+        <w:t>o trasformati in r</w:t>
       </w:r>
       <w:r>
         <w:rPr>
@@ -3567,7 +4032,14 @@
           <w:rFonts w:ascii="Times New Roman" w:hAnsi="Times New Roman" w:cs="Times New Roman"/>
           <w:color w:val="auto"/>
         </w:rPr>
-        <w:t xml:space="preserve"> addestrata sulla matrice </w:t>
+        <w:t xml:space="preserve">, </w:t>
+      </w:r>
+      <w:r>
+        <w:rPr>
+          <w:rFonts w:ascii="Times New Roman" w:hAnsi="Times New Roman" w:cs="Times New Roman"/>
+          <w:color w:val="auto"/>
+        </w:rPr>
+        <w:t xml:space="preserve">addestrata sulla matrice </w:t>
       </w:r>
       <w:r>
         <w:rPr>
@@ -3582,7 +4054,70 @@
           <w:rFonts w:ascii="Times New Roman" w:hAnsi="Times New Roman" w:cs="Times New Roman"/>
           <w:color w:val="auto"/>
         </w:rPr>
-        <w:t xml:space="preserve"> classifica il testo inserito dall'utente come positivo o negativo in tempo reale. Come modello di confronto è stato usato un </w:t>
+        <w:t xml:space="preserve">, valuta </w:t>
+      </w:r>
+      <w:r>
+        <w:rPr>
+          <w:rFonts w:ascii="Times New Roman" w:hAnsi="Times New Roman" w:cs="Times New Roman"/>
+          <w:color w:val="auto"/>
+        </w:rPr>
+        <w:t xml:space="preserve">il testo inserito dall'utente </w:t>
+      </w:r>
+      <w:r>
+        <w:rPr>
+          <w:rFonts w:ascii="Times New Roman" w:hAnsi="Times New Roman" w:cs="Times New Roman"/>
+          <w:color w:val="auto"/>
+        </w:rPr>
+        <w:t xml:space="preserve">in modo </w:t>
+      </w:r>
+      <w:r>
+        <w:rPr>
+          <w:rFonts w:ascii="Times New Roman" w:hAnsi="Times New Roman" w:cs="Times New Roman"/>
+          <w:color w:val="auto"/>
+        </w:rPr>
+        <w:t xml:space="preserve">positivo o negativo in tempo reale. </w:t>
+      </w:r>
+      <w:r>
+        <w:rPr>
+          <w:rFonts w:ascii="Times New Roman" w:hAnsi="Times New Roman" w:cs="Times New Roman"/>
+          <w:color w:val="auto"/>
+        </w:rPr>
+        <w:t>Come</w:t>
+      </w:r>
+      <w:r>
+        <w:rPr>
+          <w:rFonts w:ascii="Times New Roman" w:hAnsi="Times New Roman" w:cs="Times New Roman"/>
+          <w:color w:val="auto"/>
+        </w:rPr>
+        <w:t xml:space="preserve"> modello di confronto</w:t>
+      </w:r>
+      <w:r>
+        <w:rPr>
+          <w:rFonts w:ascii="Times New Roman" w:hAnsi="Times New Roman" w:cs="Times New Roman"/>
+          <w:color w:val="auto"/>
+        </w:rPr>
+        <w:t>,</w:t>
+      </w:r>
+      <w:r>
+        <w:rPr>
+          <w:rFonts w:ascii="Times New Roman" w:hAnsi="Times New Roman" w:cs="Times New Roman"/>
+          <w:color w:val="auto"/>
+        </w:rPr>
+        <w:t xml:space="preserve"> è stato</w:t>
+      </w:r>
+      <w:r>
+        <w:rPr>
+          <w:rFonts w:ascii="Times New Roman" w:hAnsi="Times New Roman" w:cs="Times New Roman"/>
+          <w:color w:val="auto"/>
+        </w:rPr>
+        <w:t xml:space="preserve"> scelto</w:t>
+      </w:r>
+      <w:r>
+        <w:rPr>
+          <w:rFonts w:ascii="Times New Roman" w:hAnsi="Times New Roman" w:cs="Times New Roman"/>
+          <w:color w:val="auto"/>
+        </w:rPr>
+        <w:t xml:space="preserve"> un </w:t>
       </w:r>
       <w:proofErr w:type="spellStart"/>
       <w:r>
@@ -3625,7 +4160,75 @@
           <w:rFonts w:ascii="Times New Roman" w:hAnsi="Times New Roman" w:cs="Times New Roman"/>
           <w:color w:val="auto"/>
         </w:rPr>
-        <w:t>. Per gestire lo s</w:t>
+        <w:t xml:space="preserve">. </w:t>
+      </w:r>
+    </w:p>
+    <w:p>
+      <w:pPr>
+        <w:spacing w:after="120" w:line="300" w:lineRule="auto"/>
+        <w:jc w:val="both"/>
+        <w:rPr>
+          <w:rFonts w:ascii="Times New Roman" w:hAnsi="Times New Roman" w:cs="Times New Roman"/>
+          <w:color w:val="auto"/>
+        </w:rPr>
+      </w:pPr>
+      <w:proofErr w:type="gramStart"/>
+      <w:r>
+        <w:rPr>
+          <w:rFonts w:ascii="Times New Roman" w:hAnsi="Times New Roman" w:cs="Times New Roman"/>
+          <w:color w:val="auto"/>
+        </w:rPr>
+        <w:t xml:space="preserve">Per </w:t>
+      </w:r>
+      <w:r>
+        <w:rPr>
+          <w:rFonts w:ascii="Times New Roman" w:hAnsi="Times New Roman" w:cs="Times New Roman"/>
+          <w:color w:val="auto"/>
+        </w:rPr>
+        <w:t xml:space="preserve"> quanto</w:t>
+      </w:r>
+      <w:proofErr w:type="gramEnd"/>
+      <w:r>
+        <w:rPr>
+          <w:rFonts w:ascii="Times New Roman" w:hAnsi="Times New Roman" w:cs="Times New Roman"/>
+          <w:color w:val="auto"/>
+        </w:rPr>
+        <w:t xml:space="preserve"> riguarda la </w:t>
+      </w:r>
+      <w:r>
+        <w:rPr>
+          <w:rFonts w:ascii="Times New Roman" w:hAnsi="Times New Roman" w:cs="Times New Roman"/>
+          <w:color w:val="auto"/>
+        </w:rPr>
+        <w:t>gesti</w:t>
+      </w:r>
+      <w:r>
+        <w:rPr>
+          <w:rFonts w:ascii="Times New Roman" w:hAnsi="Times New Roman" w:cs="Times New Roman"/>
+          <w:color w:val="auto"/>
+        </w:rPr>
+        <w:t>one</w:t>
+      </w:r>
+      <w:r>
+        <w:rPr>
+          <w:rFonts w:ascii="Times New Roman" w:hAnsi="Times New Roman" w:cs="Times New Roman"/>
+          <w:color w:val="auto"/>
+        </w:rPr>
+        <w:t xml:space="preserve"> </w:t>
+      </w:r>
+      <w:r>
+        <w:rPr>
+          <w:rFonts w:ascii="Times New Roman" w:hAnsi="Times New Roman" w:cs="Times New Roman"/>
+          <w:color w:val="auto"/>
+        </w:rPr>
+        <w:t>del</w:t>
+      </w:r>
+      <w:r>
+        <w:rPr>
+          <w:rFonts w:ascii="Times New Roman" w:hAnsi="Times New Roman" w:cs="Times New Roman"/>
+          <w:color w:val="auto"/>
+        </w:rPr>
+        <w:t>lo s</w:t>
       </w:r>
       <w:r>
         <w:rPr>
@@ -3640,7 +4243,70 @@
           <w:rFonts w:ascii="Times New Roman" w:hAnsi="Times New Roman" w:cs="Times New Roman"/>
           <w:color w:val="auto"/>
         </w:rPr>
-        <w:t>lanciamento delle classi e valutare l'equilibrio tra falsi positivi e falsi negativi, la validazione si è basata sull'</w:t>
+        <w:t>lanciamento delle classi e</w:t>
+      </w:r>
+      <w:r>
+        <w:rPr>
+          <w:rFonts w:ascii="Times New Roman" w:hAnsi="Times New Roman" w:cs="Times New Roman"/>
+          <w:color w:val="auto"/>
+        </w:rPr>
+        <w:t xml:space="preserve"> la</w:t>
+      </w:r>
+      <w:r>
+        <w:rPr>
+          <w:rFonts w:ascii="Times New Roman" w:hAnsi="Times New Roman" w:cs="Times New Roman"/>
+          <w:color w:val="auto"/>
+        </w:rPr>
+        <w:t xml:space="preserve"> valuta</w:t>
+      </w:r>
+      <w:r>
+        <w:rPr>
+          <w:rFonts w:ascii="Times New Roman" w:hAnsi="Times New Roman" w:cs="Times New Roman"/>
+          <w:color w:val="auto"/>
+        </w:rPr>
+        <w:t>zione</w:t>
+      </w:r>
+      <w:r>
+        <w:rPr>
+          <w:rFonts w:ascii="Times New Roman" w:hAnsi="Times New Roman" w:cs="Times New Roman"/>
+          <w:color w:val="auto"/>
+        </w:rPr>
+        <w:t xml:space="preserve"> </w:t>
+      </w:r>
+      <w:r>
+        <w:rPr>
+          <w:rFonts w:ascii="Times New Roman" w:hAnsi="Times New Roman" w:cs="Times New Roman"/>
+          <w:color w:val="auto"/>
+        </w:rPr>
+        <w:t xml:space="preserve">di </w:t>
+      </w:r>
+      <w:r>
+        <w:rPr>
+          <w:rFonts w:ascii="Times New Roman" w:hAnsi="Times New Roman" w:cs="Times New Roman"/>
+          <w:color w:val="auto"/>
+        </w:rPr>
+        <w:t xml:space="preserve">equilibrio tra falsi positivi e falsi negativi, la validazione </w:t>
+      </w:r>
+      <w:r>
+        <w:rPr>
+          <w:rFonts w:ascii="Times New Roman" w:hAnsi="Times New Roman" w:cs="Times New Roman"/>
+          <w:color w:val="auto"/>
+        </w:rPr>
+        <w:t>si fonda</w:t>
+      </w:r>
+      <w:r>
+        <w:rPr>
+          <w:rFonts w:ascii="Times New Roman" w:hAnsi="Times New Roman" w:cs="Times New Roman"/>
+          <w:color w:val="auto"/>
+        </w:rPr>
+        <w:t xml:space="preserve"> su</w:t>
+      </w:r>
+      <w:r>
+        <w:rPr>
+          <w:rFonts w:ascii="Times New Roman" w:hAnsi="Times New Roman" w:cs="Times New Roman"/>
+          <w:color w:val="auto"/>
+        </w:rPr>
+        <w:t xml:space="preserve"> </w:t>
       </w:r>
       <w:r>
         <w:rPr>
@@ -3887,7 +4553,94 @@
           <w:rFonts w:ascii="Times New Roman" w:hAnsi="Times New Roman" w:cs="Times New Roman"/>
           <w:color w:val="auto"/>
         </w:rPr>
-        <w:t xml:space="preserve"> raggruppa i concetti espressi dai clienti in cinque macro-temi: servizio, cibo, attese, prezzo e atmosfera. Com</w:t>
+        <w:t xml:space="preserve"> raggruppa </w:t>
+      </w:r>
+      <w:r>
+        <w:rPr>
+          <w:rFonts w:ascii="Times New Roman" w:hAnsi="Times New Roman" w:cs="Times New Roman"/>
+          <w:color w:val="auto"/>
+        </w:rPr>
+        <w:t xml:space="preserve">le opinioni esposte </w:t>
+      </w:r>
+      <w:r>
+        <w:rPr>
+          <w:rFonts w:ascii="Times New Roman" w:hAnsi="Times New Roman" w:cs="Times New Roman"/>
+          <w:color w:val="auto"/>
+        </w:rPr>
+        <w:t xml:space="preserve">dai clienti in cinque macro-temi: servizio, cibo, attese, prezzo e atmosfera. </w:t>
+      </w:r>
+      <w:r>
+        <w:rPr>
+          <w:rFonts w:ascii="Times New Roman" w:hAnsi="Times New Roman" w:cs="Times New Roman"/>
+          <w:color w:val="auto"/>
+        </w:rPr>
+        <w:t>La combinazione di</w:t>
+      </w:r>
+      <w:r>
+        <w:rPr>
+          <w:rFonts w:ascii="Times New Roman" w:hAnsi="Times New Roman" w:cs="Times New Roman"/>
+          <w:color w:val="auto"/>
+        </w:rPr>
+        <w:t xml:space="preserve"> </w:t>
+      </w:r>
+      <w:r>
+        <w:rPr>
+          <w:rFonts w:ascii="Times New Roman" w:hAnsi="Times New Roman" w:cs="Times New Roman"/>
+          <w:color w:val="auto"/>
+        </w:rPr>
+        <w:t>vari</w:t>
+      </w:r>
+      <w:r>
+        <w:rPr>
+          <w:rFonts w:ascii="Times New Roman" w:hAnsi="Times New Roman" w:cs="Times New Roman"/>
+          <w:color w:val="auto"/>
+        </w:rPr>
+        <w:t xml:space="preserve"> </w:t>
+      </w:r>
+      <w:proofErr w:type="spellStart"/>
+      <w:r>
+        <w:rPr>
+          <w:rFonts w:ascii="Times New Roman" w:hAnsi="Times New Roman" w:cs="Times New Roman"/>
+          <w:color w:val="auto"/>
+        </w:rPr>
+        <w:t>topic</w:t>
+      </w:r>
+      <w:proofErr w:type="spellEnd"/>
+      <w:r>
+        <w:rPr>
+          <w:rFonts w:ascii="Times New Roman" w:hAnsi="Times New Roman" w:cs="Times New Roman"/>
+          <w:color w:val="auto"/>
+        </w:rPr>
+        <w:t xml:space="preserve"> con i </w:t>
+      </w:r>
+      <w:r>
+        <w:rPr>
+          <w:rFonts w:ascii="Times New Roman" w:hAnsi="Times New Roman" w:cs="Times New Roman"/>
+          <w:i/>
+          <w:color w:val="auto"/>
+        </w:rPr>
+        <w:t>rating</w:t>
+      </w:r>
+      <w:r>
+        <w:rPr>
+          <w:rFonts w:ascii="Times New Roman" w:hAnsi="Times New Roman" w:cs="Times New Roman"/>
+          <w:color w:val="auto"/>
+        </w:rPr>
+        <w:t xml:space="preserve"> </w:t>
+      </w:r>
+      <w:r>
+        <w:rPr>
+          <w:rFonts w:ascii="Times New Roman" w:hAnsi="Times New Roman" w:cs="Times New Roman"/>
+          <w:color w:val="auto"/>
+        </w:rPr>
+        <w:t>rende</w:t>
+      </w:r>
+      <w:r>
+        <w:rPr>
+          <w:rFonts w:ascii="Times New Roman" w:hAnsi="Times New Roman" w:cs="Times New Roman"/>
+          <w:color w:val="auto"/>
+        </w:rPr>
+        <w:t xml:space="preserve"> possi</w:t>
       </w:r>
       <w:r>
         <w:rPr>
@@ -3902,53 +4655,77 @@
           <w:rFonts w:ascii="Times New Roman" w:hAnsi="Times New Roman" w:cs="Times New Roman"/>
           <w:color w:val="auto"/>
         </w:rPr>
-        <w:t xml:space="preserve">nando i </w:t>
-      </w:r>
-      <w:proofErr w:type="spellStart"/>
-      <w:r>
-        <w:rPr>
-          <w:rFonts w:ascii="Times New Roman" w:hAnsi="Times New Roman" w:cs="Times New Roman"/>
-          <w:color w:val="auto"/>
-        </w:rPr>
-        <w:t>topic</w:t>
-      </w:r>
-      <w:proofErr w:type="spellEnd"/>
-      <w:r>
-        <w:rPr>
-          <w:rFonts w:ascii="Times New Roman" w:hAnsi="Times New Roman" w:cs="Times New Roman"/>
-          <w:color w:val="auto"/>
-        </w:rPr>
-        <w:t xml:space="preserve"> con i </w:t>
-      </w:r>
-      <w:r>
-        <w:rPr>
-          <w:rFonts w:ascii="Times New Roman" w:hAnsi="Times New Roman" w:cs="Times New Roman"/>
-          <w:i/>
-          <w:color w:val="auto"/>
-        </w:rPr>
-        <w:t>rating</w:t>
-      </w:r>
-      <w:r>
-        <w:rPr>
-          <w:rFonts w:ascii="Times New Roman" w:hAnsi="Times New Roman" w:cs="Times New Roman"/>
-          <w:color w:val="auto"/>
-        </w:rPr>
-        <w:t xml:space="preserve"> è possi</w:t>
-      </w:r>
-      <w:r>
-        <w:rPr>
-          <w:rFonts w:ascii="Times New Roman" w:hAnsi="Times New Roman" w:cs="Times New Roman"/>
-          <w:i/>
-          <w:color w:val="auto"/>
-        </w:rPr>
-        <w:t>bi</w:t>
-      </w:r>
-      <w:r>
-        <w:rPr>
-          <w:rFonts w:ascii="Times New Roman" w:hAnsi="Times New Roman" w:cs="Times New Roman"/>
-          <w:color w:val="auto"/>
-        </w:rPr>
-        <w:t xml:space="preserve">le capire perché un locale perde stelle e dove intervenire. Le </w:t>
+        <w:t>le c</w:t>
+      </w:r>
+      <w:r>
+        <w:rPr>
+          <w:rFonts w:ascii="Times New Roman" w:hAnsi="Times New Roman" w:cs="Times New Roman"/>
+          <w:color w:val="auto"/>
+        </w:rPr>
+        <w:t>omprendere come mai un determinato</w:t>
+      </w:r>
+      <w:r>
+        <w:rPr>
+          <w:rFonts w:ascii="Times New Roman" w:hAnsi="Times New Roman" w:cs="Times New Roman"/>
+          <w:color w:val="auto"/>
+        </w:rPr>
+        <w:t xml:space="preserve"> locale</w:t>
+      </w:r>
+      <w:r>
+        <w:rPr>
+          <w:rFonts w:ascii="Times New Roman" w:hAnsi="Times New Roman" w:cs="Times New Roman"/>
+          <w:color w:val="auto"/>
+        </w:rPr>
+        <w:t xml:space="preserve"> possa</w:t>
+      </w:r>
+      <w:r>
+        <w:rPr>
+          <w:rFonts w:ascii="Times New Roman" w:hAnsi="Times New Roman" w:cs="Times New Roman"/>
+          <w:color w:val="auto"/>
+        </w:rPr>
+        <w:t xml:space="preserve"> perde</w:t>
+      </w:r>
+      <w:r>
+        <w:rPr>
+          <w:rFonts w:ascii="Times New Roman" w:hAnsi="Times New Roman" w:cs="Times New Roman"/>
+          <w:color w:val="auto"/>
+        </w:rPr>
+        <w:t>re</w:t>
+      </w:r>
+      <w:r>
+        <w:rPr>
+          <w:rFonts w:ascii="Times New Roman" w:hAnsi="Times New Roman" w:cs="Times New Roman"/>
+          <w:color w:val="auto"/>
+        </w:rPr>
+        <w:t xml:space="preserve"> stelle e dove </w:t>
+      </w:r>
+      <w:r>
+        <w:rPr>
+          <w:rFonts w:ascii="Times New Roman" w:hAnsi="Times New Roman" w:cs="Times New Roman"/>
+          <w:color w:val="auto"/>
+        </w:rPr>
+        <w:t xml:space="preserve">sia necessario </w:t>
+      </w:r>
+      <w:r>
+        <w:rPr>
+          <w:rFonts w:ascii="Times New Roman" w:hAnsi="Times New Roman" w:cs="Times New Roman"/>
+          <w:color w:val="auto"/>
+        </w:rPr>
+        <w:t>intervenire</w:t>
+      </w:r>
+      <w:r>
+        <w:rPr>
+          <w:rFonts w:ascii="Times New Roman" w:hAnsi="Times New Roman" w:cs="Times New Roman"/>
+          <w:color w:val="auto"/>
+        </w:rPr>
+        <w:t xml:space="preserve"> per implementare il servizio</w:t>
+      </w:r>
+      <w:r>
+        <w:rPr>
+          <w:rFonts w:ascii="Times New Roman" w:hAnsi="Times New Roman" w:cs="Times New Roman"/>
+          <w:color w:val="auto"/>
+        </w:rPr>
+        <w:t xml:space="preserve">. Le </w:t>
       </w:r>
       <w:r>
         <w:rPr>
@@ -3963,7 +4740,70 @@
           <w:rFonts w:ascii="Times New Roman" w:hAnsi="Times New Roman" w:cs="Times New Roman"/>
           <w:color w:val="auto"/>
         </w:rPr>
-        <w:t xml:space="preserve"> mostrano un lessico positivo legato a cortesia e cibo e uno negativo legato ad attese e servizio freddo.</w:t>
+        <w:t xml:space="preserve"> </w:t>
+      </w:r>
+      <w:r>
+        <w:rPr>
+          <w:rFonts w:ascii="Times New Roman" w:hAnsi="Times New Roman" w:cs="Times New Roman"/>
+          <w:color w:val="auto"/>
+        </w:rPr>
+        <w:t>evidenziano una stretta correlazione tra recensione positiva e atteggiamenti</w:t>
+      </w:r>
+      <w:r>
+        <w:rPr>
+          <w:rFonts w:ascii="Times New Roman" w:hAnsi="Times New Roman" w:cs="Times New Roman"/>
+          <w:color w:val="auto"/>
+        </w:rPr>
+        <w:t xml:space="preserve"> cortesi</w:t>
+      </w:r>
+      <w:r>
+        <w:rPr>
+          <w:rFonts w:ascii="Times New Roman" w:hAnsi="Times New Roman" w:cs="Times New Roman"/>
+          <w:color w:val="auto"/>
+        </w:rPr>
+        <w:t xml:space="preserve">, nonché qualità del </w:t>
+      </w:r>
+      <w:r>
+        <w:rPr>
+          <w:rFonts w:ascii="Times New Roman" w:hAnsi="Times New Roman" w:cs="Times New Roman"/>
+          <w:color w:val="auto"/>
+        </w:rPr>
+        <w:t>cibo</w:t>
+      </w:r>
+      <w:r>
+        <w:rPr>
+          <w:rFonts w:ascii="Times New Roman" w:hAnsi="Times New Roman" w:cs="Times New Roman"/>
+          <w:color w:val="auto"/>
+        </w:rPr>
+        <w:t>,</w:t>
+      </w:r>
+      <w:r>
+        <w:rPr>
+          <w:rFonts w:ascii="Times New Roman" w:hAnsi="Times New Roman" w:cs="Times New Roman"/>
+          <w:color w:val="auto"/>
+        </w:rPr>
+        <w:t xml:space="preserve"> e</w:t>
+      </w:r>
+      <w:r>
+        <w:rPr>
+          <w:rFonts w:ascii="Times New Roman" w:hAnsi="Times New Roman" w:cs="Times New Roman"/>
+          <w:color w:val="auto"/>
+        </w:rPr>
+        <w:t>, al contempo, una relazione altrettanto solida tra termini negativi</w:t>
+      </w:r>
+      <w:r>
+        <w:rPr>
+          <w:rFonts w:ascii="Times New Roman" w:hAnsi="Times New Roman" w:cs="Times New Roman"/>
+          <w:color w:val="auto"/>
+        </w:rPr>
+        <w:t xml:space="preserve"> </w:t>
+      </w:r>
+      <w:r>
+        <w:rPr>
+          <w:rFonts w:ascii="Times New Roman" w:hAnsi="Times New Roman" w:cs="Times New Roman"/>
+          <w:color w:val="auto"/>
+        </w:rPr>
+        <w:t xml:space="preserve">e un servizio inefficiente e distaccato. </w:t>
       </w:r>
     </w:p>
     <w:p>
@@ -4224,7 +5064,35 @@
           <w:rFonts w:ascii="Times New Roman" w:hAnsi="Times New Roman" w:cs="Times New Roman"/>
           <w:color w:val="auto"/>
         </w:rPr>
-        <w:t>Il cuore del progetto è un sistema ibrido basato su tre approcci distinti, confrontati sia in termini di accuratezza sia di latenza.</w:t>
+        <w:t xml:space="preserve">Il cuore del progetto </w:t>
+      </w:r>
+      <w:r>
+        <w:rPr>
+          <w:rFonts w:ascii="Times New Roman" w:hAnsi="Times New Roman" w:cs="Times New Roman"/>
+          <w:color w:val="auto"/>
+        </w:rPr>
+        <w:t>si concretizza in</w:t>
+      </w:r>
+      <w:r>
+        <w:rPr>
+          <w:rFonts w:ascii="Times New Roman" w:hAnsi="Times New Roman" w:cs="Times New Roman"/>
+          <w:color w:val="auto"/>
+        </w:rPr>
+        <w:t xml:space="preserve"> un sistema ibrido </w:t>
+      </w:r>
+      <w:r>
+        <w:rPr>
+          <w:rFonts w:ascii="Times New Roman" w:hAnsi="Times New Roman" w:cs="Times New Roman"/>
+          <w:color w:val="auto"/>
+        </w:rPr>
+        <w:t>fondato</w:t>
+      </w:r>
+      <w:r>
+        <w:rPr>
+          <w:rFonts w:ascii="Times New Roman" w:hAnsi="Times New Roman" w:cs="Times New Roman"/>
+          <w:color w:val="auto"/>
+        </w:rPr>
+        <w:t xml:space="preserve"> su tre approcci distinti, confrontati sia in termini di accuratezza sia di latenza.</w:t>
       </w:r>
     </w:p>
     <w:p>
@@ -4266,7 +5134,77 @@
           <w:rFonts w:ascii="Times New Roman" w:hAnsi="Times New Roman" w:cs="Times New Roman"/>
           <w:color w:val="auto"/>
         </w:rPr>
-        <w:t xml:space="preserve">Categorie e attributi del ristorante (ad esempio parcheggio, cucina, atmosfera) sono tradotti in uno spazio vettoriale. La vicinanza tra due locali A e B si misura con la </w:t>
+        <w:t>Categorie e attributi del ristorante (</w:t>
+      </w:r>
+      <w:r>
+        <w:rPr>
+          <w:rFonts w:ascii="Times New Roman" w:hAnsi="Times New Roman" w:cs="Times New Roman"/>
+          <w:color w:val="auto"/>
+        </w:rPr>
+        <w:t>tra i quali si possono annoverare il</w:t>
+      </w:r>
+      <w:r>
+        <w:rPr>
+          <w:rFonts w:ascii="Times New Roman" w:hAnsi="Times New Roman" w:cs="Times New Roman"/>
+          <w:color w:val="auto"/>
+        </w:rPr>
+        <w:t xml:space="preserve"> parcheggio, </w:t>
+      </w:r>
+      <w:r>
+        <w:rPr>
+          <w:rFonts w:ascii="Times New Roman" w:hAnsi="Times New Roman" w:cs="Times New Roman"/>
+          <w:color w:val="auto"/>
+        </w:rPr>
+        <w:t xml:space="preserve">la </w:t>
+      </w:r>
+      <w:r>
+        <w:rPr>
+          <w:rFonts w:ascii="Times New Roman" w:hAnsi="Times New Roman" w:cs="Times New Roman"/>
+          <w:color w:val="auto"/>
+        </w:rPr>
+        <w:t>cucina</w:t>
+      </w:r>
+      <w:r>
+        <w:rPr>
+          <w:rFonts w:ascii="Times New Roman" w:hAnsi="Times New Roman" w:cs="Times New Roman"/>
+          <w:color w:val="auto"/>
+        </w:rPr>
+        <w:t xml:space="preserve"> e l’</w:t>
+      </w:r>
+      <w:r>
+        <w:rPr>
+          <w:rFonts w:ascii="Times New Roman" w:hAnsi="Times New Roman" w:cs="Times New Roman"/>
+          <w:color w:val="auto"/>
+        </w:rPr>
+        <w:t xml:space="preserve">atmosfera) </w:t>
+      </w:r>
+      <w:r>
+        <w:rPr>
+          <w:rFonts w:ascii="Times New Roman" w:hAnsi="Times New Roman" w:cs="Times New Roman"/>
+          <w:color w:val="auto"/>
+        </w:rPr>
+        <w:t>vengon</w:t>
+      </w:r>
+      <w:r>
+        <w:rPr>
+          <w:rFonts w:ascii="Times New Roman" w:hAnsi="Times New Roman" w:cs="Times New Roman"/>
+          <w:color w:val="auto"/>
+        </w:rPr>
+        <w:t xml:space="preserve">o tradotti in uno spazio vettoriale. </w:t>
+      </w:r>
+      <w:r>
+        <w:rPr>
+          <w:rFonts w:ascii="Times New Roman" w:hAnsi="Times New Roman" w:cs="Times New Roman"/>
+          <w:color w:val="auto"/>
+        </w:rPr>
+        <w:t xml:space="preserve"> Inoltre, l</w:t>
+      </w:r>
+      <w:r>
+        <w:rPr>
+          <w:rFonts w:ascii="Times New Roman" w:hAnsi="Times New Roman" w:cs="Times New Roman"/>
+          <w:color w:val="auto"/>
+        </w:rPr>
+        <w:t xml:space="preserve">a vicinanza tra due locali A e B si misura con la </w:t>
       </w:r>
       <w:r>
         <w:rPr>
@@ -4356,7 +5294,21 @@
           <w:rFonts w:ascii="Times New Roman" w:hAnsi="Times New Roman" w:cs="Times New Roman"/>
           <w:color w:val="auto"/>
         </w:rPr>
-        <w:t>Il numeratore r</w:t>
+        <w:t>I</w:t>
+      </w:r>
+      <w:r>
+        <w:rPr>
+          <w:rFonts w:ascii="Times New Roman" w:hAnsi="Times New Roman" w:cs="Times New Roman"/>
+          <w:color w:val="auto"/>
+        </w:rPr>
+        <w:t xml:space="preserve">n tal caso, il </w:t>
+      </w:r>
+      <w:r>
+        <w:rPr>
+          <w:rFonts w:ascii="Times New Roman" w:hAnsi="Times New Roman" w:cs="Times New Roman"/>
+          <w:color w:val="auto"/>
+        </w:rPr>
+        <w:t>numeratore r</w:t>
       </w:r>
       <w:r>
         <w:rPr>
@@ -4411,7 +5363,21 @@
           <w:rFonts w:ascii="Times New Roman" w:hAnsi="Times New Roman" w:cs="Times New Roman"/>
           <w:color w:val="auto"/>
         </w:rPr>
-        <w:t xml:space="preserve"> perché non richiede lo storico dell'utente e garantisce latenze dell'ordine dei millisecondi.</w:t>
+        <w:t xml:space="preserve"> </w:t>
+      </w:r>
+      <w:r>
+        <w:rPr>
+          <w:rFonts w:ascii="Times New Roman" w:hAnsi="Times New Roman" w:cs="Times New Roman"/>
+          <w:color w:val="auto"/>
+        </w:rPr>
+        <w:t>dato che</w:t>
+      </w:r>
+      <w:r>
+        <w:rPr>
+          <w:rFonts w:ascii="Times New Roman" w:hAnsi="Times New Roman" w:cs="Times New Roman"/>
+          <w:color w:val="auto"/>
+        </w:rPr>
+        <w:t xml:space="preserve"> non richiede lo storico dell'utente e garantisce latenze dell'ordine dei millisecondi.</w:t>
       </w:r>
     </w:p>
     <w:p>
@@ -4500,7 +5466,65 @@
           <w:rFonts w:ascii="Times New Roman" w:hAnsi="Times New Roman" w:cs="Times New Roman"/>
           <w:color w:val="auto"/>
         </w:rPr>
-        <w:t xml:space="preserve"> sparsa, con utenti sulle righe e ristoranti sulle colonne, viene scomposta in vettori singolari. Ciò riduce la dimensionalità e porta alla luce relazioni latenti, cioè </w:t>
+        <w:t xml:space="preserve"> sparsa, </w:t>
+      </w:r>
+      <w:r>
+        <w:rPr>
+          <w:rFonts w:ascii="Times New Roman" w:hAnsi="Times New Roman" w:cs="Times New Roman"/>
+          <w:color w:val="auto"/>
+        </w:rPr>
+        <w:t xml:space="preserve">che riporta </w:t>
+      </w:r>
+      <w:proofErr w:type="gramStart"/>
+      <w:r>
+        <w:rPr>
+          <w:rFonts w:ascii="Times New Roman" w:hAnsi="Times New Roman" w:cs="Times New Roman"/>
+          <w:color w:val="auto"/>
+        </w:rPr>
+        <w:t xml:space="preserve">gli </w:t>
+      </w:r>
+      <w:r>
+        <w:rPr>
+          <w:rFonts w:ascii="Times New Roman" w:hAnsi="Times New Roman" w:cs="Times New Roman"/>
+          <w:color w:val="auto"/>
+        </w:rPr>
+        <w:t xml:space="preserve"> utenti</w:t>
+      </w:r>
+      <w:proofErr w:type="gramEnd"/>
+      <w:r>
+        <w:rPr>
+          <w:rFonts w:ascii="Times New Roman" w:hAnsi="Times New Roman" w:cs="Times New Roman"/>
+          <w:color w:val="auto"/>
+        </w:rPr>
+        <w:t xml:space="preserve"> sulle righe e</w:t>
+      </w:r>
+      <w:r>
+        <w:rPr>
+          <w:rFonts w:ascii="Times New Roman" w:hAnsi="Times New Roman" w:cs="Times New Roman"/>
+          <w:color w:val="auto"/>
+        </w:rPr>
+        <w:t xml:space="preserve"> i</w:t>
+      </w:r>
+      <w:r>
+        <w:rPr>
+          <w:rFonts w:ascii="Times New Roman" w:hAnsi="Times New Roman" w:cs="Times New Roman"/>
+          <w:color w:val="auto"/>
+        </w:rPr>
+        <w:t xml:space="preserve"> ristoranti sulle colonne, viene scomposta in vettori singolari. Ciò riduce la dimensionalità e porta alla luce relazioni latenti, </w:t>
+      </w:r>
+      <w:r>
+        <w:rPr>
+          <w:rFonts w:ascii="Times New Roman" w:hAnsi="Times New Roman" w:cs="Times New Roman"/>
+          <w:color w:val="auto"/>
+        </w:rPr>
+        <w:t>ovverosia</w:t>
+      </w:r>
+      <w:r>
+        <w:rPr>
+          <w:rFonts w:ascii="Times New Roman" w:hAnsi="Times New Roman" w:cs="Times New Roman"/>
+          <w:color w:val="auto"/>
+        </w:rPr>
+        <w:t xml:space="preserve"> </w:t>
       </w:r>
       <w:r>
         <w:rPr>
@@ -5879,7 +6903,21 @@
           <w:rFonts w:ascii="Times New Roman" w:hAnsi="Times New Roman" w:cs="Times New Roman"/>
           <w:color w:val="auto"/>
         </w:rPr>
-        <w:t xml:space="preserve"> sono caricati in memoria solo al primo avvio; le richieste successive usano la cache con latenze quasi nulle.</w:t>
+        <w:t xml:space="preserve"> </w:t>
+      </w:r>
+      <w:r>
+        <w:rPr>
+          <w:rFonts w:ascii="Times New Roman" w:hAnsi="Times New Roman" w:cs="Times New Roman"/>
+          <w:color w:val="auto"/>
+        </w:rPr>
+        <w:t>vengon</w:t>
+      </w:r>
+      <w:r>
+        <w:rPr>
+          <w:rFonts w:ascii="Times New Roman" w:hAnsi="Times New Roman" w:cs="Times New Roman"/>
+          <w:color w:val="auto"/>
+        </w:rPr>
+        <w:t>o caricati in memoria solo al primo avvio; le richieste successive usano la cache con latenze quasi nulle.</w:t>
       </w:r>
     </w:p>
     <w:p>
@@ -7126,6 +8164,7 @@
           <w:sz w:val="18"/>
           <w:szCs w:val="18"/>
         </w:rPr>
+        <w:lastRenderedPageBreak/>
         <w:t>Tabella 3 - Sintesi delle metriche principali</w:t>
       </w:r>
     </w:p>
@@ -7143,7 +8182,6 @@
           <w:rFonts w:ascii="Times New Roman" w:hAnsi="Times New Roman" w:cs="Times New Roman"/>
           <w:color w:val="auto"/>
         </w:rPr>
-        <w:lastRenderedPageBreak/>
         <w:t xml:space="preserve">Il </w:t>
       </w:r>
       <w:r>
@@ -7236,7 +8274,49 @@
           <w:rFonts w:ascii="Times New Roman" w:hAnsi="Times New Roman" w:cs="Times New Roman"/>
           <w:color w:val="auto"/>
         </w:rPr>
-        <w:t xml:space="preserve"> ma offre previsioni molto più precise. L'integrazione dei due </w:t>
+        <w:t xml:space="preserve"> </w:t>
+      </w:r>
+      <w:r>
+        <w:rPr>
+          <w:rFonts w:ascii="Times New Roman" w:hAnsi="Times New Roman" w:cs="Times New Roman"/>
+          <w:color w:val="auto"/>
+        </w:rPr>
+        <w:t xml:space="preserve">sebbene </w:t>
+      </w:r>
+      <w:r>
+        <w:rPr>
+          <w:rFonts w:ascii="Times New Roman" w:hAnsi="Times New Roman" w:cs="Times New Roman"/>
+          <w:color w:val="auto"/>
+        </w:rPr>
+        <w:t>offr</w:t>
+      </w:r>
+      <w:r>
+        <w:rPr>
+          <w:rFonts w:ascii="Times New Roman" w:hAnsi="Times New Roman" w:cs="Times New Roman"/>
+          <w:color w:val="auto"/>
+        </w:rPr>
+        <w:t>a</w:t>
+      </w:r>
+      <w:r>
+        <w:rPr>
+          <w:rFonts w:ascii="Times New Roman" w:hAnsi="Times New Roman" w:cs="Times New Roman"/>
+          <w:color w:val="auto"/>
+        </w:rPr>
+        <w:t xml:space="preserve"> previsioni </w:t>
+      </w:r>
+      <w:r>
+        <w:rPr>
+          <w:rFonts w:ascii="Times New Roman" w:hAnsi="Times New Roman" w:cs="Times New Roman"/>
+          <w:color w:val="auto"/>
+        </w:rPr>
+        <w:t>decisamente</w:t>
+      </w:r>
+      <w:r>
+        <w:rPr>
+          <w:rFonts w:ascii="Times New Roman" w:hAnsi="Times New Roman" w:cs="Times New Roman"/>
+          <w:color w:val="auto"/>
+        </w:rPr>
+        <w:t xml:space="preserve"> più precise. L'integrazione dei due </w:t>
       </w:r>
       <w:r>
         <w:rPr>
@@ -7251,7 +8331,21 @@
           <w:rFonts w:ascii="Times New Roman" w:hAnsi="Times New Roman" w:cs="Times New Roman"/>
           <w:color w:val="auto"/>
         </w:rPr>
-        <w:t xml:space="preserve">rocci nella stessa </w:t>
+        <w:t xml:space="preserve">rocci nella </w:t>
+      </w:r>
+      <w:r>
+        <w:rPr>
+          <w:rFonts w:ascii="Times New Roman" w:hAnsi="Times New Roman" w:cs="Times New Roman"/>
+          <w:color w:val="auto"/>
+        </w:rPr>
+        <w:t>medesim</w:t>
+      </w:r>
+      <w:r>
+        <w:rPr>
+          <w:rFonts w:ascii="Times New Roman" w:hAnsi="Times New Roman" w:cs="Times New Roman"/>
+          <w:color w:val="auto"/>
+        </w:rPr>
+        <w:t xml:space="preserve">a </w:t>
       </w:r>
       <w:r>
         <w:rPr>
@@ -7551,7 +8645,21 @@
           <w:rFonts w:ascii="Times New Roman" w:hAnsi="Times New Roman" w:cs="Times New Roman"/>
           <w:color w:val="auto"/>
         </w:rPr>
-        <w:t xml:space="preserve">Il progetto ha permesso di </w:t>
+        <w:t>Il progetto</w:t>
+      </w:r>
+      <w:r>
+        <w:rPr>
+          <w:rFonts w:ascii="Times New Roman" w:hAnsi="Times New Roman" w:cs="Times New Roman"/>
+          <w:color w:val="auto"/>
+        </w:rPr>
+        <w:t xml:space="preserve"> ha </w:t>
+      </w:r>
+      <w:r>
+        <w:rPr>
+          <w:rFonts w:ascii="Times New Roman" w:hAnsi="Times New Roman" w:cs="Times New Roman"/>
+          <w:color w:val="auto"/>
+        </w:rPr>
+        <w:t xml:space="preserve">permesso di </w:t>
       </w:r>
       <w:r>
         <w:rPr>
@@ -7631,7 +8739,21 @@
           <w:rFonts w:ascii="Times New Roman" w:hAnsi="Times New Roman" w:cs="Times New Roman"/>
           <w:color w:val="auto"/>
         </w:rPr>
-        <w:t xml:space="preserve">. L'integrazione di </w:t>
+        <w:t xml:space="preserve">. </w:t>
+      </w:r>
+      <w:r>
+        <w:rPr>
+          <w:rFonts w:ascii="Times New Roman" w:hAnsi="Times New Roman" w:cs="Times New Roman"/>
+          <w:color w:val="auto"/>
+        </w:rPr>
+        <w:t>Dunque, l</w:t>
+      </w:r>
+      <w:r>
+        <w:rPr>
+          <w:rFonts w:ascii="Times New Roman" w:hAnsi="Times New Roman" w:cs="Times New Roman"/>
+          <w:color w:val="auto"/>
+        </w:rPr>
+        <w:t xml:space="preserve">'integrazione di </w:t>
       </w:r>
       <w:r>
         <w:rPr>
@@ -7671,7 +8793,21 @@
           <w:rFonts w:ascii="Times New Roman" w:hAnsi="Times New Roman" w:cs="Times New Roman"/>
           <w:color w:val="auto"/>
         </w:rPr>
-        <w:t xml:space="preserve"> all'interno di un'interfaccia interattiva offre un prodotto utile sia ai clienti in cerca di locali sia ai manager interessati alla </w:t>
+        <w:t xml:space="preserve"> all'interno di un'interfaccia interattiva</w:t>
+      </w:r>
+      <w:r>
+        <w:rPr>
+          <w:rFonts w:ascii="Times New Roman" w:hAnsi="Times New Roman" w:cs="Times New Roman"/>
+          <w:color w:val="auto"/>
+        </w:rPr>
+        <w:t xml:space="preserve"> garantisce</w:t>
+      </w:r>
+      <w:r>
+        <w:rPr>
+          <w:rFonts w:ascii="Times New Roman" w:hAnsi="Times New Roman" w:cs="Times New Roman"/>
+          <w:color w:val="auto"/>
+        </w:rPr>
+        <w:t xml:space="preserve"> un prodotto utile sia ai clienti in cerca di locali sia ai manager interessati alla </w:t>
       </w:r>
       <w:r>
         <w:rPr>

</xml_diff>